<commit_message>
working shiny app for better QC and core trimming workflow
</commit_message>
<xml_diff>
--- a/Docs/Figures_RunTimingManuscript.docx
+++ b/Docs/Figures_RunTimingManuscript.docx
@@ -136,6 +136,9 @@
     </w:p>
     <w:p>
       <w:r>
+        <w:rPr>
+          <w:noProof/>
+        </w:rPr>
         <w:drawing>
           <wp:inline distT="0" distB="0" distL="0" distR="0" wp14:anchorId="167A01D8" wp14:editId="39D9C1AD">
             <wp:extent cx="5943600" cy="2666365"/>
@@ -197,11 +200,14 @@
     </w:p>
     <w:p>
       <w:r>
+        <w:rPr>
+          <w:noProof/>
+        </w:rPr>
         <w:drawing>
-          <wp:inline distT="0" distB="0" distL="0" distR="0" wp14:anchorId="76B2005B" wp14:editId="7F8AC331">
-            <wp:extent cx="1854200" cy="7239000"/>
+          <wp:inline distT="0" distB="0" distL="0" distR="0" wp14:anchorId="6D1C1172" wp14:editId="1D14959E">
+            <wp:extent cx="5943600" cy="6934200"/>
             <wp:effectExtent l="0" t="0" r="0" b="0"/>
-            <wp:docPr id="169380756" name="Picture 1" descr="A graph of different colored lines&#10;&#10;AI-generated content may be incorrect."/>
+            <wp:docPr id="530067976" name="Picture 1" descr="A graph of different colored lines&#10;&#10;AI-generated content may be incorrect."/>
             <wp:cNvGraphicFramePr>
               <a:graphicFrameLocks xmlns:a="http://schemas.openxmlformats.org/drawingml/2006/main" noChangeAspect="1"/>
             </wp:cNvGraphicFramePr>
@@ -209,11 +215,17 @@
               <a:graphicData uri="http://schemas.openxmlformats.org/drawingml/2006/picture">
                 <pic:pic xmlns:pic="http://schemas.openxmlformats.org/drawingml/2006/picture">
                   <pic:nvPicPr>
-                    <pic:cNvPr id="169380756" name="Picture 1" descr="A graph of different colored lines&#10;&#10;AI-generated content may be incorrect."/>
+                    <pic:cNvPr id="530067976" name="Picture 1" descr="A graph of different colored lines&#10;&#10;AI-generated content may be incorrect."/>
                     <pic:cNvPicPr/>
                   </pic:nvPicPr>
                   <pic:blipFill>
-                    <a:blip r:embed="rId7"/>
+                    <a:blip r:embed="rId7" cstate="print">
+                      <a:extLst>
+                        <a:ext uri="{28A0092B-C50C-407E-A947-70E740481C1C}">
+                          <a14:useLocalDpi xmlns:a14="http://schemas.microsoft.com/office/drawing/2010/main" val="0"/>
+                        </a:ext>
+                      </a:extLst>
+                    </a:blip>
                     <a:stretch>
                       <a:fillRect/>
                     </a:stretch>
@@ -221,7 +233,7 @@
                   <pic:spPr>
                     <a:xfrm>
                       <a:off x="0" y="0"/>
-                      <a:ext cx="1854200" cy="7239000"/>
+                      <a:ext cx="5943600" cy="6934200"/>
                     </a:xfrm>
                     <a:prstGeom prst="rect">
                       <a:avLst/>
@@ -234,6 +246,7 @@
         </w:drawing>
       </w:r>
     </w:p>
+    <w:p/>
     <w:p/>
     <w:p/>
     <w:p>

</xml_diff>

<commit_message>
over-ride the document with Daniel's edits
</commit_message>
<xml_diff>
--- a/Docs/Figures_RunTimingManuscript.docx
+++ b/Docs/Figures_RunTimingManuscript.docx
@@ -195,10 +195,26 @@
     <w:p>
       <w:r>
         <w:lastRenderedPageBreak/>
-        <w:t xml:space="preserve">Figure 4: Cumulative Distribution Plots </w:t>
+        <w:t xml:space="preserve">Figure 4: </w:t>
+      </w:r>
+      <w:commentRangeStart w:id="0"/>
+      <w:r>
+        <w:t>Cumulative</w:t>
+      </w:r>
+      <w:commentRangeEnd w:id="0"/>
+      <w:r>
+        <w:rPr>
+          <w:rStyle w:val="CommentReference"/>
+        </w:rPr>
+        <w:commentReference w:id="0"/>
+      </w:r>
+      <w:r>
+        <w:t xml:space="preserve"> Distribution Plots </w:t>
       </w:r>
     </w:p>
     <w:p>
+      <w:commentRangeStart w:id="1"/>
+      <w:commentRangeStart w:id="2"/>
       <w:r>
         <w:rPr>
           <w:noProof/>
@@ -219,7 +235,7 @@
                     <pic:cNvPicPr/>
                   </pic:nvPicPr>
                   <pic:blipFill>
-                    <a:blip r:embed="rId7" cstate="print">
+                    <a:blip r:embed="rId11" cstate="print">
                       <a:extLst>
                         <a:ext uri="{28A0092B-C50C-407E-A947-70E740481C1C}">
                           <a14:useLocalDpi xmlns:a14="http://schemas.microsoft.com/office/drawing/2010/main" val="0"/>
@@ -245,6 +261,20 @@
           </wp:inline>
         </w:drawing>
       </w:r>
+      <w:commentRangeEnd w:id="1"/>
+      <w:r>
+        <w:rPr>
+          <w:rStyle w:val="CommentReference"/>
+        </w:rPr>
+        <w:commentReference w:id="1"/>
+      </w:r>
+      <w:commentRangeEnd w:id="2"/>
+      <w:r>
+        <w:rPr>
+          <w:rStyle w:val="CommentReference"/>
+        </w:rPr>
+        <w:commentReference w:id="2"/>
+      </w:r>
     </w:p>
     <w:p/>
     <w:p/>
@@ -252,7 +282,21 @@
     <w:p>
       <w:r>
         <w:lastRenderedPageBreak/>
-        <w:t xml:space="preserve">Figure 5: Front end closure protection by stock </w:t>
+        <w:t xml:space="preserve">Figure 5: Front </w:t>
+      </w:r>
+      <w:commentRangeStart w:id="3"/>
+      <w:r>
+        <w:t>end</w:t>
+      </w:r>
+      <w:commentRangeEnd w:id="3"/>
+      <w:r>
+        <w:rPr>
+          <w:rStyle w:val="CommentReference"/>
+        </w:rPr>
+        <w:commentReference w:id="3"/>
+      </w:r>
+      <w:r>
+        <w:t xml:space="preserve"> closure protection by stock </w:t>
       </w:r>
     </w:p>
     <w:p>
@@ -276,7 +320,7 @@
                     <pic:cNvPicPr/>
                   </pic:nvPicPr>
                   <pic:blipFill>
-                    <a:blip r:embed="rId8" cstate="print">
+                    <a:blip r:embed="rId12" cstate="print">
                       <a:extLst>
                         <a:ext uri="{28A0092B-C50C-407E-A947-70E740481C1C}">
                           <a14:useLocalDpi xmlns:a14="http://schemas.microsoft.com/office/drawing/2010/main" val="0"/>
@@ -311,6 +355,110 @@
     </w:sectPr>
   </w:body>
 </w:document>
+</file>
+
+<file path=word/comments.xml><?xml version="1.0" encoding="utf-8"?>
+<w:comments xmlns:wpc="http://schemas.microsoft.com/office/word/2010/wordprocessingCanvas" xmlns:cx="http://schemas.microsoft.com/office/drawing/2014/chartex" xmlns:cx1="http://schemas.microsoft.com/office/drawing/2015/9/8/chartex" xmlns:cx2="http://schemas.microsoft.com/office/drawing/2015/10/21/chartex" xmlns:cx3="http://schemas.microsoft.com/office/drawing/2016/5/9/chartex" xmlns:cx4="http://schemas.microsoft.com/office/drawing/2016/5/10/chartex" xmlns:cx5="http://schemas.microsoft.com/office/drawing/2016/5/11/chartex" xmlns:cx6="http://schemas.microsoft.com/office/drawing/2016/5/12/chartex" xmlns:cx7="http://schemas.microsoft.com/office/drawing/2016/5/13/chartex" xmlns:cx8="http://schemas.microsoft.com/office/drawing/2016/5/14/chartex" xmlns:mc="http://schemas.openxmlformats.org/markup-compatibility/2006" xmlns:aink="http://schemas.microsoft.com/office/drawing/2016/ink" xmlns:am3d="http://schemas.microsoft.com/office/drawing/2017/model3d" xmlns:o="urn:schemas-microsoft-com:office:office" xmlns:oel="http://schemas.microsoft.com/office/2019/extlst" xmlns:r="http://schemas.openxmlformats.org/officeDocument/2006/relationships" xmlns:m="http://schemas.openxmlformats.org/officeDocument/2006/math" xmlns:v="urn:schemas-microsoft-com:vml" xmlns:wp14="http://schemas.microsoft.com/office/word/2010/wordprocessingDrawing" xmlns:wp="http://schemas.openxmlformats.org/drawingml/2006/wordprocessingDrawing" xmlns:w10="urn:schemas-microsoft-com:office:word" xmlns:w="http://schemas.openxmlformats.org/wordprocessingml/2006/main" xmlns:w14="http://schemas.microsoft.com/office/word/2010/wordml" xmlns:w15="http://schemas.microsoft.com/office/word/2012/wordml" xmlns:w16cex="http://schemas.microsoft.com/office/word/2018/wordml/cex" xmlns:w16cid="http://schemas.microsoft.com/office/word/2016/wordml/cid" xmlns:w16="http://schemas.microsoft.com/office/word/2018/wordml" xmlns:w16du="http://schemas.microsoft.com/office/word/2023/wordml/word16du" xmlns:w16sdtdh="http://schemas.microsoft.com/office/word/2020/wordml/sdtdatahash" xmlns:w16sdtfl="http://schemas.microsoft.com/office/word/2024/wordml/sdtformatlock" xmlns:w16se="http://schemas.microsoft.com/office/word/2015/wordml/symex" xmlns:wpg="http://schemas.microsoft.com/office/word/2010/wordprocessingGroup" xmlns:wpi="http://schemas.microsoft.com/office/word/2010/wordprocessingInk" xmlns:wne="http://schemas.microsoft.com/office/word/2006/wordml" xmlns:wps="http://schemas.microsoft.com/office/word/2010/wordprocessingShape" mc:Ignorable="w14 w15 w16se w16cid w16 w16cex w16sdtdh w16sdtfl w16du wp14">
+  <w:comment w:id="0" w:author="Daniel Schindler" w:date="2025-07-17T14:10:00Z" w:initials="DS">
+    <w:p>
+      <w:pPr>
+        <w:pStyle w:val="CommentText"/>
+      </w:pPr>
+      <w:r>
+        <w:rPr>
+          <w:rStyle w:val="CommentReference"/>
+        </w:rPr>
+        <w:annotationRef/>
+      </w:r>
+      <w:r>
+        <w:t>Discussion point is that the effectiveness of the front end closure depends both on run timing but also run compression. Eg 2017 was late but extended. 2019 was early but compressed.</w:t>
+      </w:r>
+    </w:p>
+  </w:comment>
+  <w:comment w:id="1" w:author="Daniel Schindler" w:date="2025-07-17T14:05:00Z" w:initials="DS">
+    <w:p>
+      <w:pPr>
+        <w:pStyle w:val="CommentText"/>
+      </w:pPr>
+      <w:r>
+        <w:rPr>
+          <w:rStyle w:val="CommentReference"/>
+        </w:rPr>
+        <w:annotationRef/>
+      </w:r>
+      <w:r>
+        <w:t>This is pretty fkn awesome! I would drop the data points from the lines.</w:t>
+      </w:r>
+    </w:p>
+  </w:comment>
+  <w:comment w:id="2" w:author="Daniel Schindler" w:date="2025-07-17T14:09:00Z" w:initials="DS">
+    <w:p>
+      <w:pPr>
+        <w:pStyle w:val="CommentText"/>
+      </w:pPr>
+      <w:r>
+        <w:rPr>
+          <w:rStyle w:val="CommentReference"/>
+        </w:rPr>
+        <w:annotationRef/>
+      </w:r>
+      <w:r>
+        <w:t xml:space="preserve">Make axes darker. Add more tick marks on time. Eg,. Every 3 days. </w:t>
+      </w:r>
+    </w:p>
+  </w:comment>
+  <w:comment w:id="3" w:author="Daniel Schindler" w:date="2025-07-17T14:19:00Z" w:initials="DS">
+    <w:p>
+      <w:pPr>
+        <w:pStyle w:val="CommentText"/>
+      </w:pPr>
+      <w:r>
+        <w:rPr>
+          <w:rStyle w:val="CommentReference"/>
+        </w:rPr>
+        <w:annotationRef/>
+      </w:r>
+      <w:r>
+        <w:t>Is it worth coloring these to correspond to previous figure?</w:t>
+      </w:r>
+    </w:p>
+  </w:comment>
+</w:comments>
+</file>
+
+<file path=word/commentsExtended.xml><?xml version="1.0" encoding="utf-8"?>
+<w15:commentsEx xmlns:wpc="http://schemas.microsoft.com/office/word/2010/wordprocessingCanvas" xmlns:cx="http://schemas.microsoft.com/office/drawing/2014/chartex" xmlns:cx1="http://schemas.microsoft.com/office/drawing/2015/9/8/chartex" xmlns:cx2="http://schemas.microsoft.com/office/drawing/2015/10/21/chartex" xmlns:cx3="http://schemas.microsoft.com/office/drawing/2016/5/9/chartex" xmlns:cx4="http://schemas.microsoft.com/office/drawing/2016/5/10/chartex" xmlns:cx5="http://schemas.microsoft.com/office/drawing/2016/5/11/chartex" xmlns:cx6="http://schemas.microsoft.com/office/drawing/2016/5/12/chartex" xmlns:cx7="http://schemas.microsoft.com/office/drawing/2016/5/13/chartex" xmlns:cx8="http://schemas.microsoft.com/office/drawing/2016/5/14/chartex" xmlns:mc="http://schemas.openxmlformats.org/markup-compatibility/2006" xmlns:aink="http://schemas.microsoft.com/office/drawing/2016/ink" xmlns:am3d="http://schemas.microsoft.com/office/drawing/2017/model3d" xmlns:o="urn:schemas-microsoft-com:office:office" xmlns:oel="http://schemas.microsoft.com/office/2019/extlst" xmlns:r="http://schemas.openxmlformats.org/officeDocument/2006/relationships" xmlns:m="http://schemas.openxmlformats.org/officeDocument/2006/math" xmlns:v="urn:schemas-microsoft-com:vml" xmlns:wp14="http://schemas.microsoft.com/office/word/2010/wordprocessingDrawing" xmlns:wp="http://schemas.openxmlformats.org/drawingml/2006/wordprocessingDrawing" xmlns:w10="urn:schemas-microsoft-com:office:word" xmlns:w="http://schemas.openxmlformats.org/wordprocessingml/2006/main" xmlns:w14="http://schemas.microsoft.com/office/word/2010/wordml" xmlns:w15="http://schemas.microsoft.com/office/word/2012/wordml" xmlns:w16cex="http://schemas.microsoft.com/office/word/2018/wordml/cex" xmlns:w16cid="http://schemas.microsoft.com/office/word/2016/wordml/cid" xmlns:w16="http://schemas.microsoft.com/office/word/2018/wordml" xmlns:w16du="http://schemas.microsoft.com/office/word/2023/wordml/word16du" xmlns:w16sdtdh="http://schemas.microsoft.com/office/word/2020/wordml/sdtdatahash" xmlns:w16sdtfl="http://schemas.microsoft.com/office/word/2024/wordml/sdtformatlock" xmlns:w16se="http://schemas.microsoft.com/office/word/2015/wordml/symex" xmlns:wpg="http://schemas.microsoft.com/office/word/2010/wordprocessingGroup" xmlns:wpi="http://schemas.microsoft.com/office/word/2010/wordprocessingInk" xmlns:wne="http://schemas.microsoft.com/office/word/2006/wordml" xmlns:wps="http://schemas.microsoft.com/office/word/2010/wordprocessingShape" mc:Ignorable="w14 w15 w16se w16cid w16 w16cex w16sdtdh w16sdtfl w16du wp14">
+  <w15:commentEx w15:paraId="5D59A14B" w15:done="0"/>
+  <w15:commentEx w15:paraId="2DF9F999" w15:done="0"/>
+  <w15:commentEx w15:paraId="263BDFE7" w15:paraIdParent="2DF9F999" w15:done="0"/>
+  <w15:commentEx w15:paraId="32B91192" w15:done="0"/>
+</w15:commentsEx>
+</file>
+
+<file path=word/commentsExtensible.xml><?xml version="1.0" encoding="utf-8"?>
+<w16cex:commentsExtensible xmlns:wpc="http://schemas.microsoft.com/office/word/2010/wordprocessingCanvas" xmlns:cx="http://schemas.microsoft.com/office/drawing/2014/chartex" xmlns:cx1="http://schemas.microsoft.com/office/drawing/2015/9/8/chartex" xmlns:cx2="http://schemas.microsoft.com/office/drawing/2015/10/21/chartex" xmlns:cx3="http://schemas.microsoft.com/office/drawing/2016/5/9/chartex" xmlns:cx4="http://schemas.microsoft.com/office/drawing/2016/5/10/chartex" xmlns:cx5="http://schemas.microsoft.com/office/drawing/2016/5/11/chartex" xmlns:cx6="http://schemas.microsoft.com/office/drawing/2016/5/12/chartex" xmlns:cx7="http://schemas.microsoft.com/office/drawing/2016/5/13/chartex" xmlns:cx8="http://schemas.microsoft.com/office/drawing/2016/5/14/chartex" xmlns:cr="http://schemas.microsoft.com/office/comments/2020/reactions" xmlns:mc="http://schemas.openxmlformats.org/markup-compatibility/2006" xmlns:aink="http://schemas.microsoft.com/office/drawing/2016/ink" xmlns:am3d="http://schemas.microsoft.com/office/drawing/2017/model3d" xmlns:o="urn:schemas-microsoft-com:office:office" xmlns:oel="http://schemas.microsoft.com/office/2019/extlst" xmlns:r="http://schemas.openxmlformats.org/officeDocument/2006/relationships" xmlns:m="http://schemas.openxmlformats.org/officeDocument/2006/math" xmlns:v="urn:schemas-microsoft-com:vml" xmlns:wp14="http://schemas.microsoft.com/office/word/2010/wordprocessingDrawing" xmlns:wp="http://schemas.openxmlformats.org/drawingml/2006/wordprocessingDrawing" xmlns:w10="urn:schemas-microsoft-com:office:word" xmlns:w="http://schemas.openxmlformats.org/wordprocessingml/2006/main" xmlns:w14="http://schemas.microsoft.com/office/word/2010/wordml" xmlns:w15="http://schemas.microsoft.com/office/word/2012/wordml" xmlns:w16cex="http://schemas.microsoft.com/office/word/2018/wordml/cex" xmlns:w16cid="http://schemas.microsoft.com/office/word/2016/wordml/cid" xmlns:w16="http://schemas.microsoft.com/office/word/2018/wordml" xmlns:w16du="http://schemas.microsoft.com/office/word/2023/wordml/word16du" xmlns:w16sdtdh="http://schemas.microsoft.com/office/word/2020/wordml/sdtdatahash" xmlns:w16sdtfl="http://schemas.microsoft.com/office/word/2024/wordml/sdtformatlock" xmlns:w16se="http://schemas.microsoft.com/office/word/2015/wordml/symex" xmlns:wpg="http://schemas.microsoft.com/office/word/2010/wordprocessingGroup" xmlns:wpi="http://schemas.microsoft.com/office/word/2010/wordprocessingInk" xmlns:wne="http://schemas.microsoft.com/office/word/2006/wordml" xmlns:wps="http://schemas.microsoft.com/office/word/2010/wordprocessingShape" mc:Ignorable="w14 w15 w16se w16cid w16 w16cex w16sdtdh w16sdtfl cr w16du wp14">
+  <w16cex:commentExtensible w16cex:durableId="33BDF08E" w16cex:dateUtc="2025-07-17T22:10:00Z"/>
+  <w16cex:commentExtensible w16cex:durableId="5124B6FE" w16cex:dateUtc="2025-07-17T22:05:00Z"/>
+  <w16cex:commentExtensible w16cex:durableId="697448F2" w16cex:dateUtc="2025-07-17T22:09:00Z"/>
+  <w16cex:commentExtensible w16cex:durableId="3F60878B" w16cex:dateUtc="2025-07-17T22:19:00Z"/>
+</w16cex:commentsExtensible>
+</file>
+
+<file path=word/commentsIds.xml><?xml version="1.0" encoding="utf-8"?>
+<w16cid:commentsIds xmlns:wpc="http://schemas.microsoft.com/office/word/2010/wordprocessingCanvas" xmlns:cx="http://schemas.microsoft.com/office/drawing/2014/chartex" xmlns:cx1="http://schemas.microsoft.com/office/drawing/2015/9/8/chartex" xmlns:cx2="http://schemas.microsoft.com/office/drawing/2015/10/21/chartex" xmlns:cx3="http://schemas.microsoft.com/office/drawing/2016/5/9/chartex" xmlns:cx4="http://schemas.microsoft.com/office/drawing/2016/5/10/chartex" xmlns:cx5="http://schemas.microsoft.com/office/drawing/2016/5/11/chartex" xmlns:cx6="http://schemas.microsoft.com/office/drawing/2016/5/12/chartex" xmlns:cx7="http://schemas.microsoft.com/office/drawing/2016/5/13/chartex" xmlns:cx8="http://schemas.microsoft.com/office/drawing/2016/5/14/chartex" xmlns:mc="http://schemas.openxmlformats.org/markup-compatibility/2006" xmlns:aink="http://schemas.microsoft.com/office/drawing/2016/ink" xmlns:am3d="http://schemas.microsoft.com/office/drawing/2017/model3d" xmlns:o="urn:schemas-microsoft-com:office:office" xmlns:oel="http://schemas.microsoft.com/office/2019/extlst" xmlns:r="http://schemas.openxmlformats.org/officeDocument/2006/relationships" xmlns:m="http://schemas.openxmlformats.org/officeDocument/2006/math" xmlns:v="urn:schemas-microsoft-com:vml" xmlns:wp14="http://schemas.microsoft.com/office/word/2010/wordprocessingDrawing" xmlns:wp="http://schemas.openxmlformats.org/drawingml/2006/wordprocessingDrawing" xmlns:w10="urn:schemas-microsoft-com:office:word" xmlns:w="http://schemas.openxmlformats.org/wordprocessingml/2006/main" xmlns:w14="http://schemas.microsoft.com/office/word/2010/wordml" xmlns:w15="http://schemas.microsoft.com/office/word/2012/wordml" xmlns:w16cex="http://schemas.microsoft.com/office/word/2018/wordml/cex" xmlns:w16cid="http://schemas.microsoft.com/office/word/2016/wordml/cid" xmlns:w16="http://schemas.microsoft.com/office/word/2018/wordml" xmlns:w16du="http://schemas.microsoft.com/office/word/2023/wordml/word16du" xmlns:w16sdtdh="http://schemas.microsoft.com/office/word/2020/wordml/sdtdatahash" xmlns:w16sdtfl="http://schemas.microsoft.com/office/word/2024/wordml/sdtformatlock" xmlns:w16se="http://schemas.microsoft.com/office/word/2015/wordml/symex" xmlns:wpg="http://schemas.microsoft.com/office/word/2010/wordprocessingGroup" xmlns:wpi="http://schemas.microsoft.com/office/word/2010/wordprocessingInk" xmlns:wne="http://schemas.microsoft.com/office/word/2006/wordml" xmlns:wps="http://schemas.microsoft.com/office/word/2010/wordprocessingShape" mc:Ignorable="w14 w15 w16se w16cid w16 w16cex w16sdtdh w16sdtfl w16du wp14">
+  <w16cid:commentId w16cid:paraId="5D59A14B" w16cid:durableId="33BDF08E"/>
+  <w16cid:commentId w16cid:paraId="2DF9F999" w16cid:durableId="5124B6FE"/>
+  <w16cid:commentId w16cid:paraId="263BDFE7" w16cid:durableId="697448F2"/>
+  <w16cid:commentId w16cid:paraId="32B91192" w16cid:durableId="3F60878B"/>
+</w16cid:commentsIds>
+</file>
+
+<file path=word/people.xml><?xml version="1.0" encoding="utf-8"?>
+<w15:people xmlns:wpc="http://schemas.microsoft.com/office/word/2010/wordprocessingCanvas" xmlns:cx="http://schemas.microsoft.com/office/drawing/2014/chartex" xmlns:cx1="http://schemas.microsoft.com/office/drawing/2015/9/8/chartex" xmlns:cx2="http://schemas.microsoft.com/office/drawing/2015/10/21/chartex" xmlns:cx3="http://schemas.microsoft.com/office/drawing/2016/5/9/chartex" xmlns:cx4="http://schemas.microsoft.com/office/drawing/2016/5/10/chartex" xmlns:cx5="http://schemas.microsoft.com/office/drawing/2016/5/11/chartex" xmlns:cx6="http://schemas.microsoft.com/office/drawing/2016/5/12/chartex" xmlns:cx7="http://schemas.microsoft.com/office/drawing/2016/5/13/chartex" xmlns:cx8="http://schemas.microsoft.com/office/drawing/2016/5/14/chartex" xmlns:mc="http://schemas.openxmlformats.org/markup-compatibility/2006" xmlns:aink="http://schemas.microsoft.com/office/drawing/2016/ink" xmlns:am3d="http://schemas.microsoft.com/office/drawing/2017/model3d" xmlns:o="urn:schemas-microsoft-com:office:office" xmlns:oel="http://schemas.microsoft.com/office/2019/extlst" xmlns:r="http://schemas.openxmlformats.org/officeDocument/2006/relationships" xmlns:m="http://schemas.openxmlformats.org/officeDocument/2006/math" xmlns:v="urn:schemas-microsoft-com:vml" xmlns:wp14="http://schemas.microsoft.com/office/word/2010/wordprocessingDrawing" xmlns:wp="http://schemas.openxmlformats.org/drawingml/2006/wordprocessingDrawing" xmlns:w10="urn:schemas-microsoft-com:office:word" xmlns:w="http://schemas.openxmlformats.org/wordprocessingml/2006/main" xmlns:w14="http://schemas.microsoft.com/office/word/2010/wordml" xmlns:w15="http://schemas.microsoft.com/office/word/2012/wordml" xmlns:w16cex="http://schemas.microsoft.com/office/word/2018/wordml/cex" xmlns:w16cid="http://schemas.microsoft.com/office/word/2016/wordml/cid" xmlns:w16="http://schemas.microsoft.com/office/word/2018/wordml" xmlns:w16du="http://schemas.microsoft.com/office/word/2023/wordml/word16du" xmlns:w16sdtdh="http://schemas.microsoft.com/office/word/2020/wordml/sdtdatahash" xmlns:w16sdtfl="http://schemas.microsoft.com/office/word/2024/wordml/sdtformatlock" xmlns:w16se="http://schemas.microsoft.com/office/word/2015/wordml/symex" xmlns:wpg="http://schemas.microsoft.com/office/word/2010/wordprocessingGroup" xmlns:wpi="http://schemas.microsoft.com/office/word/2010/wordprocessingInk" xmlns:wne="http://schemas.microsoft.com/office/word/2006/wordml" xmlns:wps="http://schemas.microsoft.com/office/word/2010/wordprocessingShape" mc:Ignorable="w14 w15 w16se w16cid w16 w16cex w16sdtdh w16sdtfl w16du wp14">
+  <w15:person w15:author="Daniel Schindler">
+    <w15:presenceInfo w15:providerId="AD" w15:userId="S::deschind@uw.edu::638f7977-a89c-40df-b85e-dc804ddb30d9"/>
+  </w15:person>
+</w15:people>
 </file>
 
 <file path=word/styles.xml><?xml version="1.0" encoding="utf-8"?>
@@ -1230,6 +1378,72 @@
       <w:spacing w:val="5"/>
     </w:rPr>
   </w:style>
+  <w:style w:type="character" w:styleId="CommentReference">
+    <w:name w:val="annotation reference"/>
+    <w:basedOn w:val="DefaultParagraphFont"/>
+    <w:uiPriority w:val="99"/>
+    <w:semiHidden/>
+    <w:unhideWhenUsed/>
+    <w:rsid w:val="00FA2B35"/>
+    <w:rPr>
+      <w:sz w:val="16"/>
+      <w:szCs w:val="16"/>
+    </w:rPr>
+  </w:style>
+  <w:style w:type="paragraph" w:styleId="CommentText">
+    <w:name w:val="annotation text"/>
+    <w:basedOn w:val="Normal"/>
+    <w:link w:val="CommentTextChar"/>
+    <w:uiPriority w:val="99"/>
+    <w:unhideWhenUsed/>
+    <w:rsid w:val="00FA2B35"/>
+    <w:pPr>
+      <w:spacing w:line="240" w:lineRule="auto"/>
+    </w:pPr>
+    <w:rPr>
+      <w:sz w:val="20"/>
+      <w:szCs w:val="20"/>
+    </w:rPr>
+  </w:style>
+  <w:style w:type="character" w:customStyle="1" w:styleId="CommentTextChar">
+    <w:name w:val="Comment Text Char"/>
+    <w:basedOn w:val="DefaultParagraphFont"/>
+    <w:link w:val="CommentText"/>
+    <w:uiPriority w:val="99"/>
+    <w:rsid w:val="00FA2B35"/>
+    <w:rPr>
+      <w:sz w:val="20"/>
+      <w:szCs w:val="20"/>
+    </w:rPr>
+  </w:style>
+  <w:style w:type="paragraph" w:styleId="CommentSubject">
+    <w:name w:val="annotation subject"/>
+    <w:basedOn w:val="CommentText"/>
+    <w:next w:val="CommentText"/>
+    <w:link w:val="CommentSubjectChar"/>
+    <w:uiPriority w:val="99"/>
+    <w:semiHidden/>
+    <w:unhideWhenUsed/>
+    <w:rsid w:val="00FA2B35"/>
+    <w:rPr>
+      <w:b/>
+      <w:bCs/>
+    </w:rPr>
+  </w:style>
+  <w:style w:type="character" w:customStyle="1" w:styleId="CommentSubjectChar">
+    <w:name w:val="Comment Subject Char"/>
+    <w:basedOn w:val="CommentTextChar"/>
+    <w:link w:val="CommentSubject"/>
+    <w:uiPriority w:val="99"/>
+    <w:semiHidden/>
+    <w:rsid w:val="00FA2B35"/>
+    <w:rPr>
+      <w:b/>
+      <w:bCs/>
+      <w:sz w:val="20"/>
+      <w:szCs w:val="20"/>
+    </w:rPr>
+  </w:style>
 </w:styles>
 </file>
 

</xml_diff>

<commit_message>
incorporated DS edits Aug26
</commit_message>
<xml_diff>
--- a/Docs/Figures_RunTimingManuscript.docx
+++ b/Docs/Figures_RunTimingManuscript.docx
@@ -2,19 +2,6 @@
 <file path=word/document.xml><?xml version="1.0" encoding="utf-8"?>
 <w:document xmlns:wpc="http://schemas.microsoft.com/office/word/2010/wordprocessingCanvas" xmlns:cx="http://schemas.microsoft.com/office/drawing/2014/chartex" xmlns:cx1="http://schemas.microsoft.com/office/drawing/2015/9/8/chartex" xmlns:cx2="http://schemas.microsoft.com/office/drawing/2015/10/21/chartex" xmlns:cx3="http://schemas.microsoft.com/office/drawing/2016/5/9/chartex" xmlns:cx4="http://schemas.microsoft.com/office/drawing/2016/5/10/chartex" xmlns:cx5="http://schemas.microsoft.com/office/drawing/2016/5/11/chartex" xmlns:cx6="http://schemas.microsoft.com/office/drawing/2016/5/12/chartex" xmlns:cx7="http://schemas.microsoft.com/office/drawing/2016/5/13/chartex" xmlns:cx8="http://schemas.microsoft.com/office/drawing/2016/5/14/chartex" xmlns:mc="http://schemas.openxmlformats.org/markup-compatibility/2006" xmlns:aink="http://schemas.microsoft.com/office/drawing/2016/ink" xmlns:am3d="http://schemas.microsoft.com/office/drawing/2017/model3d" xmlns:o="urn:schemas-microsoft-com:office:office" xmlns:oel="http://schemas.microsoft.com/office/2019/extlst" xmlns:r="http://schemas.openxmlformats.org/officeDocument/2006/relationships" xmlns:m="http://schemas.openxmlformats.org/officeDocument/2006/math" xmlns:v="urn:schemas-microsoft-com:vml" xmlns:wp14="http://schemas.microsoft.com/office/word/2010/wordprocessingDrawing" xmlns:wp="http://schemas.openxmlformats.org/drawingml/2006/wordprocessingDrawing" xmlns:w10="urn:schemas-microsoft-com:office:word" xmlns:w="http://schemas.openxmlformats.org/wordprocessingml/2006/main" xmlns:w14="http://schemas.microsoft.com/office/word/2010/wordml" xmlns:w15="http://schemas.microsoft.com/office/word/2012/wordml" xmlns:w16cex="http://schemas.microsoft.com/office/word/2018/wordml/cex" xmlns:w16cid="http://schemas.microsoft.com/office/word/2016/wordml/cid" xmlns:w16="http://schemas.microsoft.com/office/word/2018/wordml" xmlns:w16du="http://schemas.microsoft.com/office/word/2023/wordml/word16du" xmlns:w16sdtdh="http://schemas.microsoft.com/office/word/2020/wordml/sdtdatahash" xmlns:w16sdtfl="http://schemas.microsoft.com/office/word/2024/wordml/sdtformatlock" xmlns:w16se="http://schemas.microsoft.com/office/word/2015/wordml/symex" xmlns:wpg="http://schemas.microsoft.com/office/word/2010/wordprocessingGroup" xmlns:wpi="http://schemas.microsoft.com/office/word/2010/wordprocessingInk" xmlns:wne="http://schemas.microsoft.com/office/word/2006/wordml" xmlns:wps="http://schemas.microsoft.com/office/word/2010/wordprocessingShape" mc:Ignorable="w14 w15 w16se w16cid w16 w16cex w16sdtdh w16sdtfl w16du wp14">
   <w:body>
-    <w:p>
-      <w:r>
-        <w:t xml:space="preserve">Figure 1; [Kuskokwim </w:t>
-      </w:r>
-      <w:proofErr w:type="spellStart"/>
-      <w:r>
-        <w:t>Isoscape</w:t>
-      </w:r>
-      <w:proofErr w:type="spellEnd"/>
-      <w:r>
-        <w:t>, include inset and bounding box values in the figure description]</w:t>
-      </w:r>
-    </w:p>
     <w:p/>
     <w:p>
       <w:r>
@@ -37,7 +24,7 @@
                     <pic:cNvPicPr/>
                   </pic:nvPicPr>
                   <pic:blipFill>
-                    <a:blip r:embed="rId4"/>
+                    <a:blip r:embed="rId6"/>
                     <a:stretch>
                       <a:fillRect/>
                     </a:stretch>
@@ -58,29 +45,61 @@
         </w:drawing>
       </w:r>
     </w:p>
-    <w:p/>
-    <w:p/>
-    <w:p/>
-    <w:p/>
-    <w:p/>
-    <w:p/>
-    <w:p/>
-    <w:p/>
-    <w:p/>
     <w:p>
       <w:r>
+        <w:rPr>
+          <w:rFonts w:ascii="Garamond" w:hAnsi="Garamond"/>
+          <w:b/>
+          <w:bCs/>
+        </w:rPr>
+        <w:t>Figure 1:</w:t>
+      </w:r>
+      <w:r>
+        <w:t xml:space="preserve"> </w:t>
+      </w:r>
+      <w:r>
+        <w:rPr>
+          <w:rFonts w:ascii="Garamond" w:hAnsi="Garamond"/>
+          <w:sz w:val="22"/>
+          <w:szCs w:val="22"/>
+        </w:rPr>
+        <w:t xml:space="preserve">Strontium </w:t>
+      </w:r>
+      <w:proofErr w:type="spellStart"/>
+      <w:r>
+        <w:rPr>
+          <w:rFonts w:ascii="Garamond" w:hAnsi="Garamond"/>
+          <w:sz w:val="22"/>
+          <w:szCs w:val="22"/>
+        </w:rPr>
+        <w:t>isoscape</w:t>
+      </w:r>
+      <w:proofErr w:type="spellEnd"/>
+      <w:r>
+        <w:rPr>
+          <w:rFonts w:ascii="Garamond" w:hAnsi="Garamond"/>
+          <w:sz w:val="22"/>
+          <w:szCs w:val="22"/>
+        </w:rPr>
+        <w:t xml:space="preserve"> of the Kuskokwim River basin (will insert bounding box coordinates) displaying the spatial variation in modeled Sr87/Sr86 ratios. Ratios range from .7042 to .7107, with a general trend towards more enriched values at the top of the watershed.</w:t>
+      </w:r>
+      <w:r>
+        <w:t xml:space="preserve"> </w:t>
+      </w:r>
+    </w:p>
+    <w:p/>
+    <w:p/>
+    <w:p/>
+    <w:p/>
+    <w:p/>
+    <w:p/>
+    <w:p/>
+    <w:p>
+      <w:r>
+        <w:rPr>
+          <w:noProof/>
+        </w:rPr>
         <w:lastRenderedPageBreak/>
-        <w:t xml:space="preserve">Figure 2; </w:t>
-      </w:r>
-      <w:r>
-        <w:t xml:space="preserve">Management Unit Map </w:t>
-      </w:r>
-    </w:p>
-    <w:p>
-      <w:r>
-        <w:rPr>
-          <w:noProof/>
-        </w:rPr>
         <w:drawing>
           <wp:inline distT="0" distB="0" distL="0" distR="0" wp14:anchorId="3697CDD8" wp14:editId="22A6AFC7">
             <wp:extent cx="5943600" cy="4593590"/>
@@ -97,7 +116,7 @@
                     <pic:cNvPicPr/>
                   </pic:nvPicPr>
                   <pic:blipFill>
-                    <a:blip r:embed="rId5"/>
+                    <a:blip r:embed="rId7"/>
                     <a:stretch>
                       <a:fillRect/>
                     </a:stretch>
@@ -118,27 +137,42 @@
         </w:drawing>
       </w:r>
     </w:p>
-    <w:p/>
-    <w:p/>
-    <w:p/>
-    <w:p/>
-    <w:p/>
-    <w:p/>
-    <w:p/>
-    <w:p/>
-    <w:p/>
-    <w:p/>
     <w:p>
-      <w:r>
+      <w:pPr>
+        <w:rPr>
+          <w:rFonts w:ascii="Garamond" w:hAnsi="Garamond"/>
+        </w:rPr>
+      </w:pPr>
+      <w:r>
+        <w:rPr>
+          <w:rFonts w:ascii="Garamond" w:hAnsi="Garamond"/>
+          <w:b/>
+          <w:bCs/>
+        </w:rPr>
+        <w:t>Figure 2:</w:t>
+      </w:r>
+      <w:r>
+        <w:rPr>
+          <w:rFonts w:ascii="Garamond" w:hAnsi="Garamond"/>
+        </w:rPr>
+        <w:t xml:space="preserve"> Tributaries included in each management unit, derived by selecting the upstream reaches of several identified rivers of management interest to the Alaska Department of Fish and Game. Several manually selected units were added to reach full coverage of the basin. </w:t>
+      </w:r>
+    </w:p>
+    <w:p/>
+    <w:p/>
+    <w:p/>
+    <w:p/>
+    <w:p/>
+    <w:p/>
+    <w:p/>
+    <w:p/>
+    <w:p/>
+    <w:p>
+      <w:r>
+        <w:rPr>
+          <w:noProof/>
+        </w:rPr>
         <w:lastRenderedPageBreak/>
-        <w:t xml:space="preserve">Figure 3; 8 Panel map of average production </w:t>
-      </w:r>
-    </w:p>
-    <w:p>
-      <w:r>
-        <w:rPr>
-          <w:noProof/>
-        </w:rPr>
         <w:drawing>
           <wp:inline distT="0" distB="0" distL="0" distR="0" wp14:anchorId="167A01D8" wp14:editId="39D9C1AD">
             <wp:extent cx="5943600" cy="2666365"/>
@@ -155,7 +189,7 @@
                     <pic:cNvPicPr/>
                   </pic:nvPicPr>
                   <pic:blipFill>
-                    <a:blip r:embed="rId6"/>
+                    <a:blip r:embed="rId8"/>
                     <a:stretch>
                       <a:fillRect/>
                     </a:stretch>
@@ -176,7 +210,33 @@
         </w:drawing>
       </w:r>
     </w:p>
-    <w:p/>
+    <w:p>
+      <w:pPr>
+        <w:rPr>
+          <w:rFonts w:ascii="Garamond" w:hAnsi="Garamond"/>
+          <w:sz w:val="22"/>
+          <w:szCs w:val="22"/>
+        </w:rPr>
+      </w:pPr>
+      <w:r>
+        <w:rPr>
+          <w:rFonts w:ascii="Garamond" w:hAnsi="Garamond"/>
+          <w:b/>
+          <w:bCs/>
+          <w:sz w:val="22"/>
+          <w:szCs w:val="22"/>
+        </w:rPr>
+        <w:t>Figure 3</w:t>
+      </w:r>
+      <w:r>
+        <w:rPr>
+          <w:rFonts w:ascii="Garamond" w:hAnsi="Garamond"/>
+          <w:sz w:val="22"/>
+          <w:szCs w:val="22"/>
+        </w:rPr>
+        <w:t xml:space="preserve">: a) Mean contribution of management units for each seasonal quartile of the salmon run. Tributaries with darker colors (closer to red) indicate relatively higher mean proportional contribution to quartile returns. B) boxplots illustrating the range in mean values across all years of the dataset. </w:t>
+      </w:r>
+    </w:p>
     <w:p/>
     <w:p/>
     <w:p/>
@@ -225,9 +285,9 @@
           <w:szCs w:val="16"/>
         </w:rPr>
         <w:drawing>
-          <wp:inline distT="0" distB="0" distL="0" distR="0" wp14:anchorId="7B64ADF7" wp14:editId="14C6F20E">
-            <wp:extent cx="6292948" cy="7866185"/>
-            <wp:effectExtent l="0" t="0" r="0" b="0"/>
+          <wp:inline distT="0" distB="0" distL="0" distR="0" wp14:anchorId="7B64ADF7" wp14:editId="0ADAE1D4">
+            <wp:extent cx="5502729" cy="6878412"/>
+            <wp:effectExtent l="0" t="0" r="0" b="5080"/>
             <wp:docPr id="1928488302" name="Picture 1" descr="A graph of different colored lines&#10;&#10;AI-generated content may be incorrect."/>
             <wp:cNvGraphicFramePr>
               <a:graphicFrameLocks xmlns:a="http://schemas.openxmlformats.org/drawingml/2006/main" noChangeAspect="1"/>
@@ -237,126 +297,6 @@
                 <pic:pic xmlns:pic="http://schemas.openxmlformats.org/drawingml/2006/picture">
                   <pic:nvPicPr>
                     <pic:cNvPr id="1928488302" name="Picture 1" descr="A graph of different colored lines&#10;&#10;AI-generated content may be incorrect."/>
-                    <pic:cNvPicPr/>
-                  </pic:nvPicPr>
-                  <pic:blipFill>
-                    <a:blip r:embed="rId11" cstate="print">
-                      <a:extLst>
-                        <a:ext uri="{28A0092B-C50C-407E-A947-70E740481C1C}">
-                          <a14:useLocalDpi xmlns:a14="http://schemas.microsoft.com/office/drawing/2010/main" val="0"/>
-                        </a:ext>
-                      </a:extLst>
-                    </a:blip>
-                    <a:stretch>
-                      <a:fillRect/>
-                    </a:stretch>
-                  </pic:blipFill>
-                  <pic:spPr>
-                    <a:xfrm>
-                      <a:off x="0" y="0"/>
-                      <a:ext cx="6345397" cy="7931747"/>
-                    </a:xfrm>
-                    <a:prstGeom prst="rect">
-                      <a:avLst/>
-                    </a:prstGeom>
-                  </pic:spPr>
-                </pic:pic>
-              </a:graphicData>
-            </a:graphic>
-          </wp:inline>
-        </w:drawing>
-      </w:r>
-    </w:p>
-    <w:p>
-      <w:r>
-        <w:rPr>
-          <w:noProof/>
-        </w:rPr>
-        <w:lastRenderedPageBreak/>
-        <w:drawing>
-          <wp:inline distT="0" distB="0" distL="0" distR="0" wp14:anchorId="31CF7FF1" wp14:editId="36C186C9">
-            <wp:extent cx="5893358" cy="3928905"/>
-            <wp:effectExtent l="0" t="0" r="0" b="0"/>
-            <wp:docPr id="814574038" name="Picture 3"/>
-            <wp:cNvGraphicFramePr>
-              <a:graphicFrameLocks xmlns:a="http://schemas.openxmlformats.org/drawingml/2006/main" noChangeAspect="1"/>
-            </wp:cNvGraphicFramePr>
-            <a:graphic xmlns:a="http://schemas.openxmlformats.org/drawingml/2006/main">
-              <a:graphicData uri="http://schemas.openxmlformats.org/drawingml/2006/picture">
-                <pic:pic xmlns:pic="http://schemas.openxmlformats.org/drawingml/2006/picture">
-                  <pic:nvPicPr>
-                    <pic:cNvPr id="814574038" name="Picture 814574038"/>
-                    <pic:cNvPicPr/>
-                  </pic:nvPicPr>
-                  <pic:blipFill>
-                    <a:blip r:embed="rId12" cstate="print">
-                      <a:extLst>
-                        <a:ext uri="{28A0092B-C50C-407E-A947-70E740481C1C}">
-                          <a14:useLocalDpi xmlns:a14="http://schemas.microsoft.com/office/drawing/2010/main" val="0"/>
-                        </a:ext>
-                      </a:extLst>
-                    </a:blip>
-                    <a:stretch>
-                      <a:fillRect/>
-                    </a:stretch>
-                  </pic:blipFill>
-                  <pic:spPr>
-                    <a:xfrm>
-                      <a:off x="0" y="0"/>
-                      <a:ext cx="5917997" cy="3945331"/>
-                    </a:xfrm>
-                    <a:prstGeom prst="rect">
-                      <a:avLst/>
-                    </a:prstGeom>
-                  </pic:spPr>
-                </pic:pic>
-              </a:graphicData>
-            </a:graphic>
-          </wp:inline>
-        </w:drawing>
-      </w:r>
-    </w:p>
-    <w:p/>
-    <w:p/>
-    <w:p/>
-    <w:p>
-      <w:r>
-        <w:t xml:space="preserve">Figure 5: Front </w:t>
-      </w:r>
-      <w:commentRangeStart w:id="1"/>
-      <w:r>
-        <w:t>end</w:t>
-      </w:r>
-      <w:commentRangeEnd w:id="1"/>
-      <w:r>
-        <w:rPr>
-          <w:rStyle w:val="CommentReference"/>
-        </w:rPr>
-        <w:commentReference w:id="1"/>
-      </w:r>
-      <w:r>
-        <w:t xml:space="preserve"> closure protection by stock </w:t>
-      </w:r>
-    </w:p>
-    <w:p>
-      <w:r>
-        <w:rPr>
-          <w:noProof/>
-        </w:rPr>
-        <w:lastRenderedPageBreak/>
-        <w:drawing>
-          <wp:inline distT="0" distB="0" distL="0" distR="0" wp14:anchorId="5ACB3875" wp14:editId="395C9494">
-            <wp:extent cx="6589633" cy="4707082"/>
-            <wp:effectExtent l="0" t="0" r="1905" b="5080"/>
-            <wp:docPr id="562155378" name="Picture 1" descr="A graph with different colored lines&#10;&#10;AI-generated content may be incorrect."/>
-            <wp:cNvGraphicFramePr>
-              <a:graphicFrameLocks xmlns:a="http://schemas.openxmlformats.org/drawingml/2006/main" noChangeAspect="1"/>
-            </wp:cNvGraphicFramePr>
-            <a:graphic xmlns:a="http://schemas.openxmlformats.org/drawingml/2006/main">
-              <a:graphicData uri="http://schemas.openxmlformats.org/drawingml/2006/picture">
-                <pic:pic xmlns:pic="http://schemas.openxmlformats.org/drawingml/2006/picture">
-                  <pic:nvPicPr>
-                    <pic:cNvPr id="562155378" name="Picture 1" descr="A graph with different colored lines&#10;&#10;AI-generated content may be incorrect."/>
                     <pic:cNvPicPr/>
                   </pic:nvPicPr>
                   <pic:blipFill>
@@ -374,7 +314,7 @@
                   <pic:spPr>
                     <a:xfrm>
                       <a:off x="0" y="0"/>
-                      <a:ext cx="6613390" cy="4724052"/>
+                      <a:ext cx="5556894" cy="6946119"/>
                     </a:xfrm>
                     <a:prstGeom prst="rect">
                       <a:avLst/>
@@ -387,6 +327,222 @@
         </w:drawing>
       </w:r>
     </w:p>
+    <w:p>
+      <w:pPr>
+        <w:rPr>
+          <w:rStyle w:val="CommentReference"/>
+          <w:rFonts w:ascii="Garamond" w:hAnsi="Garamond"/>
+          <w:sz w:val="22"/>
+          <w:szCs w:val="22"/>
+        </w:rPr>
+      </w:pPr>
+      <w:r>
+        <w:rPr>
+          <w:rStyle w:val="CommentReference"/>
+          <w:rFonts w:ascii="Garamond" w:hAnsi="Garamond"/>
+          <w:sz w:val="22"/>
+          <w:szCs w:val="22"/>
+        </w:rPr>
+        <w:t xml:space="preserve">Figure 4: Cumulative distributions of returning stocks for each three-day period of the run. Stocks are colored in order of their watershed position, with the furthest upstream stocks in red transitioning towards downstream stocks in blue. </w:t>
+      </w:r>
+    </w:p>
+    <w:p>
+      <w:r>
+        <w:rPr>
+          <w:noProof/>
+        </w:rPr>
+        <w:lastRenderedPageBreak/>
+        <w:drawing>
+          <wp:inline distT="0" distB="0" distL="0" distR="0" wp14:anchorId="31CF7FF1" wp14:editId="66B67B0E">
+            <wp:extent cx="6743826" cy="4495884"/>
+            <wp:effectExtent l="0" t="0" r="0" b="0"/>
+            <wp:docPr id="814574038" name="Picture 3"/>
+            <wp:cNvGraphicFramePr>
+              <a:graphicFrameLocks xmlns:a="http://schemas.openxmlformats.org/drawingml/2006/main" noChangeAspect="1"/>
+            </wp:cNvGraphicFramePr>
+            <a:graphic xmlns:a="http://schemas.openxmlformats.org/drawingml/2006/main">
+              <a:graphicData uri="http://schemas.openxmlformats.org/drawingml/2006/picture">
+                <pic:pic xmlns:pic="http://schemas.openxmlformats.org/drawingml/2006/picture">
+                  <pic:nvPicPr>
+                    <pic:cNvPr id="814574038" name="Picture 814574038"/>
+                    <pic:cNvPicPr/>
+                  </pic:nvPicPr>
+                  <pic:blipFill>
+                    <a:blip r:embed="rId14" cstate="print">
+                      <a:extLst>
+                        <a:ext uri="{28A0092B-C50C-407E-A947-70E740481C1C}">
+                          <a14:useLocalDpi xmlns:a14="http://schemas.microsoft.com/office/drawing/2010/main" val="0"/>
+                        </a:ext>
+                      </a:extLst>
+                    </a:blip>
+                    <a:stretch>
+                      <a:fillRect/>
+                    </a:stretch>
+                  </pic:blipFill>
+                  <pic:spPr>
+                    <a:xfrm>
+                      <a:off x="0" y="0"/>
+                      <a:ext cx="6800595" cy="4533730"/>
+                    </a:xfrm>
+                    <a:prstGeom prst="rect">
+                      <a:avLst/>
+                    </a:prstGeom>
+                  </pic:spPr>
+                </pic:pic>
+              </a:graphicData>
+            </a:graphic>
+          </wp:inline>
+        </w:drawing>
+      </w:r>
+    </w:p>
+    <w:p>
+      <w:pPr>
+        <w:rPr>
+          <w:rFonts w:ascii="Garamond" w:hAnsi="Garamond"/>
+          <w:sz w:val="22"/>
+          <w:szCs w:val="22"/>
+        </w:rPr>
+      </w:pPr>
+      <w:r>
+        <w:rPr>
+          <w:rFonts w:ascii="Garamond" w:hAnsi="Garamond"/>
+          <w:b/>
+          <w:bCs/>
+          <w:sz w:val="22"/>
+          <w:szCs w:val="22"/>
+        </w:rPr>
+        <w:t>Figure 5:</w:t>
+      </w:r>
+      <w:r>
+        <w:rPr>
+          <w:rFonts w:ascii="Garamond" w:hAnsi="Garamond"/>
+          <w:sz w:val="22"/>
+          <w:szCs w:val="22"/>
+        </w:rPr>
+        <w:t xml:space="preserve"> </w:t>
+      </w:r>
+      <w:r>
+        <w:rPr>
+          <w:rFonts w:ascii="Garamond" w:hAnsi="Garamond"/>
+          <w:sz w:val="22"/>
+          <w:szCs w:val="22"/>
+        </w:rPr>
+        <w:t xml:space="preserve">Range and mean number of days from the beginning </w:t>
+      </w:r>
+      <w:proofErr w:type="spellStart"/>
+      <w:r>
+        <w:rPr>
+          <w:rFonts w:ascii="Garamond" w:hAnsi="Garamond"/>
+          <w:sz w:val="22"/>
+          <w:szCs w:val="22"/>
+        </w:rPr>
+        <w:t>fo</w:t>
+      </w:r>
+      <w:proofErr w:type="spellEnd"/>
+      <w:r>
+        <w:rPr>
+          <w:rFonts w:ascii="Garamond" w:hAnsi="Garamond"/>
+          <w:sz w:val="22"/>
+          <w:szCs w:val="22"/>
+        </w:rPr>
+        <w:t xml:space="preserve"> the run to 50% of total returns by stock. The width of the bar represents the range of values, whereas the black vertical line represents the mean. Bars are colored by their watershed position, with upstream stocks in Red and downstream stocks in blue. </w:t>
+      </w:r>
+    </w:p>
+    <w:p/>
+    <w:p/>
+    <w:p>
+      <w:r>
+        <w:rPr>
+          <w:noProof/>
+        </w:rPr>
+        <w:lastRenderedPageBreak/>
+        <w:drawing>
+          <wp:inline distT="0" distB="0" distL="0" distR="0" wp14:anchorId="5ACB3875" wp14:editId="0C482931">
+            <wp:extent cx="6002448" cy="4157566"/>
+            <wp:effectExtent l="0" t="0" r="5080" b="0"/>
+            <wp:docPr id="562155378" name="Picture 1" descr="A graph with different colored lines&#10;&#10;AI-generated content may be incorrect."/>
+            <wp:cNvGraphicFramePr>
+              <a:graphicFrameLocks xmlns:a="http://schemas.openxmlformats.org/drawingml/2006/main" noChangeAspect="1"/>
+            </wp:cNvGraphicFramePr>
+            <a:graphic xmlns:a="http://schemas.openxmlformats.org/drawingml/2006/main">
+              <a:graphicData uri="http://schemas.openxmlformats.org/drawingml/2006/picture">
+                <pic:pic xmlns:pic="http://schemas.openxmlformats.org/drawingml/2006/picture">
+                  <pic:nvPicPr>
+                    <pic:cNvPr id="562155378" name="Picture 1" descr="A graph with different colored lines&#10;&#10;AI-generated content may be incorrect."/>
+                    <pic:cNvPicPr/>
+                  </pic:nvPicPr>
+                  <pic:blipFill rotWithShape="1">
+                    <a:blip r:embed="rId15" cstate="print">
+                      <a:extLst>
+                        <a:ext uri="{28A0092B-C50C-407E-A947-70E740481C1C}">
+                          <a14:useLocalDpi xmlns:a14="http://schemas.microsoft.com/office/drawing/2010/main" val="0"/>
+                        </a:ext>
+                      </a:extLst>
+                    </a:blip>
+                    <a:srcRect l="5435" t="8025" r="7649" b="7696"/>
+                    <a:stretch>
+                      <a:fillRect/>
+                    </a:stretch>
+                  </pic:blipFill>
+                  <pic:spPr bwMode="auto">
+                    <a:xfrm>
+                      <a:off x="0" y="0"/>
+                      <a:ext cx="6094474" cy="4221307"/>
+                    </a:xfrm>
+                    <a:prstGeom prst="rect">
+                      <a:avLst/>
+                    </a:prstGeom>
+                    <a:ln>
+                      <a:noFill/>
+                    </a:ln>
+                    <a:extLst>
+                      <a:ext uri="{53640926-AAD7-44D8-BBD7-CCE9431645EC}">
+                        <a14:shadowObscured xmlns:a14="http://schemas.microsoft.com/office/drawing/2010/main"/>
+                      </a:ext>
+                    </a:extLst>
+                  </pic:spPr>
+                </pic:pic>
+              </a:graphicData>
+            </a:graphic>
+          </wp:inline>
+        </w:drawing>
+      </w:r>
+    </w:p>
+    <w:p>
+      <w:pPr>
+        <w:rPr>
+          <w:rFonts w:ascii="Garamond" w:hAnsi="Garamond"/>
+          <w:sz w:val="22"/>
+          <w:szCs w:val="22"/>
+        </w:rPr>
+      </w:pPr>
+      <w:r>
+        <w:rPr>
+          <w:rFonts w:ascii="Garamond" w:hAnsi="Garamond"/>
+          <w:sz w:val="22"/>
+          <w:szCs w:val="22"/>
+        </w:rPr>
+        <w:t>Figure 6: The range of proportional protection offered by the front-end closure ending on June 11</w:t>
+      </w:r>
+      <w:r>
+        <w:rPr>
+          <w:rFonts w:ascii="Garamond" w:hAnsi="Garamond"/>
+          <w:sz w:val="22"/>
+          <w:szCs w:val="22"/>
+          <w:vertAlign w:val="superscript"/>
+        </w:rPr>
+        <w:t>th</w:t>
+      </w:r>
+      <w:r>
+        <w:rPr>
+          <w:rFonts w:ascii="Garamond" w:hAnsi="Garamond"/>
+          <w:sz w:val="22"/>
+          <w:szCs w:val="22"/>
+        </w:rPr>
+        <w:t xml:space="preserve">. White circles indicate the mean, whereas violin plots illustrate the range of values across all years by stock. </w:t>
+      </w:r>
+    </w:p>
+    <w:p/>
     <w:sectPr>
       <w:pgSz w:w="12240" w:h="15840"/>
       <w:pgMar w:top="1440" w:right="1440" w:bottom="1440" w:left="1440" w:header="720" w:footer="720" w:gutter="0"/>
@@ -415,44 +571,75 @@
       </w:r>
     </w:p>
   </w:comment>
-  <w:comment w:id="1" w:author="Daniel Schindler" w:date="2025-07-17T14:19:00Z" w:initials="DS">
-    <w:p>
-      <w:pPr>
-        <w:pStyle w:val="CommentText"/>
-      </w:pPr>
-      <w:r>
-        <w:rPr>
-          <w:rStyle w:val="CommentReference"/>
-        </w:rPr>
-        <w:annotationRef/>
-      </w:r>
-      <w:r>
-        <w:t>Is it worth coloring these to correspond to previous figure?</w:t>
-      </w:r>
-    </w:p>
-  </w:comment>
 </w:comments>
 </file>
 
 <file path=word/commentsExtended.xml><?xml version="1.0" encoding="utf-8"?>
 <w15:commentsEx xmlns:wpc="http://schemas.microsoft.com/office/word/2010/wordprocessingCanvas" xmlns:cx="http://schemas.microsoft.com/office/drawing/2014/chartex" xmlns:cx1="http://schemas.microsoft.com/office/drawing/2015/9/8/chartex" xmlns:cx2="http://schemas.microsoft.com/office/drawing/2015/10/21/chartex" xmlns:cx3="http://schemas.microsoft.com/office/drawing/2016/5/9/chartex" xmlns:cx4="http://schemas.microsoft.com/office/drawing/2016/5/10/chartex" xmlns:cx5="http://schemas.microsoft.com/office/drawing/2016/5/11/chartex" xmlns:cx6="http://schemas.microsoft.com/office/drawing/2016/5/12/chartex" xmlns:cx7="http://schemas.microsoft.com/office/drawing/2016/5/13/chartex" xmlns:cx8="http://schemas.microsoft.com/office/drawing/2016/5/14/chartex" xmlns:mc="http://schemas.openxmlformats.org/markup-compatibility/2006" xmlns:aink="http://schemas.microsoft.com/office/drawing/2016/ink" xmlns:am3d="http://schemas.microsoft.com/office/drawing/2017/model3d" xmlns:o="urn:schemas-microsoft-com:office:office" xmlns:oel="http://schemas.microsoft.com/office/2019/extlst" xmlns:r="http://schemas.openxmlformats.org/officeDocument/2006/relationships" xmlns:m="http://schemas.openxmlformats.org/officeDocument/2006/math" xmlns:v="urn:schemas-microsoft-com:vml" xmlns:wp14="http://schemas.microsoft.com/office/word/2010/wordprocessingDrawing" xmlns:wp="http://schemas.openxmlformats.org/drawingml/2006/wordprocessingDrawing" xmlns:w10="urn:schemas-microsoft-com:office:word" xmlns:w="http://schemas.openxmlformats.org/wordprocessingml/2006/main" xmlns:w14="http://schemas.microsoft.com/office/word/2010/wordml" xmlns:w15="http://schemas.microsoft.com/office/word/2012/wordml" xmlns:w16cex="http://schemas.microsoft.com/office/word/2018/wordml/cex" xmlns:w16cid="http://schemas.microsoft.com/office/word/2016/wordml/cid" xmlns:w16="http://schemas.microsoft.com/office/word/2018/wordml" xmlns:w16du="http://schemas.microsoft.com/office/word/2023/wordml/word16du" xmlns:w16sdtdh="http://schemas.microsoft.com/office/word/2020/wordml/sdtdatahash" xmlns:w16sdtfl="http://schemas.microsoft.com/office/word/2024/wordml/sdtformatlock" xmlns:w16se="http://schemas.microsoft.com/office/word/2015/wordml/symex" xmlns:wpg="http://schemas.microsoft.com/office/word/2010/wordprocessingGroup" xmlns:wpi="http://schemas.microsoft.com/office/word/2010/wordprocessingInk" xmlns:wne="http://schemas.microsoft.com/office/word/2006/wordml" xmlns:wps="http://schemas.microsoft.com/office/word/2010/wordprocessingShape" mc:Ignorable="w14 w15 w16se w16cid w16 w16cex w16sdtdh w16sdtfl w16du wp14">
   <w15:commentEx w15:paraId="5D59A14B" w15:done="0"/>
-  <w15:commentEx w15:paraId="32B91192" w15:done="0"/>
 </w15:commentsEx>
 </file>
 
 <file path=word/commentsExtensible.xml><?xml version="1.0" encoding="utf-8"?>
 <w16cex:commentsExtensible xmlns:wpc="http://schemas.microsoft.com/office/word/2010/wordprocessingCanvas" xmlns:cx="http://schemas.microsoft.com/office/drawing/2014/chartex" xmlns:cx1="http://schemas.microsoft.com/office/drawing/2015/9/8/chartex" xmlns:cx2="http://schemas.microsoft.com/office/drawing/2015/10/21/chartex" xmlns:cx3="http://schemas.microsoft.com/office/drawing/2016/5/9/chartex" xmlns:cx4="http://schemas.microsoft.com/office/drawing/2016/5/10/chartex" xmlns:cx5="http://schemas.microsoft.com/office/drawing/2016/5/11/chartex" xmlns:cx6="http://schemas.microsoft.com/office/drawing/2016/5/12/chartex" xmlns:cx7="http://schemas.microsoft.com/office/drawing/2016/5/13/chartex" xmlns:cx8="http://schemas.microsoft.com/office/drawing/2016/5/14/chartex" xmlns:cr="http://schemas.microsoft.com/office/comments/2020/reactions" xmlns:mc="http://schemas.openxmlformats.org/markup-compatibility/2006" xmlns:aink="http://schemas.microsoft.com/office/drawing/2016/ink" xmlns:am3d="http://schemas.microsoft.com/office/drawing/2017/model3d" xmlns:o="urn:schemas-microsoft-com:office:office" xmlns:oel="http://schemas.microsoft.com/office/2019/extlst" xmlns:r="http://schemas.openxmlformats.org/officeDocument/2006/relationships" xmlns:m="http://schemas.openxmlformats.org/officeDocument/2006/math" xmlns:v="urn:schemas-microsoft-com:vml" xmlns:wp14="http://schemas.microsoft.com/office/word/2010/wordprocessingDrawing" xmlns:wp="http://schemas.openxmlformats.org/drawingml/2006/wordprocessingDrawing" xmlns:w10="urn:schemas-microsoft-com:office:word" xmlns:w="http://schemas.openxmlformats.org/wordprocessingml/2006/main" xmlns:w14="http://schemas.microsoft.com/office/word/2010/wordml" xmlns:w15="http://schemas.microsoft.com/office/word/2012/wordml" xmlns:w16cex="http://schemas.microsoft.com/office/word/2018/wordml/cex" xmlns:w16cid="http://schemas.microsoft.com/office/word/2016/wordml/cid" xmlns:w16="http://schemas.microsoft.com/office/word/2018/wordml" xmlns:w16du="http://schemas.microsoft.com/office/word/2023/wordml/word16du" xmlns:w16sdtdh="http://schemas.microsoft.com/office/word/2020/wordml/sdtdatahash" xmlns:w16sdtfl="http://schemas.microsoft.com/office/word/2024/wordml/sdtformatlock" xmlns:w16se="http://schemas.microsoft.com/office/word/2015/wordml/symex" xmlns:wpg="http://schemas.microsoft.com/office/word/2010/wordprocessingGroup" xmlns:wpi="http://schemas.microsoft.com/office/word/2010/wordprocessingInk" xmlns:wne="http://schemas.microsoft.com/office/word/2006/wordml" xmlns:wps="http://schemas.microsoft.com/office/word/2010/wordprocessingShape" mc:Ignorable="w14 w15 w16se w16cid w16 w16cex w16sdtdh w16sdtfl cr w16du wp14">
   <w16cex:commentExtensible w16cex:durableId="33BDF08E" w16cex:dateUtc="2025-07-17T22:10:00Z"/>
-  <w16cex:commentExtensible w16cex:durableId="3F60878B" w16cex:dateUtc="2025-07-17T22:19:00Z"/>
 </w16cex:commentsExtensible>
 </file>
 
 <file path=word/commentsIds.xml><?xml version="1.0" encoding="utf-8"?>
 <w16cid:commentsIds xmlns:wpc="http://schemas.microsoft.com/office/word/2010/wordprocessingCanvas" xmlns:cx="http://schemas.microsoft.com/office/drawing/2014/chartex" xmlns:cx1="http://schemas.microsoft.com/office/drawing/2015/9/8/chartex" xmlns:cx2="http://schemas.microsoft.com/office/drawing/2015/10/21/chartex" xmlns:cx3="http://schemas.microsoft.com/office/drawing/2016/5/9/chartex" xmlns:cx4="http://schemas.microsoft.com/office/drawing/2016/5/10/chartex" xmlns:cx5="http://schemas.microsoft.com/office/drawing/2016/5/11/chartex" xmlns:cx6="http://schemas.microsoft.com/office/drawing/2016/5/12/chartex" xmlns:cx7="http://schemas.microsoft.com/office/drawing/2016/5/13/chartex" xmlns:cx8="http://schemas.microsoft.com/office/drawing/2016/5/14/chartex" xmlns:mc="http://schemas.openxmlformats.org/markup-compatibility/2006" xmlns:aink="http://schemas.microsoft.com/office/drawing/2016/ink" xmlns:am3d="http://schemas.microsoft.com/office/drawing/2017/model3d" xmlns:o="urn:schemas-microsoft-com:office:office" xmlns:oel="http://schemas.microsoft.com/office/2019/extlst" xmlns:r="http://schemas.openxmlformats.org/officeDocument/2006/relationships" xmlns:m="http://schemas.openxmlformats.org/officeDocument/2006/math" xmlns:v="urn:schemas-microsoft-com:vml" xmlns:wp14="http://schemas.microsoft.com/office/word/2010/wordprocessingDrawing" xmlns:wp="http://schemas.openxmlformats.org/drawingml/2006/wordprocessingDrawing" xmlns:w10="urn:schemas-microsoft-com:office:word" xmlns:w="http://schemas.openxmlformats.org/wordprocessingml/2006/main" xmlns:w14="http://schemas.microsoft.com/office/word/2010/wordml" xmlns:w15="http://schemas.microsoft.com/office/word/2012/wordml" xmlns:w16cex="http://schemas.microsoft.com/office/word/2018/wordml/cex" xmlns:w16cid="http://schemas.microsoft.com/office/word/2016/wordml/cid" xmlns:w16="http://schemas.microsoft.com/office/word/2018/wordml" xmlns:w16du="http://schemas.microsoft.com/office/word/2023/wordml/word16du" xmlns:w16sdtdh="http://schemas.microsoft.com/office/word/2020/wordml/sdtdatahash" xmlns:w16sdtfl="http://schemas.microsoft.com/office/word/2024/wordml/sdtformatlock" xmlns:w16se="http://schemas.microsoft.com/office/word/2015/wordml/symex" xmlns:wpg="http://schemas.microsoft.com/office/word/2010/wordprocessingGroup" xmlns:wpi="http://schemas.microsoft.com/office/word/2010/wordprocessingInk" xmlns:wne="http://schemas.microsoft.com/office/word/2006/wordml" xmlns:wps="http://schemas.microsoft.com/office/word/2010/wordprocessingShape" mc:Ignorable="w14 w15 w16se w16cid w16 w16cex w16sdtdh w16sdtfl w16du wp14">
   <w16cid:commentId w16cid:paraId="5D59A14B" w16cid:durableId="33BDF08E"/>
-  <w16cid:commentId w16cid:paraId="32B91192" w16cid:durableId="3F60878B"/>
 </w16cid:commentsIds>
+</file>
+
+<file path=word/endnotes.xml><?xml version="1.0" encoding="utf-8"?>
+<w:endnotes xmlns:wpc="http://schemas.microsoft.com/office/word/2010/wordprocessingCanvas" xmlns:cx="http://schemas.microsoft.com/office/drawing/2014/chartex" xmlns:cx1="http://schemas.microsoft.com/office/drawing/2015/9/8/chartex" xmlns:cx2="http://schemas.microsoft.com/office/drawing/2015/10/21/chartex" xmlns:cx3="http://schemas.microsoft.com/office/drawing/2016/5/9/chartex" xmlns:cx4="http://schemas.microsoft.com/office/drawing/2016/5/10/chartex" xmlns:cx5="http://schemas.microsoft.com/office/drawing/2016/5/11/chartex" xmlns:cx6="http://schemas.microsoft.com/office/drawing/2016/5/12/chartex" xmlns:cx7="http://schemas.microsoft.com/office/drawing/2016/5/13/chartex" xmlns:cx8="http://schemas.microsoft.com/office/drawing/2016/5/14/chartex" xmlns:mc="http://schemas.openxmlformats.org/markup-compatibility/2006" xmlns:aink="http://schemas.microsoft.com/office/drawing/2016/ink" xmlns:am3d="http://schemas.microsoft.com/office/drawing/2017/model3d" xmlns:o="urn:schemas-microsoft-com:office:office" xmlns:oel="http://schemas.microsoft.com/office/2019/extlst" xmlns:r="http://schemas.openxmlformats.org/officeDocument/2006/relationships" xmlns:m="http://schemas.openxmlformats.org/officeDocument/2006/math" xmlns:v="urn:schemas-microsoft-com:vml" xmlns:wp14="http://schemas.microsoft.com/office/word/2010/wordprocessingDrawing" xmlns:wp="http://schemas.openxmlformats.org/drawingml/2006/wordprocessingDrawing" xmlns:w10="urn:schemas-microsoft-com:office:word" xmlns:w="http://schemas.openxmlformats.org/wordprocessingml/2006/main" xmlns:w14="http://schemas.microsoft.com/office/word/2010/wordml" xmlns:w15="http://schemas.microsoft.com/office/word/2012/wordml" xmlns:w16cex="http://schemas.microsoft.com/office/word/2018/wordml/cex" xmlns:w16cid="http://schemas.microsoft.com/office/word/2016/wordml/cid" xmlns:w16="http://schemas.microsoft.com/office/word/2018/wordml" xmlns:w16du="http://schemas.microsoft.com/office/word/2023/wordml/word16du" xmlns:w16sdtdh="http://schemas.microsoft.com/office/word/2020/wordml/sdtdatahash" xmlns:w16sdtfl="http://schemas.microsoft.com/office/word/2024/wordml/sdtformatlock" xmlns:w16se="http://schemas.microsoft.com/office/word/2015/wordml/symex" xmlns:wpg="http://schemas.microsoft.com/office/word/2010/wordprocessingGroup" xmlns:wpi="http://schemas.microsoft.com/office/word/2010/wordprocessingInk" xmlns:wne="http://schemas.microsoft.com/office/word/2006/wordml" xmlns:wps="http://schemas.microsoft.com/office/word/2010/wordprocessingShape" mc:Ignorable="w14 w15 w16se w16cid w16 w16cex w16sdtdh w16sdtfl w16du wp14">
+  <w:endnote w:type="separator" w:id="-1">
+    <w:p>
+      <w:pPr>
+        <w:spacing w:after="0" w:line="240" w:lineRule="auto"/>
+      </w:pPr>
+      <w:r>
+        <w:separator/>
+      </w:r>
+    </w:p>
+  </w:endnote>
+  <w:endnote w:type="continuationSeparator" w:id="0">
+    <w:p>
+      <w:pPr>
+        <w:spacing w:after="0" w:line="240" w:lineRule="auto"/>
+      </w:pPr>
+      <w:r>
+        <w:continuationSeparator/>
+      </w:r>
+    </w:p>
+  </w:endnote>
+</w:endnotes>
+</file>
+
+<file path=word/footnotes.xml><?xml version="1.0" encoding="utf-8"?>
+<w:footnotes xmlns:wpc="http://schemas.microsoft.com/office/word/2010/wordprocessingCanvas" xmlns:cx="http://schemas.microsoft.com/office/drawing/2014/chartex" xmlns:cx1="http://schemas.microsoft.com/office/drawing/2015/9/8/chartex" xmlns:cx2="http://schemas.microsoft.com/office/drawing/2015/10/21/chartex" xmlns:cx3="http://schemas.microsoft.com/office/drawing/2016/5/9/chartex" xmlns:cx4="http://schemas.microsoft.com/office/drawing/2016/5/10/chartex" xmlns:cx5="http://schemas.microsoft.com/office/drawing/2016/5/11/chartex" xmlns:cx6="http://schemas.microsoft.com/office/drawing/2016/5/12/chartex" xmlns:cx7="http://schemas.microsoft.com/office/drawing/2016/5/13/chartex" xmlns:cx8="http://schemas.microsoft.com/office/drawing/2016/5/14/chartex" xmlns:mc="http://schemas.openxmlformats.org/markup-compatibility/2006" xmlns:aink="http://schemas.microsoft.com/office/drawing/2016/ink" xmlns:am3d="http://schemas.microsoft.com/office/drawing/2017/model3d" xmlns:o="urn:schemas-microsoft-com:office:office" xmlns:oel="http://schemas.microsoft.com/office/2019/extlst" xmlns:r="http://schemas.openxmlformats.org/officeDocument/2006/relationships" xmlns:m="http://schemas.openxmlformats.org/officeDocument/2006/math" xmlns:v="urn:schemas-microsoft-com:vml" xmlns:wp14="http://schemas.microsoft.com/office/word/2010/wordprocessingDrawing" xmlns:wp="http://schemas.openxmlformats.org/drawingml/2006/wordprocessingDrawing" xmlns:w10="urn:schemas-microsoft-com:office:word" xmlns:w="http://schemas.openxmlformats.org/wordprocessingml/2006/main" xmlns:w14="http://schemas.microsoft.com/office/word/2010/wordml" xmlns:w15="http://schemas.microsoft.com/office/word/2012/wordml" xmlns:w16cex="http://schemas.microsoft.com/office/word/2018/wordml/cex" xmlns:w16cid="http://schemas.microsoft.com/office/word/2016/wordml/cid" xmlns:w16="http://schemas.microsoft.com/office/word/2018/wordml" xmlns:w16du="http://schemas.microsoft.com/office/word/2023/wordml/word16du" xmlns:w16sdtdh="http://schemas.microsoft.com/office/word/2020/wordml/sdtdatahash" xmlns:w16sdtfl="http://schemas.microsoft.com/office/word/2024/wordml/sdtformatlock" xmlns:w16se="http://schemas.microsoft.com/office/word/2015/wordml/symex" xmlns:wpg="http://schemas.microsoft.com/office/word/2010/wordprocessingGroup" xmlns:wpi="http://schemas.microsoft.com/office/word/2010/wordprocessingInk" xmlns:wne="http://schemas.microsoft.com/office/word/2006/wordml" xmlns:wps="http://schemas.microsoft.com/office/word/2010/wordprocessingShape" mc:Ignorable="w14 w15 w16se w16cid w16 w16cex w16sdtdh w16sdtfl w16du wp14">
+  <w:footnote w:type="separator" w:id="-1">
+    <w:p>
+      <w:pPr>
+        <w:spacing w:after="0" w:line="240" w:lineRule="auto"/>
+      </w:pPr>
+      <w:r>
+        <w:separator/>
+      </w:r>
+    </w:p>
+  </w:footnote>
+  <w:footnote w:type="continuationSeparator" w:id="0">
+    <w:p>
+      <w:pPr>
+        <w:spacing w:after="0" w:line="240" w:lineRule="auto"/>
+      </w:pPr>
+      <w:r>
+        <w:continuationSeparator/>
+      </w:r>
+    </w:p>
+  </w:footnote>
+</w:footnotes>
 </file>
 
 <file path=word/people.xml><?xml version="1.0" encoding="utf-8"?>
@@ -1446,6 +1633,50 @@
       <w:szCs w:val="20"/>
     </w:rPr>
   </w:style>
+  <w:style w:type="paragraph" w:styleId="Header">
+    <w:name w:val="header"/>
+    <w:basedOn w:val="Normal"/>
+    <w:link w:val="HeaderChar"/>
+    <w:uiPriority w:val="99"/>
+    <w:unhideWhenUsed/>
+    <w:rsid w:val="00E24311"/>
+    <w:pPr>
+      <w:tabs>
+        <w:tab w:val="center" w:pos="4680"/>
+        <w:tab w:val="right" w:pos="9360"/>
+      </w:tabs>
+      <w:spacing w:after="0" w:line="240" w:lineRule="auto"/>
+    </w:pPr>
+  </w:style>
+  <w:style w:type="character" w:customStyle="1" w:styleId="HeaderChar">
+    <w:name w:val="Header Char"/>
+    <w:basedOn w:val="DefaultParagraphFont"/>
+    <w:link w:val="Header"/>
+    <w:uiPriority w:val="99"/>
+    <w:rsid w:val="00E24311"/>
+  </w:style>
+  <w:style w:type="paragraph" w:styleId="Footer">
+    <w:name w:val="footer"/>
+    <w:basedOn w:val="Normal"/>
+    <w:link w:val="FooterChar"/>
+    <w:uiPriority w:val="99"/>
+    <w:unhideWhenUsed/>
+    <w:rsid w:val="00E24311"/>
+    <w:pPr>
+      <w:tabs>
+        <w:tab w:val="center" w:pos="4680"/>
+        <w:tab w:val="right" w:pos="9360"/>
+      </w:tabs>
+      <w:spacing w:after="0" w:line="240" w:lineRule="auto"/>
+    </w:pPr>
+  </w:style>
+  <w:style w:type="character" w:customStyle="1" w:styleId="FooterChar">
+    <w:name w:val="Footer Char"/>
+    <w:basedOn w:val="DefaultParagraphFont"/>
+    <w:link w:val="Footer"/>
+    <w:uiPriority w:val="99"/>
+    <w:rsid w:val="00E24311"/>
+  </w:style>
 </w:styles>
 </file>
 

</xml_diff>

<commit_message>
Added figures new average
</commit_message>
<xml_diff>
--- a/Docs/Figures_RunTimingManuscript.docx
+++ b/Docs/Figures_RunTimingManuscript.docx
@@ -63,25 +63,7 @@
           <w:sz w:val="22"/>
           <w:szCs w:val="22"/>
         </w:rPr>
-        <w:t xml:space="preserve">Strontium </w:t>
-      </w:r>
-      <w:proofErr w:type="spellStart"/>
-      <w:r>
-        <w:rPr>
-          <w:rFonts w:ascii="Garamond" w:hAnsi="Garamond"/>
-          <w:sz w:val="22"/>
-          <w:szCs w:val="22"/>
-        </w:rPr>
-        <w:t>isoscape</w:t>
-      </w:r>
-      <w:proofErr w:type="spellEnd"/>
-      <w:r>
-        <w:rPr>
-          <w:rFonts w:ascii="Garamond" w:hAnsi="Garamond"/>
-          <w:sz w:val="22"/>
-          <w:szCs w:val="22"/>
-        </w:rPr>
-        <w:t xml:space="preserve"> of the Kuskokwim River basin (will insert bounding box coordinates) displaying the spatial variation in modeled Sr87/Sr86 ratios. Ratios range from .7042 to .7107, with a general trend towards more enriched values at the top of the watershed.</w:t>
+        <w:t>Strontium isoscape of the Kuskokwim River basin (will insert bounding box coordinates) displaying the spatial variation in modeled Sr87/Sr86 ratios. Ratios range from .7042 to .7107, with a general trend towards more enriched values at the top of the watershed.</w:t>
       </w:r>
       <w:r>
         <w:t xml:space="preserve"> </w:t>
@@ -214,18 +196,414 @@
       <w:pPr>
         <w:rPr>
           <w:rFonts w:ascii="Garamond" w:hAnsi="Garamond"/>
-          <w:sz w:val="22"/>
-          <w:szCs w:val="22"/>
-        </w:rPr>
-      </w:pPr>
-      <w:r>
-        <w:rPr>
-          <w:rFonts w:ascii="Garamond" w:hAnsi="Garamond"/>
           <w:b/>
           <w:bCs/>
           <w:sz w:val="22"/>
           <w:szCs w:val="22"/>
         </w:rPr>
+      </w:pPr>
+      <w:r>
+        <w:rPr>
+          <w:noProof/>
+        </w:rPr>
+        <w:drawing>
+          <wp:anchor distT="0" distB="0" distL="114300" distR="114300" simplePos="0" relativeHeight="251658240" behindDoc="0" locked="0" layoutInCell="1" allowOverlap="1" wp14:anchorId="4342669F" wp14:editId="27C87D63">
+            <wp:simplePos x="914400" y="3713517"/>
+            <wp:positionH relativeFrom="column">
+              <wp:align>left</wp:align>
+            </wp:positionH>
+            <wp:positionV relativeFrom="paragraph">
+              <wp:align>top</wp:align>
+            </wp:positionV>
+            <wp:extent cx="3220135" cy="4166222"/>
+            <wp:effectExtent l="0" t="0" r="0" b="6350"/>
+            <wp:wrapSquare wrapText="bothSides"/>
+            <wp:docPr id="1391367714" name="Picture 1" descr="A map of the world&#10;&#10;AI-generated content may be incorrect."/>
+            <wp:cNvGraphicFramePr>
+              <a:graphicFrameLocks xmlns:a="http://schemas.openxmlformats.org/drawingml/2006/main" noChangeAspect="1"/>
+            </wp:cNvGraphicFramePr>
+            <a:graphic xmlns:a="http://schemas.openxmlformats.org/drawingml/2006/main">
+              <a:graphicData uri="http://schemas.openxmlformats.org/drawingml/2006/picture">
+                <pic:pic xmlns:pic="http://schemas.openxmlformats.org/drawingml/2006/picture">
+                  <pic:nvPicPr>
+                    <pic:cNvPr id="1391367714" name="Picture 1" descr="A map of the world&#10;&#10;AI-generated content may be incorrect."/>
+                    <pic:cNvPicPr/>
+                  </pic:nvPicPr>
+                  <pic:blipFill>
+                    <a:blip r:embed="rId9" cstate="print">
+                      <a:extLst>
+                        <a:ext uri="{28A0092B-C50C-407E-A947-70E740481C1C}">
+                          <a14:useLocalDpi xmlns:a14="http://schemas.microsoft.com/office/drawing/2010/main" val="0"/>
+                        </a:ext>
+                      </a:extLst>
+                    </a:blip>
+                    <a:stretch>
+                      <a:fillRect/>
+                    </a:stretch>
+                  </pic:blipFill>
+                  <pic:spPr>
+                    <a:xfrm>
+                      <a:off x="0" y="0"/>
+                      <a:ext cx="3220135" cy="4166222"/>
+                    </a:xfrm>
+                    <a:prstGeom prst="rect">
+                      <a:avLst/>
+                    </a:prstGeom>
+                  </pic:spPr>
+                </pic:pic>
+              </a:graphicData>
+            </a:graphic>
+          </wp:anchor>
+        </w:drawing>
+      </w:r>
+    </w:p>
+    <w:p>
+      <w:pPr>
+        <w:rPr>
+          <w:rFonts w:ascii="Garamond" w:hAnsi="Garamond"/>
+          <w:sz w:val="22"/>
+          <w:szCs w:val="22"/>
+        </w:rPr>
+      </w:pPr>
+    </w:p>
+    <w:p>
+      <w:pPr>
+        <w:rPr>
+          <w:rFonts w:ascii="Garamond" w:hAnsi="Garamond"/>
+          <w:sz w:val="22"/>
+          <w:szCs w:val="22"/>
+        </w:rPr>
+      </w:pPr>
+    </w:p>
+    <w:p>
+      <w:pPr>
+        <w:rPr>
+          <w:rFonts w:ascii="Garamond" w:hAnsi="Garamond"/>
+          <w:sz w:val="22"/>
+          <w:szCs w:val="22"/>
+        </w:rPr>
+      </w:pPr>
+    </w:p>
+    <w:p>
+      <w:pPr>
+        <w:rPr>
+          <w:rFonts w:ascii="Garamond" w:hAnsi="Garamond"/>
+          <w:sz w:val="22"/>
+          <w:szCs w:val="22"/>
+        </w:rPr>
+      </w:pPr>
+    </w:p>
+    <w:p>
+      <w:pPr>
+        <w:rPr>
+          <w:rFonts w:ascii="Garamond" w:hAnsi="Garamond"/>
+          <w:sz w:val="22"/>
+          <w:szCs w:val="22"/>
+        </w:rPr>
+      </w:pPr>
+    </w:p>
+    <w:p>
+      <w:pPr>
+        <w:rPr>
+          <w:rFonts w:ascii="Garamond" w:hAnsi="Garamond"/>
+          <w:sz w:val="22"/>
+          <w:szCs w:val="22"/>
+        </w:rPr>
+      </w:pPr>
+    </w:p>
+    <w:p>
+      <w:pPr>
+        <w:rPr>
+          <w:rFonts w:ascii="Garamond" w:hAnsi="Garamond"/>
+          <w:sz w:val="22"/>
+          <w:szCs w:val="22"/>
+        </w:rPr>
+      </w:pPr>
+    </w:p>
+    <w:p>
+      <w:pPr>
+        <w:rPr>
+          <w:rFonts w:ascii="Garamond" w:hAnsi="Garamond"/>
+          <w:sz w:val="22"/>
+          <w:szCs w:val="22"/>
+        </w:rPr>
+      </w:pPr>
+    </w:p>
+    <w:p>
+      <w:pPr>
+        <w:rPr>
+          <w:rFonts w:ascii="Garamond" w:hAnsi="Garamond"/>
+          <w:sz w:val="22"/>
+          <w:szCs w:val="22"/>
+        </w:rPr>
+      </w:pPr>
+    </w:p>
+    <w:p>
+      <w:pPr>
+        <w:rPr>
+          <w:rFonts w:ascii="Garamond" w:hAnsi="Garamond"/>
+          <w:sz w:val="22"/>
+          <w:szCs w:val="22"/>
+        </w:rPr>
+      </w:pPr>
+    </w:p>
+    <w:p>
+      <w:pPr>
+        <w:rPr>
+          <w:rFonts w:ascii="Garamond" w:hAnsi="Garamond"/>
+          <w:sz w:val="22"/>
+          <w:szCs w:val="22"/>
+        </w:rPr>
+      </w:pPr>
+    </w:p>
+    <w:p>
+      <w:pPr>
+        <w:rPr>
+          <w:rFonts w:ascii="Garamond" w:hAnsi="Garamond"/>
+          <w:sz w:val="22"/>
+          <w:szCs w:val="22"/>
+        </w:rPr>
+      </w:pPr>
+    </w:p>
+    <w:p>
+      <w:pPr>
+        <w:rPr>
+          <w:rFonts w:ascii="Garamond" w:hAnsi="Garamond"/>
+          <w:b/>
+          <w:bCs/>
+          <w:sz w:val="22"/>
+          <w:szCs w:val="22"/>
+        </w:rPr>
+      </w:pPr>
+    </w:p>
+    <w:p>
+      <w:pPr>
+        <w:tabs>
+          <w:tab w:val="left" w:pos="2621"/>
+        </w:tabs>
+        <w:rPr>
+          <w:rFonts w:ascii="Garamond" w:hAnsi="Garamond"/>
+          <w:b/>
+          <w:bCs/>
+          <w:sz w:val="22"/>
+          <w:szCs w:val="22"/>
+        </w:rPr>
+      </w:pPr>
+      <w:r>
+        <w:rPr>
+          <w:rFonts w:ascii="Garamond" w:hAnsi="Garamond"/>
+          <w:b/>
+          <w:bCs/>
+          <w:sz w:val="22"/>
+          <w:szCs w:val="22"/>
+        </w:rPr>
+        <w:lastRenderedPageBreak/>
+        <w:tab/>
+      </w:r>
+      <w:r>
+        <w:rPr>
+          <w:noProof/>
+        </w:rPr>
+        <w:drawing>
+          <wp:inline distT="0" distB="0" distL="0" distR="0" wp14:anchorId="1F2D0ED8" wp14:editId="4129C1ED">
+            <wp:extent cx="5943600" cy="7689850"/>
+            <wp:effectExtent l="0" t="0" r="0" b="6350"/>
+            <wp:docPr id="48893318" name="Picture 1" descr="A map of the world with red veins&#10;&#10;AI-generated content may be incorrect."/>
+            <wp:cNvGraphicFramePr>
+              <a:graphicFrameLocks xmlns:a="http://schemas.openxmlformats.org/drawingml/2006/main" noChangeAspect="1"/>
+            </wp:cNvGraphicFramePr>
+            <a:graphic xmlns:a="http://schemas.openxmlformats.org/drawingml/2006/main">
+              <a:graphicData uri="http://schemas.openxmlformats.org/drawingml/2006/picture">
+                <pic:pic xmlns:pic="http://schemas.openxmlformats.org/drawingml/2006/picture">
+                  <pic:nvPicPr>
+                    <pic:cNvPr id="48893318" name="Picture 1" descr="A map of the world with red veins&#10;&#10;AI-generated content may be incorrect."/>
+                    <pic:cNvPicPr/>
+                  </pic:nvPicPr>
+                  <pic:blipFill>
+                    <a:blip r:embed="rId10"/>
+                    <a:stretch>
+                      <a:fillRect/>
+                    </a:stretch>
+                  </pic:blipFill>
+                  <pic:spPr>
+                    <a:xfrm>
+                      <a:off x="0" y="0"/>
+                      <a:ext cx="5943600" cy="7689850"/>
+                    </a:xfrm>
+                    <a:prstGeom prst="rect">
+                      <a:avLst/>
+                    </a:prstGeom>
+                  </pic:spPr>
+                </pic:pic>
+              </a:graphicData>
+            </a:graphic>
+          </wp:inline>
+        </w:drawing>
+      </w:r>
+      <w:r>
+        <w:rPr>
+          <w:noProof/>
+        </w:rPr>
+        <w:lastRenderedPageBreak/>
+        <w:drawing>
+          <wp:inline distT="0" distB="0" distL="0" distR="0" wp14:anchorId="364971C7" wp14:editId="26FD0349">
+            <wp:extent cx="5943600" cy="7689850"/>
+            <wp:effectExtent l="0" t="0" r="0" b="6350"/>
+            <wp:docPr id="305299523" name="Picture 1" descr="A map of the world&#10;&#10;AI-generated content may be incorrect."/>
+            <wp:cNvGraphicFramePr>
+              <a:graphicFrameLocks xmlns:a="http://schemas.openxmlformats.org/drawingml/2006/main" noChangeAspect="1"/>
+            </wp:cNvGraphicFramePr>
+            <a:graphic xmlns:a="http://schemas.openxmlformats.org/drawingml/2006/main">
+              <a:graphicData uri="http://schemas.openxmlformats.org/drawingml/2006/picture">
+                <pic:pic xmlns:pic="http://schemas.openxmlformats.org/drawingml/2006/picture">
+                  <pic:nvPicPr>
+                    <pic:cNvPr id="305299523" name="Picture 1" descr="A map of the world&#10;&#10;AI-generated content may be incorrect."/>
+                    <pic:cNvPicPr/>
+                  </pic:nvPicPr>
+                  <pic:blipFill>
+                    <a:blip r:embed="rId11"/>
+                    <a:stretch>
+                      <a:fillRect/>
+                    </a:stretch>
+                  </pic:blipFill>
+                  <pic:spPr>
+                    <a:xfrm>
+                      <a:off x="0" y="0"/>
+                      <a:ext cx="5943600" cy="7689850"/>
+                    </a:xfrm>
+                    <a:prstGeom prst="rect">
+                      <a:avLst/>
+                    </a:prstGeom>
+                  </pic:spPr>
+                </pic:pic>
+              </a:graphicData>
+            </a:graphic>
+          </wp:inline>
+        </w:drawing>
+      </w:r>
+      <w:r>
+        <w:rPr>
+          <w:noProof/>
+        </w:rPr>
+        <w:lastRenderedPageBreak/>
+        <w:drawing>
+          <wp:inline distT="0" distB="0" distL="0" distR="0" wp14:anchorId="139FCB05" wp14:editId="36384554">
+            <wp:extent cx="5943600" cy="7689850"/>
+            <wp:effectExtent l="0" t="0" r="0" b="6350"/>
+            <wp:docPr id="992401652" name="Picture 1" descr="A map of the world&#10;&#10;AI-generated content may be incorrect."/>
+            <wp:cNvGraphicFramePr>
+              <a:graphicFrameLocks xmlns:a="http://schemas.openxmlformats.org/drawingml/2006/main" noChangeAspect="1"/>
+            </wp:cNvGraphicFramePr>
+            <a:graphic xmlns:a="http://schemas.openxmlformats.org/drawingml/2006/main">
+              <a:graphicData uri="http://schemas.openxmlformats.org/drawingml/2006/picture">
+                <pic:pic xmlns:pic="http://schemas.openxmlformats.org/drawingml/2006/picture">
+                  <pic:nvPicPr>
+                    <pic:cNvPr id="992401652" name="Picture 1" descr="A map of the world&#10;&#10;AI-generated content may be incorrect."/>
+                    <pic:cNvPicPr/>
+                  </pic:nvPicPr>
+                  <pic:blipFill>
+                    <a:blip r:embed="rId12"/>
+                    <a:stretch>
+                      <a:fillRect/>
+                    </a:stretch>
+                  </pic:blipFill>
+                  <pic:spPr>
+                    <a:xfrm>
+                      <a:off x="0" y="0"/>
+                      <a:ext cx="5943600" cy="7689850"/>
+                    </a:xfrm>
+                    <a:prstGeom prst="rect">
+                      <a:avLst/>
+                    </a:prstGeom>
+                  </pic:spPr>
+                </pic:pic>
+              </a:graphicData>
+            </a:graphic>
+          </wp:inline>
+        </w:drawing>
+      </w:r>
+      <w:r>
+        <w:rPr>
+          <w:rFonts w:ascii="Garamond" w:hAnsi="Garamond"/>
+          <w:b/>
+          <w:bCs/>
+          <w:sz w:val="22"/>
+          <w:szCs w:val="22"/>
+        </w:rPr>
+        <w:br w:type="textWrapping" w:clear="all"/>
+      </w:r>
+    </w:p>
+    <w:p>
+      <w:pPr>
+        <w:rPr>
+          <w:rFonts w:ascii="Garamond" w:hAnsi="Garamond"/>
+          <w:b/>
+          <w:bCs/>
+          <w:sz w:val="22"/>
+          <w:szCs w:val="22"/>
+        </w:rPr>
+      </w:pPr>
+    </w:p>
+    <w:p>
+      <w:pPr>
+        <w:rPr>
+          <w:rFonts w:ascii="Garamond" w:hAnsi="Garamond"/>
+          <w:b/>
+          <w:bCs/>
+          <w:sz w:val="22"/>
+          <w:szCs w:val="22"/>
+        </w:rPr>
+      </w:pPr>
+    </w:p>
+    <w:p>
+      <w:pPr>
+        <w:rPr>
+          <w:rFonts w:ascii="Garamond" w:hAnsi="Garamond"/>
+          <w:b/>
+          <w:bCs/>
+          <w:sz w:val="22"/>
+          <w:szCs w:val="22"/>
+        </w:rPr>
+      </w:pPr>
+    </w:p>
+    <w:p>
+      <w:pPr>
+        <w:rPr>
+          <w:rFonts w:ascii="Garamond" w:hAnsi="Garamond"/>
+          <w:b/>
+          <w:bCs/>
+          <w:sz w:val="22"/>
+          <w:szCs w:val="22"/>
+        </w:rPr>
+      </w:pPr>
+    </w:p>
+    <w:p>
+      <w:pPr>
+        <w:rPr>
+          <w:rFonts w:ascii="Garamond" w:hAnsi="Garamond"/>
+          <w:b/>
+          <w:bCs/>
+          <w:sz w:val="22"/>
+          <w:szCs w:val="22"/>
+        </w:rPr>
+      </w:pPr>
+    </w:p>
+    <w:p>
+      <w:pPr>
+        <w:rPr>
+          <w:rFonts w:ascii="Garamond" w:hAnsi="Garamond"/>
+          <w:sz w:val="22"/>
+          <w:szCs w:val="22"/>
+        </w:rPr>
+      </w:pPr>
+      <w:r>
+        <w:rPr>
+          <w:rFonts w:ascii="Garamond" w:hAnsi="Garamond"/>
+          <w:b/>
+          <w:bCs/>
+          <w:sz w:val="22"/>
+          <w:szCs w:val="22"/>
+        </w:rPr>
         <w:t>Figure 3</w:t>
       </w:r>
       <w:r>
@@ -254,7 +632,6 @@
     <w:p/>
     <w:p>
       <w:r>
-        <w:lastRenderedPageBreak/>
         <w:t xml:space="preserve">Figure 4: </w:t>
       </w:r>
       <w:commentRangeStart w:id="0"/>
@@ -284,6 +661,7 @@
           <w:sz w:val="16"/>
           <w:szCs w:val="16"/>
         </w:rPr>
+        <w:lastRenderedPageBreak/>
         <w:drawing>
           <wp:inline distT="0" distB="0" distL="0" distR="0" wp14:anchorId="7B64ADF7" wp14:editId="0ADAE1D4">
             <wp:extent cx="5502729" cy="6878412"/>
@@ -300,7 +678,7 @@
                     <pic:cNvPicPr/>
                   </pic:nvPicPr>
                   <pic:blipFill>
-                    <a:blip r:embed="rId13" cstate="print">
+                    <a:blip r:embed="rId17" cstate="print">
                       <a:extLst>
                         <a:ext uri="{28A0092B-C50C-407E-A947-70E740481C1C}">
                           <a14:useLocalDpi xmlns:a14="http://schemas.microsoft.com/office/drawing/2010/main" val="0"/>
@@ -368,7 +746,7 @@
                     <pic:cNvPicPr/>
                   </pic:nvPicPr>
                   <pic:blipFill>
-                    <a:blip r:embed="rId14" cstate="print">
+                    <a:blip r:embed="rId18" cstate="print">
                       <a:extLst>
                         <a:ext uri="{28A0092B-C50C-407E-A947-70E740481C1C}">
                           <a14:useLocalDpi xmlns:a14="http://schemas.microsoft.com/office/drawing/2010/main" val="0"/>
@@ -427,25 +805,7 @@
           <w:sz w:val="22"/>
           <w:szCs w:val="22"/>
         </w:rPr>
-        <w:t xml:space="preserve">Range and mean number of days from the beginning </w:t>
-      </w:r>
-      <w:proofErr w:type="spellStart"/>
-      <w:r>
-        <w:rPr>
-          <w:rFonts w:ascii="Garamond" w:hAnsi="Garamond"/>
-          <w:sz w:val="22"/>
-          <w:szCs w:val="22"/>
-        </w:rPr>
-        <w:t>fo</w:t>
-      </w:r>
-      <w:proofErr w:type="spellEnd"/>
-      <w:r>
-        <w:rPr>
-          <w:rFonts w:ascii="Garamond" w:hAnsi="Garamond"/>
-          <w:sz w:val="22"/>
-          <w:szCs w:val="22"/>
-        </w:rPr>
-        <w:t xml:space="preserve"> the run to 50% of total returns by stock. The width of the bar represents the range of values, whereas the black vertical line represents the mean. Bars are colored by their watershed position, with upstream stocks in Red and downstream stocks in blue. </w:t>
+        <w:t xml:space="preserve">Range and mean number of days from the beginning fo the run to 50% of total returns by stock. The width of the bar represents the range of values, whereas the black vertical line represents the mean. Bars are colored by their watershed position, with upstream stocks in Red and downstream stocks in blue. </w:t>
       </w:r>
     </w:p>
     <w:p/>
@@ -472,7 +832,7 @@
                     <pic:cNvPicPr/>
                   </pic:nvPicPr>
                   <pic:blipFill rotWithShape="1">
-                    <a:blip r:embed="rId15" cstate="print">
+                    <a:blip r:embed="rId19" cstate="print">
                       <a:extLst>
                         <a:ext uri="{28A0092B-C50C-407E-A947-70E740481C1C}">
                           <a14:useLocalDpi xmlns:a14="http://schemas.microsoft.com/office/drawing/2010/main" val="0"/>

</xml_diff>

<commit_message>
Added new figures average to doc
</commit_message>
<xml_diff>
--- a/Docs/Figures_RunTimingManuscript.docx
+++ b/Docs/Figures_RunTimingManuscript.docx
@@ -63,7 +63,25 @@
           <w:sz w:val="22"/>
           <w:szCs w:val="22"/>
         </w:rPr>
-        <w:t>Strontium isoscape of the Kuskokwim River basin (will insert bounding box coordinates) displaying the spatial variation in modeled Sr87/Sr86 ratios. Ratios range from .7042 to .7107, with a general trend towards more enriched values at the top of the watershed.</w:t>
+        <w:t xml:space="preserve">Strontium </w:t>
+      </w:r>
+      <w:proofErr w:type="spellStart"/>
+      <w:r>
+        <w:rPr>
+          <w:rFonts w:ascii="Garamond" w:hAnsi="Garamond"/>
+          <w:sz w:val="22"/>
+          <w:szCs w:val="22"/>
+        </w:rPr>
+        <w:t>isoscape</w:t>
+      </w:r>
+      <w:proofErr w:type="spellEnd"/>
+      <w:r>
+        <w:rPr>
+          <w:rFonts w:ascii="Garamond" w:hAnsi="Garamond"/>
+          <w:sz w:val="22"/>
+          <w:szCs w:val="22"/>
+        </w:rPr>
+        <w:t xml:space="preserve"> of the Kuskokwim River basin (will insert bounding box coordinates) displaying the spatial variation in modeled Sr87/Sr86 ratios. Ratios range from .7042 to .7107, with a general trend towards more enriched values at the top of the watershed.</w:t>
       </w:r>
       <w:r>
         <w:t xml:space="preserve"> </w:t>
@@ -150,16 +168,222 @@
     <w:p/>
     <w:p/>
     <w:p>
+      <w:pPr>
+        <w:rPr>
+          <w:noProof/>
+        </w:rPr>
+      </w:pPr>
+    </w:p>
+    <w:p/>
+    <w:p>
+      <w:pPr>
+        <w:rPr>
+          <w:rFonts w:ascii="Garamond" w:hAnsi="Garamond"/>
+          <w:b/>
+          <w:bCs/>
+          <w:sz w:val="22"/>
+          <w:szCs w:val="22"/>
+        </w:rPr>
+      </w:pPr>
+    </w:p>
+    <w:p>
+      <w:pPr>
+        <w:rPr>
+          <w:rFonts w:ascii="Garamond" w:hAnsi="Garamond"/>
+          <w:sz w:val="22"/>
+          <w:szCs w:val="22"/>
+        </w:rPr>
+      </w:pPr>
+    </w:p>
+    <w:p>
+      <w:pPr>
+        <w:rPr>
+          <w:rFonts w:ascii="Garamond" w:hAnsi="Garamond"/>
+          <w:sz w:val="22"/>
+          <w:szCs w:val="22"/>
+        </w:rPr>
+      </w:pPr>
+    </w:p>
+    <w:p>
+      <w:pPr>
+        <w:rPr>
+          <w:rFonts w:ascii="Garamond" w:hAnsi="Garamond"/>
+          <w:sz w:val="22"/>
+          <w:szCs w:val="22"/>
+        </w:rPr>
+      </w:pPr>
+    </w:p>
+    <w:p>
+      <w:pPr>
+        <w:rPr>
+          <w:rFonts w:ascii="Garamond" w:hAnsi="Garamond"/>
+          <w:sz w:val="22"/>
+          <w:szCs w:val="22"/>
+        </w:rPr>
+      </w:pPr>
+    </w:p>
+    <w:p>
+      <w:pPr>
+        <w:rPr>
+          <w:rFonts w:ascii="Garamond" w:hAnsi="Garamond"/>
+          <w:sz w:val="22"/>
+          <w:szCs w:val="22"/>
+        </w:rPr>
+      </w:pPr>
+    </w:p>
+    <w:p>
+      <w:pPr>
+        <w:rPr>
+          <w:rFonts w:ascii="Garamond" w:hAnsi="Garamond"/>
+          <w:sz w:val="22"/>
+          <w:szCs w:val="22"/>
+        </w:rPr>
+      </w:pPr>
+    </w:p>
+    <w:p>
+      <w:pPr>
+        <w:rPr>
+          <w:rFonts w:ascii="Garamond" w:hAnsi="Garamond"/>
+          <w:sz w:val="22"/>
+          <w:szCs w:val="22"/>
+        </w:rPr>
+      </w:pPr>
+    </w:p>
+    <w:p>
+      <w:pPr>
+        <w:rPr>
+          <w:rFonts w:ascii="Garamond" w:hAnsi="Garamond"/>
+          <w:sz w:val="22"/>
+          <w:szCs w:val="22"/>
+        </w:rPr>
+      </w:pPr>
+    </w:p>
+    <w:p>
+      <w:pPr>
+        <w:rPr>
+          <w:rFonts w:ascii="Garamond" w:hAnsi="Garamond"/>
+          <w:sz w:val="22"/>
+          <w:szCs w:val="22"/>
+        </w:rPr>
+      </w:pPr>
+    </w:p>
+    <w:p>
+      <w:pPr>
+        <w:rPr>
+          <w:rFonts w:ascii="Garamond" w:hAnsi="Garamond"/>
+          <w:sz w:val="22"/>
+          <w:szCs w:val="22"/>
+        </w:rPr>
+      </w:pPr>
+    </w:p>
+    <w:p>
+      <w:pPr>
+        <w:rPr>
+          <w:rFonts w:ascii="Garamond" w:hAnsi="Garamond"/>
+          <w:sz w:val="22"/>
+          <w:szCs w:val="22"/>
+        </w:rPr>
+      </w:pPr>
+    </w:p>
+    <w:p>
+      <w:pPr>
+        <w:rPr>
+          <w:rFonts w:ascii="Garamond" w:hAnsi="Garamond"/>
+          <w:sz w:val="22"/>
+          <w:szCs w:val="22"/>
+        </w:rPr>
+      </w:pPr>
+    </w:p>
+    <w:p>
+      <w:pPr>
+        <w:rPr>
+          <w:rFonts w:ascii="Garamond" w:hAnsi="Garamond"/>
+          <w:b/>
+          <w:bCs/>
+          <w:sz w:val="22"/>
+          <w:szCs w:val="22"/>
+        </w:rPr>
+      </w:pPr>
+    </w:p>
+    <w:p>
+      <w:pPr>
+        <w:tabs>
+          <w:tab w:val="left" w:pos="2621"/>
+        </w:tabs>
+        <w:rPr>
+          <w:noProof/>
+        </w:rPr>
+      </w:pPr>
+      <w:r>
+        <w:rPr>
+          <w:rFonts w:ascii="Garamond" w:hAnsi="Garamond"/>
+          <w:b/>
+          <w:bCs/>
+          <w:sz w:val="22"/>
+          <w:szCs w:val="22"/>
+        </w:rPr>
+        <w:tab/>
+      </w:r>
+    </w:p>
+    <w:p>
+      <w:pPr>
+        <w:tabs>
+          <w:tab w:val="left" w:pos="2621"/>
+        </w:tabs>
+        <w:rPr>
+          <w:noProof/>
+        </w:rPr>
+      </w:pPr>
+    </w:p>
+    <w:p>
+      <w:pPr>
+        <w:tabs>
+          <w:tab w:val="left" w:pos="2621"/>
+        </w:tabs>
+        <w:rPr>
+          <w:noProof/>
+        </w:rPr>
+      </w:pPr>
+    </w:p>
+    <w:p>
+      <w:pPr>
+        <w:tabs>
+          <w:tab w:val="left" w:pos="2621"/>
+        </w:tabs>
+        <w:rPr>
+          <w:noProof/>
+        </w:rPr>
+      </w:pPr>
+    </w:p>
+    <w:p>
+      <w:pPr>
+        <w:tabs>
+          <w:tab w:val="left" w:pos="2621"/>
+        </w:tabs>
+        <w:rPr>
+          <w:noProof/>
+        </w:rPr>
+      </w:pPr>
+    </w:p>
+    <w:p>
+      <w:pPr>
+        <w:tabs>
+          <w:tab w:val="left" w:pos="2621"/>
+        </w:tabs>
+        <w:rPr>
+          <w:noProof/>
+        </w:rPr>
+      </w:pPr>
       <w:r>
         <w:rPr>
           <w:noProof/>
         </w:rPr>
         <w:lastRenderedPageBreak/>
         <w:drawing>
-          <wp:inline distT="0" distB="0" distL="0" distR="0" wp14:anchorId="167A01D8" wp14:editId="39D9C1AD">
-            <wp:extent cx="5943600" cy="2666365"/>
-            <wp:effectExtent l="0" t="0" r="0" b="635"/>
-            <wp:docPr id="1830187347" name="Picture 1" descr="A map of the country&#10;&#10;AI-generated content may be incorrect."/>
+          <wp:inline distT="0" distB="0" distL="0" distR="0" wp14:anchorId="34888FD1" wp14:editId="1D461E74">
+            <wp:extent cx="6288103" cy="2955139"/>
+            <wp:effectExtent l="0" t="0" r="0" b="0"/>
+            <wp:docPr id="739570781" name="Picture 2"/>
             <wp:cNvGraphicFramePr>
               <a:graphicFrameLocks xmlns:a="http://schemas.openxmlformats.org/drawingml/2006/main" noChangeAspect="1"/>
             </wp:cNvGraphicFramePr>
@@ -167,23 +391,41 @@
               <a:graphicData uri="http://schemas.openxmlformats.org/drawingml/2006/picture">
                 <pic:pic xmlns:pic="http://schemas.openxmlformats.org/drawingml/2006/picture">
                   <pic:nvPicPr>
-                    <pic:cNvPr id="1830187347" name="Picture 1" descr="A map of the country&#10;&#10;AI-generated content may be incorrect."/>
-                    <pic:cNvPicPr/>
+                    <pic:cNvPr id="0" name="Picture 3"/>
+                    <pic:cNvPicPr>
+                      <a:picLocks noChangeAspect="1" noChangeArrowheads="1"/>
+                    </pic:cNvPicPr>
                   </pic:nvPicPr>
-                  <pic:blipFill>
-                    <a:blip r:embed="rId8"/>
+                  <pic:blipFill rotWithShape="1">
+                    <a:blip r:embed="rId8" cstate="print">
+                      <a:extLst>
+                        <a:ext uri="{28A0092B-C50C-407E-A947-70E740481C1C}">
+                          <a14:useLocalDpi xmlns:a14="http://schemas.microsoft.com/office/drawing/2010/main" val="0"/>
+                        </a:ext>
+                      </a:extLst>
+                    </a:blip>
+                    <a:srcRect l="1936" t="38434"/>
                     <a:stretch>
                       <a:fillRect/>
                     </a:stretch>
                   </pic:blipFill>
-                  <pic:spPr>
+                  <pic:spPr bwMode="auto">
                     <a:xfrm>
                       <a:off x="0" y="0"/>
-                      <a:ext cx="5943600" cy="2666365"/>
+                      <a:ext cx="6296239" cy="2958963"/>
                     </a:xfrm>
                     <a:prstGeom prst="rect">
                       <a:avLst/>
                     </a:prstGeom>
+                    <a:noFill/>
+                    <a:ln>
+                      <a:noFill/>
+                    </a:ln>
+                    <a:extLst>
+                      <a:ext uri="{53640926-AAD7-44D8-BBD7-CCE9431645EC}">
+                        <a14:shadowObscured xmlns:a14="http://schemas.microsoft.com/office/drawing/2010/main"/>
+                      </a:ext>
+                    </a:extLst>
                   </pic:spPr>
                 </pic:pic>
               </a:graphicData>
@@ -194,190 +436,6 @@
     </w:p>
     <w:p>
       <w:pPr>
-        <w:rPr>
-          <w:rFonts w:ascii="Garamond" w:hAnsi="Garamond"/>
-          <w:b/>
-          <w:bCs/>
-          <w:sz w:val="22"/>
-          <w:szCs w:val="22"/>
-        </w:rPr>
-      </w:pPr>
-      <w:r>
-        <w:rPr>
-          <w:noProof/>
-        </w:rPr>
-        <w:drawing>
-          <wp:anchor distT="0" distB="0" distL="114300" distR="114300" simplePos="0" relativeHeight="251658240" behindDoc="0" locked="0" layoutInCell="1" allowOverlap="1" wp14:anchorId="4342669F" wp14:editId="27C87D63">
-            <wp:simplePos x="914400" y="3713517"/>
-            <wp:positionH relativeFrom="column">
-              <wp:align>left</wp:align>
-            </wp:positionH>
-            <wp:positionV relativeFrom="paragraph">
-              <wp:align>top</wp:align>
-            </wp:positionV>
-            <wp:extent cx="3220135" cy="4166222"/>
-            <wp:effectExtent l="0" t="0" r="0" b="6350"/>
-            <wp:wrapSquare wrapText="bothSides"/>
-            <wp:docPr id="1391367714" name="Picture 1" descr="A map of the world&#10;&#10;AI-generated content may be incorrect."/>
-            <wp:cNvGraphicFramePr>
-              <a:graphicFrameLocks xmlns:a="http://schemas.openxmlformats.org/drawingml/2006/main" noChangeAspect="1"/>
-            </wp:cNvGraphicFramePr>
-            <a:graphic xmlns:a="http://schemas.openxmlformats.org/drawingml/2006/main">
-              <a:graphicData uri="http://schemas.openxmlformats.org/drawingml/2006/picture">
-                <pic:pic xmlns:pic="http://schemas.openxmlformats.org/drawingml/2006/picture">
-                  <pic:nvPicPr>
-                    <pic:cNvPr id="1391367714" name="Picture 1" descr="A map of the world&#10;&#10;AI-generated content may be incorrect."/>
-                    <pic:cNvPicPr/>
-                  </pic:nvPicPr>
-                  <pic:blipFill>
-                    <a:blip r:embed="rId9" cstate="print">
-                      <a:extLst>
-                        <a:ext uri="{28A0092B-C50C-407E-A947-70E740481C1C}">
-                          <a14:useLocalDpi xmlns:a14="http://schemas.microsoft.com/office/drawing/2010/main" val="0"/>
-                        </a:ext>
-                      </a:extLst>
-                    </a:blip>
-                    <a:stretch>
-                      <a:fillRect/>
-                    </a:stretch>
-                  </pic:blipFill>
-                  <pic:spPr>
-                    <a:xfrm>
-                      <a:off x="0" y="0"/>
-                      <a:ext cx="3220135" cy="4166222"/>
-                    </a:xfrm>
-                    <a:prstGeom prst="rect">
-                      <a:avLst/>
-                    </a:prstGeom>
-                  </pic:spPr>
-                </pic:pic>
-              </a:graphicData>
-            </a:graphic>
-          </wp:anchor>
-        </w:drawing>
-      </w:r>
-    </w:p>
-    <w:p>
-      <w:pPr>
-        <w:rPr>
-          <w:rFonts w:ascii="Garamond" w:hAnsi="Garamond"/>
-          <w:sz w:val="22"/>
-          <w:szCs w:val="22"/>
-        </w:rPr>
-      </w:pPr>
-    </w:p>
-    <w:p>
-      <w:pPr>
-        <w:rPr>
-          <w:rFonts w:ascii="Garamond" w:hAnsi="Garamond"/>
-          <w:sz w:val="22"/>
-          <w:szCs w:val="22"/>
-        </w:rPr>
-      </w:pPr>
-    </w:p>
-    <w:p>
-      <w:pPr>
-        <w:rPr>
-          <w:rFonts w:ascii="Garamond" w:hAnsi="Garamond"/>
-          <w:sz w:val="22"/>
-          <w:szCs w:val="22"/>
-        </w:rPr>
-      </w:pPr>
-    </w:p>
-    <w:p>
-      <w:pPr>
-        <w:rPr>
-          <w:rFonts w:ascii="Garamond" w:hAnsi="Garamond"/>
-          <w:sz w:val="22"/>
-          <w:szCs w:val="22"/>
-        </w:rPr>
-      </w:pPr>
-    </w:p>
-    <w:p>
-      <w:pPr>
-        <w:rPr>
-          <w:rFonts w:ascii="Garamond" w:hAnsi="Garamond"/>
-          <w:sz w:val="22"/>
-          <w:szCs w:val="22"/>
-        </w:rPr>
-      </w:pPr>
-    </w:p>
-    <w:p>
-      <w:pPr>
-        <w:rPr>
-          <w:rFonts w:ascii="Garamond" w:hAnsi="Garamond"/>
-          <w:sz w:val="22"/>
-          <w:szCs w:val="22"/>
-        </w:rPr>
-      </w:pPr>
-    </w:p>
-    <w:p>
-      <w:pPr>
-        <w:rPr>
-          <w:rFonts w:ascii="Garamond" w:hAnsi="Garamond"/>
-          <w:sz w:val="22"/>
-          <w:szCs w:val="22"/>
-        </w:rPr>
-      </w:pPr>
-    </w:p>
-    <w:p>
-      <w:pPr>
-        <w:rPr>
-          <w:rFonts w:ascii="Garamond" w:hAnsi="Garamond"/>
-          <w:sz w:val="22"/>
-          <w:szCs w:val="22"/>
-        </w:rPr>
-      </w:pPr>
-    </w:p>
-    <w:p>
-      <w:pPr>
-        <w:rPr>
-          <w:rFonts w:ascii="Garamond" w:hAnsi="Garamond"/>
-          <w:sz w:val="22"/>
-          <w:szCs w:val="22"/>
-        </w:rPr>
-      </w:pPr>
-    </w:p>
-    <w:p>
-      <w:pPr>
-        <w:rPr>
-          <w:rFonts w:ascii="Garamond" w:hAnsi="Garamond"/>
-          <w:sz w:val="22"/>
-          <w:szCs w:val="22"/>
-        </w:rPr>
-      </w:pPr>
-    </w:p>
-    <w:p>
-      <w:pPr>
-        <w:rPr>
-          <w:rFonts w:ascii="Garamond" w:hAnsi="Garamond"/>
-          <w:sz w:val="22"/>
-          <w:szCs w:val="22"/>
-        </w:rPr>
-      </w:pPr>
-    </w:p>
-    <w:p>
-      <w:pPr>
-        <w:rPr>
-          <w:rFonts w:ascii="Garamond" w:hAnsi="Garamond"/>
-          <w:sz w:val="22"/>
-          <w:szCs w:val="22"/>
-        </w:rPr>
-      </w:pPr>
-    </w:p>
-    <w:p>
-      <w:pPr>
-        <w:rPr>
-          <w:rFonts w:ascii="Garamond" w:hAnsi="Garamond"/>
-          <w:b/>
-          <w:bCs/>
-          <w:sz w:val="22"/>
-          <w:szCs w:val="22"/>
-        </w:rPr>
-      </w:pPr>
-    </w:p>
-    <w:p>
-      <w:pPr>
         <w:tabs>
           <w:tab w:val="left" w:pos="2621"/>
         </w:tabs>
@@ -397,213 +455,6 @@
           <w:sz w:val="22"/>
           <w:szCs w:val="22"/>
         </w:rPr>
-        <w:lastRenderedPageBreak/>
-        <w:tab/>
-      </w:r>
-      <w:r>
-        <w:rPr>
-          <w:noProof/>
-        </w:rPr>
-        <w:drawing>
-          <wp:inline distT="0" distB="0" distL="0" distR="0" wp14:anchorId="1F2D0ED8" wp14:editId="4129C1ED">
-            <wp:extent cx="5943600" cy="7689850"/>
-            <wp:effectExtent l="0" t="0" r="0" b="6350"/>
-            <wp:docPr id="48893318" name="Picture 1" descr="A map of the world with red veins&#10;&#10;AI-generated content may be incorrect."/>
-            <wp:cNvGraphicFramePr>
-              <a:graphicFrameLocks xmlns:a="http://schemas.openxmlformats.org/drawingml/2006/main" noChangeAspect="1"/>
-            </wp:cNvGraphicFramePr>
-            <a:graphic xmlns:a="http://schemas.openxmlformats.org/drawingml/2006/main">
-              <a:graphicData uri="http://schemas.openxmlformats.org/drawingml/2006/picture">
-                <pic:pic xmlns:pic="http://schemas.openxmlformats.org/drawingml/2006/picture">
-                  <pic:nvPicPr>
-                    <pic:cNvPr id="48893318" name="Picture 1" descr="A map of the world with red veins&#10;&#10;AI-generated content may be incorrect."/>
-                    <pic:cNvPicPr/>
-                  </pic:nvPicPr>
-                  <pic:blipFill>
-                    <a:blip r:embed="rId10"/>
-                    <a:stretch>
-                      <a:fillRect/>
-                    </a:stretch>
-                  </pic:blipFill>
-                  <pic:spPr>
-                    <a:xfrm>
-                      <a:off x="0" y="0"/>
-                      <a:ext cx="5943600" cy="7689850"/>
-                    </a:xfrm>
-                    <a:prstGeom prst="rect">
-                      <a:avLst/>
-                    </a:prstGeom>
-                  </pic:spPr>
-                </pic:pic>
-              </a:graphicData>
-            </a:graphic>
-          </wp:inline>
-        </w:drawing>
-      </w:r>
-      <w:r>
-        <w:rPr>
-          <w:noProof/>
-        </w:rPr>
-        <w:lastRenderedPageBreak/>
-        <w:drawing>
-          <wp:inline distT="0" distB="0" distL="0" distR="0" wp14:anchorId="364971C7" wp14:editId="26FD0349">
-            <wp:extent cx="5943600" cy="7689850"/>
-            <wp:effectExtent l="0" t="0" r="0" b="6350"/>
-            <wp:docPr id="305299523" name="Picture 1" descr="A map of the world&#10;&#10;AI-generated content may be incorrect."/>
-            <wp:cNvGraphicFramePr>
-              <a:graphicFrameLocks xmlns:a="http://schemas.openxmlformats.org/drawingml/2006/main" noChangeAspect="1"/>
-            </wp:cNvGraphicFramePr>
-            <a:graphic xmlns:a="http://schemas.openxmlformats.org/drawingml/2006/main">
-              <a:graphicData uri="http://schemas.openxmlformats.org/drawingml/2006/picture">
-                <pic:pic xmlns:pic="http://schemas.openxmlformats.org/drawingml/2006/picture">
-                  <pic:nvPicPr>
-                    <pic:cNvPr id="305299523" name="Picture 1" descr="A map of the world&#10;&#10;AI-generated content may be incorrect."/>
-                    <pic:cNvPicPr/>
-                  </pic:nvPicPr>
-                  <pic:blipFill>
-                    <a:blip r:embed="rId11"/>
-                    <a:stretch>
-                      <a:fillRect/>
-                    </a:stretch>
-                  </pic:blipFill>
-                  <pic:spPr>
-                    <a:xfrm>
-                      <a:off x="0" y="0"/>
-                      <a:ext cx="5943600" cy="7689850"/>
-                    </a:xfrm>
-                    <a:prstGeom prst="rect">
-                      <a:avLst/>
-                    </a:prstGeom>
-                  </pic:spPr>
-                </pic:pic>
-              </a:graphicData>
-            </a:graphic>
-          </wp:inline>
-        </w:drawing>
-      </w:r>
-      <w:r>
-        <w:rPr>
-          <w:noProof/>
-        </w:rPr>
-        <w:lastRenderedPageBreak/>
-        <w:drawing>
-          <wp:inline distT="0" distB="0" distL="0" distR="0" wp14:anchorId="139FCB05" wp14:editId="36384554">
-            <wp:extent cx="5943600" cy="7689850"/>
-            <wp:effectExtent l="0" t="0" r="0" b="6350"/>
-            <wp:docPr id="992401652" name="Picture 1" descr="A map of the world&#10;&#10;AI-generated content may be incorrect."/>
-            <wp:cNvGraphicFramePr>
-              <a:graphicFrameLocks xmlns:a="http://schemas.openxmlformats.org/drawingml/2006/main" noChangeAspect="1"/>
-            </wp:cNvGraphicFramePr>
-            <a:graphic xmlns:a="http://schemas.openxmlformats.org/drawingml/2006/main">
-              <a:graphicData uri="http://schemas.openxmlformats.org/drawingml/2006/picture">
-                <pic:pic xmlns:pic="http://schemas.openxmlformats.org/drawingml/2006/picture">
-                  <pic:nvPicPr>
-                    <pic:cNvPr id="992401652" name="Picture 1" descr="A map of the world&#10;&#10;AI-generated content may be incorrect."/>
-                    <pic:cNvPicPr/>
-                  </pic:nvPicPr>
-                  <pic:blipFill>
-                    <a:blip r:embed="rId12"/>
-                    <a:stretch>
-                      <a:fillRect/>
-                    </a:stretch>
-                  </pic:blipFill>
-                  <pic:spPr>
-                    <a:xfrm>
-                      <a:off x="0" y="0"/>
-                      <a:ext cx="5943600" cy="7689850"/>
-                    </a:xfrm>
-                    <a:prstGeom prst="rect">
-                      <a:avLst/>
-                    </a:prstGeom>
-                  </pic:spPr>
-                </pic:pic>
-              </a:graphicData>
-            </a:graphic>
-          </wp:inline>
-        </w:drawing>
-      </w:r>
-      <w:r>
-        <w:rPr>
-          <w:rFonts w:ascii="Garamond" w:hAnsi="Garamond"/>
-          <w:b/>
-          <w:bCs/>
-          <w:sz w:val="22"/>
-          <w:szCs w:val="22"/>
-        </w:rPr>
-        <w:br w:type="textWrapping" w:clear="all"/>
-      </w:r>
-    </w:p>
-    <w:p>
-      <w:pPr>
-        <w:rPr>
-          <w:rFonts w:ascii="Garamond" w:hAnsi="Garamond"/>
-          <w:b/>
-          <w:bCs/>
-          <w:sz w:val="22"/>
-          <w:szCs w:val="22"/>
-        </w:rPr>
-      </w:pPr>
-    </w:p>
-    <w:p>
-      <w:pPr>
-        <w:rPr>
-          <w:rFonts w:ascii="Garamond" w:hAnsi="Garamond"/>
-          <w:b/>
-          <w:bCs/>
-          <w:sz w:val="22"/>
-          <w:szCs w:val="22"/>
-        </w:rPr>
-      </w:pPr>
-    </w:p>
-    <w:p>
-      <w:pPr>
-        <w:rPr>
-          <w:rFonts w:ascii="Garamond" w:hAnsi="Garamond"/>
-          <w:b/>
-          <w:bCs/>
-          <w:sz w:val="22"/>
-          <w:szCs w:val="22"/>
-        </w:rPr>
-      </w:pPr>
-    </w:p>
-    <w:p>
-      <w:pPr>
-        <w:rPr>
-          <w:rFonts w:ascii="Garamond" w:hAnsi="Garamond"/>
-          <w:b/>
-          <w:bCs/>
-          <w:sz w:val="22"/>
-          <w:szCs w:val="22"/>
-        </w:rPr>
-      </w:pPr>
-    </w:p>
-    <w:p>
-      <w:pPr>
-        <w:rPr>
-          <w:rFonts w:ascii="Garamond" w:hAnsi="Garamond"/>
-          <w:b/>
-          <w:bCs/>
-          <w:sz w:val="22"/>
-          <w:szCs w:val="22"/>
-        </w:rPr>
-      </w:pPr>
-    </w:p>
-    <w:p>
-      <w:pPr>
-        <w:rPr>
-          <w:rFonts w:ascii="Garamond" w:hAnsi="Garamond"/>
-          <w:sz w:val="22"/>
-          <w:szCs w:val="22"/>
-        </w:rPr>
-      </w:pPr>
-      <w:r>
-        <w:rPr>
-          <w:rFonts w:ascii="Garamond" w:hAnsi="Garamond"/>
-          <w:b/>
-          <w:bCs/>
-          <w:sz w:val="22"/>
-          <w:szCs w:val="22"/>
-        </w:rPr>
         <w:t>Figure 3</w:t>
       </w:r>
       <w:r>
@@ -661,7 +512,6 @@
           <w:sz w:val="16"/>
           <w:szCs w:val="16"/>
         </w:rPr>
-        <w:lastRenderedPageBreak/>
         <w:drawing>
           <wp:inline distT="0" distB="0" distL="0" distR="0" wp14:anchorId="7B64ADF7" wp14:editId="0ADAE1D4">
             <wp:extent cx="5502729" cy="6878412"/>
@@ -678,7 +528,7 @@
                     <pic:cNvPicPr/>
                   </pic:nvPicPr>
                   <pic:blipFill>
-                    <a:blip r:embed="rId17" cstate="print">
+                    <a:blip r:embed="rId13" cstate="print">
                       <a:extLst>
                         <a:ext uri="{28A0092B-C50C-407E-A947-70E740481C1C}">
                           <a14:useLocalDpi xmlns:a14="http://schemas.microsoft.com/office/drawing/2010/main" val="0"/>
@@ -746,7 +596,7 @@
                     <pic:cNvPicPr/>
                   </pic:nvPicPr>
                   <pic:blipFill>
-                    <a:blip r:embed="rId18" cstate="print">
+                    <a:blip r:embed="rId14" cstate="print">
                       <a:extLst>
                         <a:ext uri="{28A0092B-C50C-407E-A947-70E740481C1C}">
                           <a14:useLocalDpi xmlns:a14="http://schemas.microsoft.com/office/drawing/2010/main" val="0"/>
@@ -805,7 +655,25 @@
           <w:sz w:val="22"/>
           <w:szCs w:val="22"/>
         </w:rPr>
-        <w:t xml:space="preserve">Range and mean number of days from the beginning fo the run to 50% of total returns by stock. The width of the bar represents the range of values, whereas the black vertical line represents the mean. Bars are colored by their watershed position, with upstream stocks in Red and downstream stocks in blue. </w:t>
+        <w:t xml:space="preserve">Range and mean number of days from the beginning </w:t>
+      </w:r>
+      <w:proofErr w:type="spellStart"/>
+      <w:r>
+        <w:rPr>
+          <w:rFonts w:ascii="Garamond" w:hAnsi="Garamond"/>
+          <w:sz w:val="22"/>
+          <w:szCs w:val="22"/>
+        </w:rPr>
+        <w:t>fo</w:t>
+      </w:r>
+      <w:proofErr w:type="spellEnd"/>
+      <w:r>
+        <w:rPr>
+          <w:rFonts w:ascii="Garamond" w:hAnsi="Garamond"/>
+          <w:sz w:val="22"/>
+          <w:szCs w:val="22"/>
+        </w:rPr>
+        <w:t xml:space="preserve"> the run to 50% of total returns by stock. The width of the bar represents the range of values, whereas the black vertical line represents the mean. Bars are colored by their watershed position, with upstream stocks in Red and downstream stocks in blue. </w:t>
       </w:r>
     </w:p>
     <w:p/>
@@ -832,7 +700,7 @@
                     <pic:cNvPicPr/>
                   </pic:nvPicPr>
                   <pic:blipFill rotWithShape="1">
-                    <a:blip r:embed="rId19" cstate="print">
+                    <a:blip r:embed="rId15" cstate="print">
                       <a:extLst>
                         <a:ext uri="{28A0092B-C50C-407E-A947-70E740481C1C}">
                           <a14:useLocalDpi xmlns:a14="http://schemas.microsoft.com/office/drawing/2010/main" val="0"/>

</xml_diff>

<commit_message>
updated figures, sending to tim
</commit_message>
<xml_diff>
--- a/Docs/Figures_RunTimingManuscript.docx
+++ b/Docs/Figures_RunTimingManuscript.docx
@@ -24,7 +24,7 @@
                     <pic:cNvPicPr/>
                   </pic:nvPicPr>
                   <pic:blipFill>
-                    <a:blip r:embed="rId6"/>
+                    <a:blip r:embed="rId7"/>
                     <a:stretch>
                       <a:fillRect/>
                     </a:stretch>
@@ -46,6 +46,13 @@
       </w:r>
     </w:p>
     <w:p>
+      <w:pPr>
+        <w:rPr>
+          <w:rFonts w:ascii="Garamond" w:hAnsi="Garamond"/>
+          <w:sz w:val="22"/>
+          <w:szCs w:val="22"/>
+        </w:rPr>
+      </w:pPr>
       <w:r>
         <w:rPr>
           <w:rFonts w:ascii="Garamond" w:hAnsi="Garamond"/>
@@ -81,10 +88,73 @@
           <w:sz w:val="22"/>
           <w:szCs w:val="22"/>
         </w:rPr>
-        <w:t xml:space="preserve"> of the Kuskokwim River basin (will insert bounding box coordinates) displaying the spatial variation in modeled Sr87/Sr86 ratios. Ratios range from .7042 to .7107, with a general trend towards more enriched values at the top of the watershed.</w:t>
-      </w:r>
-      <w:r>
+        <w:t xml:space="preserve"> of the Kuskokwim River basin displaying the spatial variation in modeled </w:t>
+      </w:r>
+      <w:r>
+        <w:rPr>
+          <w:rFonts w:ascii="Garamond" w:eastAsia="Times New Roman" w:hAnsi="Garamond" w:cs="Times New Roman"/>
+          <w:kern w:val="0"/>
+          <w14:ligatures w14:val="none"/>
+        </w:rPr>
+        <w:t>Sr</w:t>
+      </w:r>
+      <w:r>
+        <w:rPr>
+          <w:rFonts w:ascii="Garamond" w:eastAsia="Times New Roman" w:hAnsi="Garamond" w:cs="Times New Roman"/>
+          <w:kern w:val="0"/>
+          <w:vertAlign w:val="superscript"/>
+          <w14:ligatures w14:val="none"/>
+        </w:rPr>
+        <w:t>87</w:t>
+      </w:r>
+      <w:r>
+        <w:rPr>
+          <w:rFonts w:ascii="Garamond" w:eastAsia="Times New Roman" w:hAnsi="Garamond" w:cs="Times New Roman"/>
+          <w:kern w:val="0"/>
+          <w14:ligatures w14:val="none"/>
+        </w:rPr>
+        <w:t>/Sr</w:t>
+      </w:r>
+      <w:r>
+        <w:rPr>
+          <w:rFonts w:ascii="Garamond" w:eastAsia="Times New Roman" w:hAnsi="Garamond" w:cs="Times New Roman"/>
+          <w:kern w:val="0"/>
+          <w:vertAlign w:val="superscript"/>
+          <w14:ligatures w14:val="none"/>
+        </w:rPr>
+        <w:t>86</w:t>
+      </w:r>
+      <w:r>
+        <w:rPr>
+          <w:rFonts w:ascii="Garamond" w:eastAsia="Times New Roman" w:hAnsi="Garamond" w:cs="Times New Roman"/>
+          <w:kern w:val="0"/>
+          <w14:ligatures w14:val="none"/>
+        </w:rPr>
         <w:t xml:space="preserve"> </w:t>
+      </w:r>
+      <w:r>
+        <w:rPr>
+          <w:rFonts w:ascii="Garamond" w:hAnsi="Garamond"/>
+          <w:sz w:val="22"/>
+          <w:szCs w:val="22"/>
+        </w:rPr>
+        <w:t xml:space="preserve">ratios. </w:t>
+      </w:r>
+      <w:r>
+        <w:rPr>
+          <w:rFonts w:ascii="Garamond" w:hAnsi="Garamond"/>
+          <w:sz w:val="22"/>
+          <w:szCs w:val="22"/>
+        </w:rPr>
+        <w:t xml:space="preserve">Darker colors indicate lower relative isotope ratios whereas lighter colors indicate more enriched values. Isotope ratios across the basin range from </w:t>
+      </w:r>
+      <w:r>
+        <w:rPr>
+          <w:rFonts w:ascii="Garamond" w:hAnsi="Garamond"/>
+          <w:sz w:val="22"/>
+          <w:szCs w:val="22"/>
+        </w:rPr>
+        <w:t>.7042 to .7107, with a general trend towards more enriched values at the top of the watershed.</w:t>
       </w:r>
     </w:p>
     <w:p/>
@@ -116,7 +186,7 @@
                     <pic:cNvPicPr/>
                   </pic:nvPicPr>
                   <pic:blipFill>
-                    <a:blip r:embed="rId7"/>
+                    <a:blip r:embed="rId8"/>
                     <a:stretch>
                       <a:fillRect/>
                     </a:stretch>
@@ -155,7 +225,13 @@
         <w:rPr>
           <w:rFonts w:ascii="Garamond" w:hAnsi="Garamond"/>
         </w:rPr>
-        <w:t xml:space="preserve"> Tributaries included in each management unit, derived by selecting the upstream reaches of several identified rivers of management interest to the Alaska Department of Fish and Game. Several manually selected units were added to reach full coverage of the basin. </w:t>
+        <w:t xml:space="preserve"> Tributaries included in each management unit, derived by selecting the upstream reaches of several identified rivers of management interest </w:t>
+      </w:r>
+      <w:r>
+        <w:rPr>
+          <w:rFonts w:ascii="Garamond" w:hAnsi="Garamond"/>
+        </w:rPr>
+        <w:t xml:space="preserve">and manually selected units of similar size. </w:t>
       </w:r>
     </w:p>
     <w:p/>
@@ -190,8 +266,194 @@
         <w:rPr>
           <w:noProof/>
         </w:rPr>
+        <mc:AlternateContent>
+          <mc:Choice Requires="wps">
+            <w:drawing>
+              <wp:anchor distT="0" distB="0" distL="114300" distR="114300" simplePos="0" relativeHeight="251661312" behindDoc="0" locked="0" layoutInCell="1" allowOverlap="1" wp14:anchorId="74729EC9" wp14:editId="1FC1BB8E">
+                <wp:simplePos x="0" y="0"/>
+                <wp:positionH relativeFrom="column">
+                  <wp:posOffset>-506004</wp:posOffset>
+                </wp:positionH>
+                <wp:positionV relativeFrom="paragraph">
+                  <wp:posOffset>2517140</wp:posOffset>
+                </wp:positionV>
+                <wp:extent cx="555171" cy="440872"/>
+                <wp:effectExtent l="0" t="0" r="3810" b="3810"/>
+                <wp:wrapNone/>
+                <wp:docPr id="1224368575" name="Text Box 1"/>
+                <wp:cNvGraphicFramePr/>
+                <a:graphic xmlns:a="http://schemas.openxmlformats.org/drawingml/2006/main">
+                  <a:graphicData uri="http://schemas.microsoft.com/office/word/2010/wordprocessingShape">
+                    <wps:wsp>
+                      <wps:cNvSpPr txBox="1"/>
+                      <wps:spPr>
+                        <a:xfrm>
+                          <a:off x="0" y="0"/>
+                          <a:ext cx="555171" cy="440872"/>
+                        </a:xfrm>
+                        <a:prstGeom prst="rect">
+                          <a:avLst/>
+                        </a:prstGeom>
+                        <a:solidFill>
+                          <a:schemeClr val="lt1"/>
+                        </a:solidFill>
+                        <a:ln w="6350">
+                          <a:noFill/>
+                        </a:ln>
+                      </wps:spPr>
+                      <wps:txbx>
+                        <w:txbxContent>
+                          <w:p>
+                            <w:pPr>
+                              <w:pStyle w:val="ListParagraph"/>
+                              <w:numPr>
+                                <w:ilvl w:val="0"/>
+                                <w:numId w:val="1"/>
+                              </w:numPr>
+                            </w:pPr>
+                          </w:p>
+                        </w:txbxContent>
+                      </wps:txbx>
+                      <wps:bodyPr rot="0" spcFirstLastPara="0" vertOverflow="overflow" horzOverflow="overflow" vert="horz" wrap="square" lIns="91440" tIns="45720" rIns="91440" bIns="45720" numCol="1" spcCol="0" rtlCol="0" fromWordArt="0" anchor="t" anchorCtr="0" forceAA="0" compatLnSpc="1">
+                        <a:prstTxWarp prst="textNoShape">
+                          <a:avLst/>
+                        </a:prstTxWarp>
+                        <a:noAutofit/>
+                      </wps:bodyPr>
+                    </wps:wsp>
+                  </a:graphicData>
+                </a:graphic>
+                <wp14:sizeRelH relativeFrom="margin">
+                  <wp14:pctWidth>0</wp14:pctWidth>
+                </wp14:sizeRelH>
+                <wp14:sizeRelV relativeFrom="margin">
+                  <wp14:pctHeight>0</wp14:pctHeight>
+                </wp14:sizeRelV>
+              </wp:anchor>
+            </w:drawing>
+          </mc:Choice>
+          <mc:Fallback>
+            <w:pict>
+              <v:shapetype w14:anchorId="74729EC9" id="_x0000_t202" coordsize="21600,21600" o:spt="202" path="m,l,21600r21600,l21600,xe">
+                <v:stroke joinstyle="miter"/>
+                <v:path gradientshapeok="t" o:connecttype="rect"/>
+              </v:shapetype>
+              <v:shape id="Text Box 1" o:spid="_x0000_s1026" type="#_x0000_t202" style="position:absolute;margin-left:-39.85pt;margin-top:198.2pt;width:43.7pt;height:34.7pt;z-index:251661312;visibility:visible;mso-wrap-style:square;mso-width-percent:0;mso-height-percent:0;mso-wrap-distance-left:9pt;mso-wrap-distance-top:0;mso-wrap-distance-right:9pt;mso-wrap-distance-bottom:0;mso-position-horizontal:absolute;mso-position-horizontal-relative:text;mso-position-vertical:absolute;mso-position-vertical-relative:text;mso-width-percent:0;mso-height-percent:0;mso-width-relative:margin;mso-height-relative:margin;v-text-anchor:top" o:gfxdata="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" fillcolor="white [3201]" stroked="f" strokeweight=".5pt">
+                <v:textbox>
+                  <w:txbxContent>
+                    <w:p>
+                      <w:pPr>
+                        <w:pStyle w:val="ListParagraph"/>
+                        <w:numPr>
+                          <w:ilvl w:val="0"/>
+                          <w:numId w:val="1"/>
+                        </w:numPr>
+                      </w:pPr>
+                    </w:p>
+                  </w:txbxContent>
+                </v:textbox>
+              </v:shape>
+            </w:pict>
+          </mc:Fallback>
+        </mc:AlternateContent>
+      </w:r>
+      <w:r>
+        <w:rPr>
+          <w:noProof/>
+        </w:rPr>
+        <mc:AlternateContent>
+          <mc:Choice Requires="wps">
+            <w:drawing>
+              <wp:anchor distT="0" distB="0" distL="114300" distR="114300" simplePos="0" relativeHeight="251659264" behindDoc="0" locked="0" layoutInCell="1" allowOverlap="1" wp14:anchorId="2A3EF166" wp14:editId="7B2BBFD1">
+                <wp:simplePos x="0" y="0"/>
+                <wp:positionH relativeFrom="column">
+                  <wp:posOffset>-465183</wp:posOffset>
+                </wp:positionH>
+                <wp:positionV relativeFrom="paragraph">
+                  <wp:posOffset>1127760</wp:posOffset>
+                </wp:positionV>
+                <wp:extent cx="555171" cy="440872"/>
+                <wp:effectExtent l="0" t="0" r="3810" b="3810"/>
+                <wp:wrapNone/>
+                <wp:docPr id="249703434" name="Text Box 1"/>
+                <wp:cNvGraphicFramePr/>
+                <a:graphic xmlns:a="http://schemas.openxmlformats.org/drawingml/2006/main">
+                  <a:graphicData uri="http://schemas.microsoft.com/office/word/2010/wordprocessingShape">
+                    <wps:wsp>
+                      <wps:cNvSpPr txBox="1"/>
+                      <wps:spPr>
+                        <a:xfrm>
+                          <a:off x="0" y="0"/>
+                          <a:ext cx="555171" cy="440872"/>
+                        </a:xfrm>
+                        <a:prstGeom prst="rect">
+                          <a:avLst/>
+                        </a:prstGeom>
+                        <a:solidFill>
+                          <a:schemeClr val="lt1"/>
+                        </a:solidFill>
+                        <a:ln w="6350">
+                          <a:noFill/>
+                        </a:ln>
+                      </wps:spPr>
+                      <wps:txbx>
+                        <w:txbxContent>
+                          <w:p>
+                            <w:pPr>
+                              <w:pStyle w:val="ListParagraph"/>
+                              <w:numPr>
+                                <w:ilvl w:val="0"/>
+                                <w:numId w:val="1"/>
+                              </w:numPr>
+                            </w:pPr>
+                          </w:p>
+                        </w:txbxContent>
+                      </wps:txbx>
+                      <wps:bodyPr rot="0" spcFirstLastPara="0" vertOverflow="overflow" horzOverflow="overflow" vert="horz" wrap="square" lIns="91440" tIns="45720" rIns="91440" bIns="45720" numCol="1" spcCol="0" rtlCol="0" fromWordArt="0" anchor="t" anchorCtr="0" forceAA="0" compatLnSpc="1">
+                        <a:prstTxWarp prst="textNoShape">
+                          <a:avLst/>
+                        </a:prstTxWarp>
+                        <a:noAutofit/>
+                      </wps:bodyPr>
+                    </wps:wsp>
+                  </a:graphicData>
+                </a:graphic>
+                <wp14:sizeRelH relativeFrom="margin">
+                  <wp14:pctWidth>0</wp14:pctWidth>
+                </wp14:sizeRelH>
+                <wp14:sizeRelV relativeFrom="margin">
+                  <wp14:pctHeight>0</wp14:pctHeight>
+                </wp14:sizeRelV>
+              </wp:anchor>
+            </w:drawing>
+          </mc:Choice>
+          <mc:Fallback>
+            <w:pict>
+              <v:shape w14:anchorId="2A3EF166" id="_x0000_s1027" type="#_x0000_t202" style="position:absolute;margin-left:-36.65pt;margin-top:88.8pt;width:43.7pt;height:34.7pt;z-index:251659264;visibility:visible;mso-wrap-style:square;mso-width-percent:0;mso-height-percent:0;mso-wrap-distance-left:9pt;mso-wrap-distance-top:0;mso-wrap-distance-right:9pt;mso-wrap-distance-bottom:0;mso-position-horizontal:absolute;mso-position-horizontal-relative:text;mso-position-vertical:absolute;mso-position-vertical-relative:text;mso-width-percent:0;mso-height-percent:0;mso-width-relative:margin;mso-height-relative:margin;v-text-anchor:top" o:gfxdata="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" fillcolor="white [3201]" stroked="f" strokeweight=".5pt">
+                <v:textbox>
+                  <w:txbxContent>
+                    <w:p>
+                      <w:pPr>
+                        <w:pStyle w:val="ListParagraph"/>
+                        <w:numPr>
+                          <w:ilvl w:val="0"/>
+                          <w:numId w:val="1"/>
+                        </w:numPr>
+                      </w:pPr>
+                    </w:p>
+                  </w:txbxContent>
+                </v:textbox>
+              </v:shape>
+            </w:pict>
+          </mc:Fallback>
+        </mc:AlternateContent>
+      </w:r>
+      <w:r>
+        <w:rPr>
+          <w:noProof/>
+        </w:rPr>
         <w:drawing>
-          <wp:inline distT="0" distB="0" distL="0" distR="0" wp14:anchorId="34888FD1" wp14:editId="1D461E74">
+          <wp:inline distT="0" distB="0" distL="0" distR="0" wp14:anchorId="34888FD1" wp14:editId="378C0AA0">
             <wp:extent cx="6288103" cy="2955139"/>
             <wp:effectExtent l="0" t="0" r="0" b="0"/>
             <wp:docPr id="739570781" name="Picture 2"/>
@@ -208,7 +470,7 @@
                     </pic:cNvPicPr>
                   </pic:nvPicPr>
                   <pic:blipFill rotWithShape="1">
-                    <a:blip r:embed="rId8" cstate="print">
+                    <a:blip r:embed="rId9" cstate="print">
                       <a:extLst>
                         <a:ext uri="{28A0092B-C50C-407E-A947-70E740481C1C}">
                           <a14:useLocalDpi xmlns:a14="http://schemas.microsoft.com/office/drawing/2010/main" val="0"/>
@@ -244,12 +506,7 @@
           </wp:inline>
         </w:drawing>
       </w:r>
-    </w:p>
-    <w:p>
-      <w:pPr>
-        <w:tabs>
-          <w:tab w:val="left" w:pos="2621"/>
-        </w:tabs>
+      <w:r>
         <w:rPr>
           <w:rFonts w:ascii="Garamond" w:hAnsi="Garamond"/>
           <w:b/>
@@ -257,15 +514,6 @@
           <w:sz w:val="22"/>
           <w:szCs w:val="22"/>
         </w:rPr>
-      </w:pPr>
-      <w:r>
-        <w:rPr>
-          <w:rFonts w:ascii="Garamond" w:hAnsi="Garamond"/>
-          <w:b/>
-          <w:bCs/>
-          <w:sz w:val="22"/>
-          <w:szCs w:val="22"/>
-        </w:rPr>
         <w:t>Figure 3</w:t>
       </w:r>
       <w:r>
@@ -274,7 +522,39 @@
           <w:sz w:val="22"/>
           <w:szCs w:val="22"/>
         </w:rPr>
-        <w:t xml:space="preserve">: a) Mean contribution of management units for each seasonal quartile of the salmon run. Tributaries with darker colors (closer to red) indicate relatively higher mean proportional contribution to quartile returns. B) boxplots illustrating the range in mean values across all years of the dataset. </w:t>
+        <w:t xml:space="preserve">: </w:t>
+      </w:r>
+      <w:r>
+        <w:rPr>
+          <w:rFonts w:ascii="Garamond" w:hAnsi="Garamond"/>
+          <w:sz w:val="22"/>
+          <w:szCs w:val="22"/>
+        </w:rPr>
+        <w:t>A</w:t>
+      </w:r>
+      <w:r>
+        <w:rPr>
+          <w:rFonts w:ascii="Garamond" w:hAnsi="Garamond"/>
+          <w:sz w:val="22"/>
+          <w:szCs w:val="22"/>
+        </w:rPr>
+        <w:t>) Mean contribution of management units for each seasonal quartile of the salmon run. Tributaries with darker colors (closer to red) indicate relatively higher mean proportional contribution to quartile returns. B) boxplots illustrat</w:t>
+      </w:r>
+      <w:r>
+        <w:rPr>
+          <w:rFonts w:ascii="Garamond" w:hAnsi="Garamond"/>
+          <w:sz w:val="22"/>
+          <w:szCs w:val="22"/>
+        </w:rPr>
+        <w:t>e</w:t>
+      </w:r>
+      <w:r>
+        <w:rPr>
+          <w:rFonts w:ascii="Garamond" w:hAnsi="Garamond"/>
+          <w:sz w:val="22"/>
+          <w:szCs w:val="22"/>
+        </w:rPr>
+        <w:t xml:space="preserve"> the range in mean values across all years of the dataset. </w:t>
       </w:r>
     </w:p>
     <w:p/>
@@ -338,7 +618,7 @@
                     <pic:cNvPicPr/>
                   </pic:nvPicPr>
                   <pic:blipFill>
-                    <a:blip r:embed="rId13" cstate="print">
+                    <a:blip r:embed="rId14" cstate="print">
                       <a:extLst>
                         <a:ext uri="{28A0092B-C50C-407E-A947-70E740481C1C}">
                           <a14:useLocalDpi xmlns:a14="http://schemas.microsoft.com/office/drawing/2010/main" val="0"/>
@@ -413,7 +693,7 @@
                     <pic:cNvPicPr/>
                   </pic:nvPicPr>
                   <pic:blipFill rotWithShape="1">
-                    <a:blip r:embed="rId14" cstate="print">
+                    <a:blip r:embed="rId15" cstate="print">
                       <a:extLst>
                         <a:ext uri="{28A0092B-C50C-407E-A947-70E740481C1C}">
                           <a14:useLocalDpi xmlns:a14="http://schemas.microsoft.com/office/drawing/2010/main" val="0"/>
@@ -483,23 +763,61 @@
         </w:rPr>
         <w:t xml:space="preserve">Range and mean number of days from the beginning </w:t>
       </w:r>
-      <w:proofErr w:type="spellStart"/>
-      <w:r>
-        <w:rPr>
-          <w:rFonts w:ascii="Garamond" w:hAnsi="Garamond"/>
-          <w:sz w:val="22"/>
-          <w:szCs w:val="22"/>
-        </w:rPr>
-        <w:t>fo</w:t>
-      </w:r>
-      <w:proofErr w:type="spellEnd"/>
-      <w:r>
-        <w:rPr>
-          <w:rFonts w:ascii="Garamond" w:hAnsi="Garamond"/>
-          <w:sz w:val="22"/>
-          <w:szCs w:val="22"/>
-        </w:rPr>
-        <w:t xml:space="preserve"> the run to 50% of total returns by stock. The width of the bar represents the range of values, whereas the black vertical line represents the mean. Bars are colored by their watershed position, with upstream stocks in Red and downstream stocks in blue. </w:t>
+      <w:r>
+        <w:rPr>
+          <w:rFonts w:ascii="Garamond" w:hAnsi="Garamond"/>
+          <w:sz w:val="22"/>
+          <w:szCs w:val="22"/>
+        </w:rPr>
+        <w:t>of</w:t>
+      </w:r>
+      <w:r>
+        <w:rPr>
+          <w:rFonts w:ascii="Garamond" w:hAnsi="Garamond"/>
+          <w:sz w:val="22"/>
+          <w:szCs w:val="22"/>
+        </w:rPr>
+        <w:t xml:space="preserve"> the run to 50% of total returns by stock. The width of the bar represents the range of </w:t>
+      </w:r>
+      <w:r>
+        <w:rPr>
+          <w:rFonts w:ascii="Garamond" w:hAnsi="Garamond"/>
+          <w:sz w:val="22"/>
+          <w:szCs w:val="22"/>
+        </w:rPr>
+        <w:t>values,</w:t>
+      </w:r>
+      <w:r>
+        <w:rPr>
+          <w:rFonts w:ascii="Garamond" w:hAnsi="Garamond"/>
+          <w:sz w:val="22"/>
+          <w:szCs w:val="22"/>
+        </w:rPr>
+        <w:t xml:space="preserve"> and</w:t>
+      </w:r>
+      <w:r>
+        <w:rPr>
+          <w:rFonts w:ascii="Garamond" w:hAnsi="Garamond"/>
+          <w:sz w:val="22"/>
+          <w:szCs w:val="22"/>
+        </w:rPr>
+        <w:t xml:space="preserve"> the black vertical line represents the mean. Bars are colored by their watershed position, with upstream stocks in </w:t>
+      </w:r>
+      <w:r>
+        <w:rPr>
+          <w:rFonts w:ascii="Garamond" w:hAnsi="Garamond"/>
+          <w:sz w:val="22"/>
+          <w:szCs w:val="22"/>
+        </w:rPr>
+        <w:t>r</w:t>
+      </w:r>
+      <w:r>
+        <w:rPr>
+          <w:rFonts w:ascii="Garamond" w:hAnsi="Garamond"/>
+          <w:sz w:val="22"/>
+          <w:szCs w:val="22"/>
+        </w:rPr>
+        <w:t xml:space="preserve">ed and downstream stocks in blue. </w:t>
       </w:r>
     </w:p>
     <w:p/>
@@ -526,7 +844,7 @@
                     <pic:cNvPicPr/>
                   </pic:nvPicPr>
                   <pic:blipFill rotWithShape="1">
-                    <a:blip r:embed="rId15" cstate="print">
+                    <a:blip r:embed="rId16" cstate="print">
                       <a:extLst>
                         <a:ext uri="{28A0092B-C50C-407E-A947-70E740481C1C}">
                           <a14:useLocalDpi xmlns:a14="http://schemas.microsoft.com/office/drawing/2010/main" val="0"/>
@@ -593,7 +911,31 @@
           <w:sz w:val="22"/>
           <w:szCs w:val="22"/>
         </w:rPr>
-        <w:t xml:space="preserve">. White circles indicate the mean, whereas violin plots illustrate the range of values across all years by stock. </w:t>
+        <w:t>. White circles indicate the mean</w:t>
+      </w:r>
+      <w:r>
+        <w:rPr>
+          <w:rFonts w:ascii="Garamond" w:hAnsi="Garamond"/>
+          <w:sz w:val="22"/>
+          <w:szCs w:val="22"/>
+        </w:rPr>
+        <w:t>. Violin plots illustrate the</w:t>
+      </w:r>
+      <w:r>
+        <w:rPr>
+          <w:rFonts w:ascii="Garamond" w:hAnsi="Garamond"/>
+          <w:sz w:val="22"/>
+          <w:szCs w:val="22"/>
+        </w:rPr>
+        <w:t xml:space="preserve"> range of values across all years by stock.</w:t>
+      </w:r>
+      <w:r>
+        <w:rPr>
+          <w:rFonts w:ascii="Garamond" w:hAnsi="Garamond"/>
+          <w:sz w:val="22"/>
+          <w:szCs w:val="22"/>
+        </w:rPr>
+        <w:t xml:space="preserve"> Watershed position is indicated by color with furthest upstream stocks in red and furthest downstream stocks in blue. </w:t>
       </w:r>
     </w:p>
     <w:p/>
@@ -694,6 +1036,103 @@
     </w:p>
   </w:footnote>
 </w:footnotes>
+</file>
+
+<file path=word/numbering.xml><?xml version="1.0" encoding="utf-8"?>
+<w:numbering xmlns:wpc="http://schemas.microsoft.com/office/word/2010/wordprocessingCanvas" xmlns:cx="http://schemas.microsoft.com/office/drawing/2014/chartex" xmlns:cx1="http://schemas.microsoft.com/office/drawing/2015/9/8/chartex" xmlns:cx2="http://schemas.microsoft.com/office/drawing/2015/10/21/chartex" xmlns:cx3="http://schemas.microsoft.com/office/drawing/2016/5/9/chartex" xmlns:cx4="http://schemas.microsoft.com/office/drawing/2016/5/10/chartex" xmlns:cx5="http://schemas.microsoft.com/office/drawing/2016/5/11/chartex" xmlns:cx6="http://schemas.microsoft.com/office/drawing/2016/5/12/chartex" xmlns:cx7="http://schemas.microsoft.com/office/drawing/2016/5/13/chartex" xmlns:cx8="http://schemas.microsoft.com/office/drawing/2016/5/14/chartex" xmlns:mc="http://schemas.openxmlformats.org/markup-compatibility/2006" xmlns:aink="http://schemas.microsoft.com/office/drawing/2016/ink" xmlns:am3d="http://schemas.microsoft.com/office/drawing/2017/model3d" xmlns:o="urn:schemas-microsoft-com:office:office" xmlns:oel="http://schemas.microsoft.com/office/2019/extlst" xmlns:r="http://schemas.openxmlformats.org/officeDocument/2006/relationships" xmlns:m="http://schemas.openxmlformats.org/officeDocument/2006/math" xmlns:v="urn:schemas-microsoft-com:vml" xmlns:wp14="http://schemas.microsoft.com/office/word/2010/wordprocessingDrawing" xmlns:wp="http://schemas.openxmlformats.org/drawingml/2006/wordprocessingDrawing" xmlns:w10="urn:schemas-microsoft-com:office:word" xmlns:w="http://schemas.openxmlformats.org/wordprocessingml/2006/main" xmlns:w14="http://schemas.microsoft.com/office/word/2010/wordml" xmlns:w15="http://schemas.microsoft.com/office/word/2012/wordml" xmlns:w16cex="http://schemas.microsoft.com/office/word/2018/wordml/cex" xmlns:w16cid="http://schemas.microsoft.com/office/word/2016/wordml/cid" xmlns:w16="http://schemas.microsoft.com/office/word/2018/wordml" xmlns:w16du="http://schemas.microsoft.com/office/word/2023/wordml/word16du" xmlns:w16sdtdh="http://schemas.microsoft.com/office/word/2020/wordml/sdtdatahash" xmlns:w16sdtfl="http://schemas.microsoft.com/office/word/2024/wordml/sdtformatlock" xmlns:w16se="http://schemas.microsoft.com/office/word/2015/wordml/symex" xmlns:wpg="http://schemas.microsoft.com/office/word/2010/wordprocessingGroup" xmlns:wpi="http://schemas.microsoft.com/office/word/2010/wordprocessingInk" xmlns:wne="http://schemas.microsoft.com/office/word/2006/wordml" xmlns:wps="http://schemas.microsoft.com/office/word/2010/wordprocessingShape" mc:Ignorable="w14 w15 w16se w16cid w16 w16cex w16sdtdh w16sdtfl w16du wp14">
+  <w:abstractNum w:abstractNumId="0" w15:restartNumberingAfterBreak="0">
+    <w:nsid w:val="706534EE"/>
+    <w:multiLevelType w:val="hybridMultilevel"/>
+    <w:tmpl w:val="FF7A8C1A"/>
+    <w:lvl w:ilvl="0" w:tplc="04090015">
+      <w:start w:val="1"/>
+      <w:numFmt w:val="upperLetter"/>
+      <w:lvlText w:val="%1."/>
+      <w:lvlJc w:val="left"/>
+      <w:pPr>
+        <w:ind w:left="720" w:hanging="360"/>
+      </w:pPr>
+      <w:rPr>
+        <w:rFonts w:hint="default"/>
+      </w:rPr>
+    </w:lvl>
+    <w:lvl w:ilvl="1" w:tplc="04090019" w:tentative="1">
+      <w:start w:val="1"/>
+      <w:numFmt w:val="lowerLetter"/>
+      <w:lvlText w:val="%2."/>
+      <w:lvlJc w:val="left"/>
+      <w:pPr>
+        <w:ind w:left="1440" w:hanging="360"/>
+      </w:pPr>
+    </w:lvl>
+    <w:lvl w:ilvl="2" w:tplc="0409001B" w:tentative="1">
+      <w:start w:val="1"/>
+      <w:numFmt w:val="lowerRoman"/>
+      <w:lvlText w:val="%3."/>
+      <w:lvlJc w:val="right"/>
+      <w:pPr>
+        <w:ind w:left="2160" w:hanging="180"/>
+      </w:pPr>
+    </w:lvl>
+    <w:lvl w:ilvl="3" w:tplc="0409000F" w:tentative="1">
+      <w:start w:val="1"/>
+      <w:numFmt w:val="decimal"/>
+      <w:lvlText w:val="%4."/>
+      <w:lvlJc w:val="left"/>
+      <w:pPr>
+        <w:ind w:left="2880" w:hanging="360"/>
+      </w:pPr>
+    </w:lvl>
+    <w:lvl w:ilvl="4" w:tplc="04090019" w:tentative="1">
+      <w:start w:val="1"/>
+      <w:numFmt w:val="lowerLetter"/>
+      <w:lvlText w:val="%5."/>
+      <w:lvlJc w:val="left"/>
+      <w:pPr>
+        <w:ind w:left="3600" w:hanging="360"/>
+      </w:pPr>
+    </w:lvl>
+    <w:lvl w:ilvl="5" w:tplc="0409001B" w:tentative="1">
+      <w:start w:val="1"/>
+      <w:numFmt w:val="lowerRoman"/>
+      <w:lvlText w:val="%6."/>
+      <w:lvlJc w:val="right"/>
+      <w:pPr>
+        <w:ind w:left="4320" w:hanging="180"/>
+      </w:pPr>
+    </w:lvl>
+    <w:lvl w:ilvl="6" w:tplc="0409000F" w:tentative="1">
+      <w:start w:val="1"/>
+      <w:numFmt w:val="decimal"/>
+      <w:lvlText w:val="%7."/>
+      <w:lvlJc w:val="left"/>
+      <w:pPr>
+        <w:ind w:left="5040" w:hanging="360"/>
+      </w:pPr>
+    </w:lvl>
+    <w:lvl w:ilvl="7" w:tplc="04090019" w:tentative="1">
+      <w:start w:val="1"/>
+      <w:numFmt w:val="lowerLetter"/>
+      <w:lvlText w:val="%8."/>
+      <w:lvlJc w:val="left"/>
+      <w:pPr>
+        <w:ind w:left="5760" w:hanging="360"/>
+      </w:pPr>
+    </w:lvl>
+    <w:lvl w:ilvl="8" w:tplc="0409001B" w:tentative="1">
+      <w:start w:val="1"/>
+      <w:numFmt w:val="lowerRoman"/>
+      <w:lvlText w:val="%9."/>
+      <w:lvlJc w:val="right"/>
+      <w:pPr>
+        <w:ind w:left="6480" w:hanging="180"/>
+      </w:pPr>
+    </w:lvl>
+  </w:abstractNum>
+  <w:num w:numId="1" w16cid:durableId="141850711">
+    <w:abstractNumId w:val="0"/>
+  </w:num>
+</w:numbering>
 </file>
 
 <file path=word/people.xml><?xml version="1.0" encoding="utf-8"?>

</xml_diff>

<commit_message>
moved the working manuscript to the main Docs folder and deleted the wrong located one from Feedback
</commit_message>
<xml_diff>
--- a/Docs/Figures_RunTimingManuscript.docx
+++ b/Docs/Figures_RunTimingManuscript.docx
@@ -53,6 +53,7 @@
           <w:szCs w:val="22"/>
         </w:rPr>
       </w:pPr>
+      <w:commentRangeStart w:id="0"/>
       <w:r>
         <w:rPr>
           <w:rFonts w:ascii="Garamond" w:hAnsi="Garamond"/>
@@ -155,6 +156,13 @@
           <w:szCs w:val="22"/>
         </w:rPr>
         <w:t>.7042 to .7107, with a general trend towards more enriched values at the top of the watershed.</w:t>
+      </w:r>
+      <w:commentRangeEnd w:id="0"/>
+      <w:r>
+        <w:rPr>
+          <w:rStyle w:val="CommentReference"/>
+        </w:rPr>
+        <w:commentReference w:id="0"/>
       </w:r>
     </w:p>
     <w:p/>
@@ -186,7 +194,7 @@
                     <pic:cNvPicPr/>
                   </pic:nvPicPr>
                   <pic:blipFill>
-                    <a:blip r:embed="rId8"/>
+                    <a:blip r:embed="rId12"/>
                     <a:stretch>
                       <a:fillRect/>
                     </a:stretch>
@@ -213,6 +221,7 @@
           <w:rFonts w:ascii="Garamond" w:hAnsi="Garamond"/>
         </w:rPr>
       </w:pPr>
+      <w:commentRangeStart w:id="1"/>
       <w:r>
         <w:rPr>
           <w:rFonts w:ascii="Garamond" w:hAnsi="Garamond"/>
@@ -232,6 +241,13 @@
           <w:rFonts w:ascii="Garamond" w:hAnsi="Garamond"/>
         </w:rPr>
         <w:t xml:space="preserve">and manually selected units of similar size. </w:t>
+      </w:r>
+      <w:commentRangeEnd w:id="1"/>
+      <w:r>
+        <w:rPr>
+          <w:rStyle w:val="CommentReference"/>
+        </w:rPr>
+        <w:commentReference w:id="1"/>
       </w:r>
     </w:p>
     <w:p/>
@@ -453,7 +469,7 @@
           <w:noProof/>
         </w:rPr>
         <w:drawing>
-          <wp:inline distT="0" distB="0" distL="0" distR="0" wp14:anchorId="34888FD1" wp14:editId="378C0AA0">
+          <wp:inline distT="0" distB="0" distL="0" distR="0" wp14:anchorId="34888FD1" wp14:editId="3B3F3FAD">
             <wp:extent cx="6288103" cy="2955139"/>
             <wp:effectExtent l="0" t="0" r="0" b="0"/>
             <wp:docPr id="739570781" name="Picture 2"/>
@@ -470,7 +486,7 @@
                     </pic:cNvPicPr>
                   </pic:nvPicPr>
                   <pic:blipFill rotWithShape="1">
-                    <a:blip r:embed="rId9" cstate="print">
+                    <a:blip r:embed="rId13" cstate="print">
                       <a:extLst>
                         <a:ext uri="{28A0092B-C50C-407E-A947-70E740481C1C}">
                           <a14:useLocalDpi xmlns:a14="http://schemas.microsoft.com/office/drawing/2010/main" val="0"/>
@@ -575,16 +591,16 @@
         <w:lastRenderedPageBreak/>
         <w:t xml:space="preserve">Figure 4: </w:t>
       </w:r>
-      <w:commentRangeStart w:id="0"/>
+      <w:commentRangeStart w:id="2"/>
       <w:r>
         <w:t>Cumulative</w:t>
       </w:r>
-      <w:commentRangeEnd w:id="0"/>
+      <w:commentRangeEnd w:id="2"/>
       <w:r>
         <w:rPr>
           <w:rStyle w:val="CommentReference"/>
         </w:rPr>
-        <w:commentReference w:id="0"/>
+        <w:commentReference w:id="2"/>
       </w:r>
       <w:r>
         <w:t xml:space="preserve"> Distribution Plots </w:t>
@@ -888,13 +904,29 @@
           <w:szCs w:val="22"/>
         </w:rPr>
       </w:pPr>
-      <w:r>
-        <w:rPr>
-          <w:rFonts w:ascii="Garamond" w:hAnsi="Garamond"/>
-          <w:sz w:val="22"/>
-          <w:szCs w:val="22"/>
-        </w:rPr>
-        <w:t>Figure 6: The range of proportional protection offered by the front-end closure ending on June 11</w:t>
+      <w:commentRangeStart w:id="3"/>
+      <w:r>
+        <w:rPr>
+          <w:rFonts w:ascii="Garamond" w:hAnsi="Garamond"/>
+          <w:sz w:val="22"/>
+          <w:szCs w:val="22"/>
+        </w:rPr>
+        <w:t xml:space="preserve">Figure 6: </w:t>
+      </w:r>
+      <w:commentRangeEnd w:id="3"/>
+      <w:r>
+        <w:rPr>
+          <w:rStyle w:val="CommentReference"/>
+        </w:rPr>
+        <w:commentReference w:id="3"/>
+      </w:r>
+      <w:r>
+        <w:rPr>
+          <w:rFonts w:ascii="Garamond" w:hAnsi="Garamond"/>
+          <w:sz w:val="22"/>
+          <w:szCs w:val="22"/>
+        </w:rPr>
+        <w:t>The range of proportional protection offered by the front-end closure ending on June 11</w:t>
       </w:r>
       <w:r>
         <w:rPr>
@@ -951,7 +983,42 @@
 
 <file path=word/comments.xml><?xml version="1.0" encoding="utf-8"?>
 <w:comments xmlns:wpc="http://schemas.microsoft.com/office/word/2010/wordprocessingCanvas" xmlns:cx="http://schemas.microsoft.com/office/drawing/2014/chartex" xmlns:cx1="http://schemas.microsoft.com/office/drawing/2015/9/8/chartex" xmlns:cx2="http://schemas.microsoft.com/office/drawing/2015/10/21/chartex" xmlns:cx3="http://schemas.microsoft.com/office/drawing/2016/5/9/chartex" xmlns:cx4="http://schemas.microsoft.com/office/drawing/2016/5/10/chartex" xmlns:cx5="http://schemas.microsoft.com/office/drawing/2016/5/11/chartex" xmlns:cx6="http://schemas.microsoft.com/office/drawing/2016/5/12/chartex" xmlns:cx7="http://schemas.microsoft.com/office/drawing/2016/5/13/chartex" xmlns:cx8="http://schemas.microsoft.com/office/drawing/2016/5/14/chartex" xmlns:mc="http://schemas.openxmlformats.org/markup-compatibility/2006" xmlns:aink="http://schemas.microsoft.com/office/drawing/2016/ink" xmlns:am3d="http://schemas.microsoft.com/office/drawing/2017/model3d" xmlns:o="urn:schemas-microsoft-com:office:office" xmlns:oel="http://schemas.microsoft.com/office/2019/extlst" xmlns:r="http://schemas.openxmlformats.org/officeDocument/2006/relationships" xmlns:m="http://schemas.openxmlformats.org/officeDocument/2006/math" xmlns:v="urn:schemas-microsoft-com:vml" xmlns:wp14="http://schemas.microsoft.com/office/word/2010/wordprocessingDrawing" xmlns:wp="http://schemas.openxmlformats.org/drawingml/2006/wordprocessingDrawing" xmlns:w10="urn:schemas-microsoft-com:office:word" xmlns:w="http://schemas.openxmlformats.org/wordprocessingml/2006/main" xmlns:w14="http://schemas.microsoft.com/office/word/2010/wordml" xmlns:w15="http://schemas.microsoft.com/office/word/2012/wordml" xmlns:w16cex="http://schemas.microsoft.com/office/word/2018/wordml/cex" xmlns:w16cid="http://schemas.microsoft.com/office/word/2016/wordml/cid" xmlns:w16="http://schemas.microsoft.com/office/word/2018/wordml" xmlns:w16du="http://schemas.microsoft.com/office/word/2023/wordml/word16du" xmlns:w16sdtdh="http://schemas.microsoft.com/office/word/2020/wordml/sdtdatahash" xmlns:w16sdtfl="http://schemas.microsoft.com/office/word/2024/wordml/sdtformatlock" xmlns:w16se="http://schemas.microsoft.com/office/word/2015/wordml/symex" xmlns:wpg="http://schemas.microsoft.com/office/word/2010/wordprocessingGroup" xmlns:wpi="http://schemas.microsoft.com/office/word/2010/wordprocessingInk" xmlns:wne="http://schemas.microsoft.com/office/word/2006/wordml" xmlns:wps="http://schemas.microsoft.com/office/word/2010/wordprocessingShape" mc:Ignorable="w14 w15 w16se w16cid w16 w16cex w16sdtdh w16sdtfl w16du wp14">
-  <w:comment w:id="0" w:author="Daniel Schindler" w:date="2025-07-17T14:10:00Z" w:initials="DS">
+  <w:comment w:id="0" w:author="Cline, Timothy" w:date="2025-10-06T13:44:00Z" w:initials="TC">
+    <w:p>
+      <w:r>
+        <w:rPr>
+          <w:rStyle w:val="CommentReference"/>
+        </w:rPr>
+        <w:annotationRef/>
+      </w:r>
+      <w:r>
+        <w:rPr>
+          <w:color w:val="000000"/>
+          <w:sz w:val="20"/>
+          <w:szCs w:val="20"/>
+        </w:rPr>
+        <w:t>You use ‘lower’ and ‘enriched’. Would it be better to use ‘lower and higher’ or ‘depleted and enriched’ for consistency?</w:t>
+      </w:r>
+    </w:p>
+  </w:comment>
+  <w:comment w:id="1" w:author="Cline, Timothy" w:date="2025-10-08T10:27:00Z" w:initials="TC">
+    <w:p>
+      <w:r>
+        <w:rPr>
+          <w:rStyle w:val="CommentReference"/>
+        </w:rPr>
+        <w:annotationRef/>
+      </w:r>
+      <w:r>
+        <w:rPr>
+          <w:sz w:val="20"/>
+          <w:szCs w:val="20"/>
+        </w:rPr>
+        <w:t xml:space="preserve">A careful reviewer will ask how well you can assign fish to these individual managemnet units given overlap in water chemistry signals. We should probably have some sort of supporting figure showing isotopic distinction between them. </w:t>
+      </w:r>
+    </w:p>
+  </w:comment>
+  <w:comment w:id="2" w:author="Daniel Schindler" w:date="2025-07-17T14:10:00Z" w:initials="DS">
     <w:p>
       <w:pPr>
         <w:pStyle w:val="CommentText"/>
@@ -964,6 +1031,24 @@
       </w:r>
       <w:r>
         <w:t>Discussion point is that the effectiveness of the front end closure depends both on run timing but also run compression. Eg 2017 was late but extended. 2019 was early but compressed.</w:t>
+      </w:r>
+    </w:p>
+  </w:comment>
+  <w:comment w:id="3" w:author="Cline, Timothy" w:date="2025-10-06T13:52:00Z" w:initials="TC">
+    <w:p>
+      <w:r>
+        <w:rPr>
+          <w:rStyle w:val="CommentReference"/>
+        </w:rPr>
+        <w:annotationRef/>
+      </w:r>
+      <w:r>
+        <w:rPr>
+          <w:color w:val="000000"/>
+          <w:sz w:val="20"/>
+          <w:szCs w:val="20"/>
+        </w:rPr>
+        <w:t>hard to see the distribution ribbons with this much vertical compression. Not sure how important that info is.</w:t>
       </w:r>
     </w:p>
   </w:comment>
@@ -972,19 +1057,28 @@
 
 <file path=word/commentsExtended.xml><?xml version="1.0" encoding="utf-8"?>
 <w15:commentsEx xmlns:wpc="http://schemas.microsoft.com/office/word/2010/wordprocessingCanvas" xmlns:cx="http://schemas.microsoft.com/office/drawing/2014/chartex" xmlns:cx1="http://schemas.microsoft.com/office/drawing/2015/9/8/chartex" xmlns:cx2="http://schemas.microsoft.com/office/drawing/2015/10/21/chartex" xmlns:cx3="http://schemas.microsoft.com/office/drawing/2016/5/9/chartex" xmlns:cx4="http://schemas.microsoft.com/office/drawing/2016/5/10/chartex" xmlns:cx5="http://schemas.microsoft.com/office/drawing/2016/5/11/chartex" xmlns:cx6="http://schemas.microsoft.com/office/drawing/2016/5/12/chartex" xmlns:cx7="http://schemas.microsoft.com/office/drawing/2016/5/13/chartex" xmlns:cx8="http://schemas.microsoft.com/office/drawing/2016/5/14/chartex" xmlns:mc="http://schemas.openxmlformats.org/markup-compatibility/2006" xmlns:aink="http://schemas.microsoft.com/office/drawing/2016/ink" xmlns:am3d="http://schemas.microsoft.com/office/drawing/2017/model3d" xmlns:o="urn:schemas-microsoft-com:office:office" xmlns:oel="http://schemas.microsoft.com/office/2019/extlst" xmlns:r="http://schemas.openxmlformats.org/officeDocument/2006/relationships" xmlns:m="http://schemas.openxmlformats.org/officeDocument/2006/math" xmlns:v="urn:schemas-microsoft-com:vml" xmlns:wp14="http://schemas.microsoft.com/office/word/2010/wordprocessingDrawing" xmlns:wp="http://schemas.openxmlformats.org/drawingml/2006/wordprocessingDrawing" xmlns:w10="urn:schemas-microsoft-com:office:word" xmlns:w="http://schemas.openxmlformats.org/wordprocessingml/2006/main" xmlns:w14="http://schemas.microsoft.com/office/word/2010/wordml" xmlns:w15="http://schemas.microsoft.com/office/word/2012/wordml" xmlns:w16cex="http://schemas.microsoft.com/office/word/2018/wordml/cex" xmlns:w16cid="http://schemas.microsoft.com/office/word/2016/wordml/cid" xmlns:w16="http://schemas.microsoft.com/office/word/2018/wordml" xmlns:w16du="http://schemas.microsoft.com/office/word/2023/wordml/word16du" xmlns:w16sdtdh="http://schemas.microsoft.com/office/word/2020/wordml/sdtdatahash" xmlns:w16sdtfl="http://schemas.microsoft.com/office/word/2024/wordml/sdtformatlock" xmlns:w16se="http://schemas.microsoft.com/office/word/2015/wordml/symex" xmlns:wpg="http://schemas.microsoft.com/office/word/2010/wordprocessingGroup" xmlns:wpi="http://schemas.microsoft.com/office/word/2010/wordprocessingInk" xmlns:wne="http://schemas.microsoft.com/office/word/2006/wordml" xmlns:wps="http://schemas.microsoft.com/office/word/2010/wordprocessingShape" mc:Ignorable="w14 w15 w16se w16cid w16 w16cex w16sdtdh w16sdtfl w16du wp14">
+  <w15:commentEx w15:paraId="3494BB34" w15:done="0"/>
+  <w15:commentEx w15:paraId="72CEFC00" w15:done="0"/>
   <w15:commentEx w15:paraId="5D59A14B" w15:done="0"/>
+  <w15:commentEx w15:paraId="0493D03C" w15:done="0"/>
 </w15:commentsEx>
 </file>
 
 <file path=word/commentsExtensible.xml><?xml version="1.0" encoding="utf-8"?>
 <w16cex:commentsExtensible xmlns:wpc="http://schemas.microsoft.com/office/word/2010/wordprocessingCanvas" xmlns:cx="http://schemas.microsoft.com/office/drawing/2014/chartex" xmlns:cx1="http://schemas.microsoft.com/office/drawing/2015/9/8/chartex" xmlns:cx2="http://schemas.microsoft.com/office/drawing/2015/10/21/chartex" xmlns:cx3="http://schemas.microsoft.com/office/drawing/2016/5/9/chartex" xmlns:cx4="http://schemas.microsoft.com/office/drawing/2016/5/10/chartex" xmlns:cx5="http://schemas.microsoft.com/office/drawing/2016/5/11/chartex" xmlns:cx6="http://schemas.microsoft.com/office/drawing/2016/5/12/chartex" xmlns:cx7="http://schemas.microsoft.com/office/drawing/2016/5/13/chartex" xmlns:cx8="http://schemas.microsoft.com/office/drawing/2016/5/14/chartex" xmlns:cr="http://schemas.microsoft.com/office/comments/2020/reactions" xmlns:mc="http://schemas.openxmlformats.org/markup-compatibility/2006" xmlns:aink="http://schemas.microsoft.com/office/drawing/2016/ink" xmlns:am3d="http://schemas.microsoft.com/office/drawing/2017/model3d" xmlns:o="urn:schemas-microsoft-com:office:office" xmlns:oel="http://schemas.microsoft.com/office/2019/extlst" xmlns:r="http://schemas.openxmlformats.org/officeDocument/2006/relationships" xmlns:m="http://schemas.openxmlformats.org/officeDocument/2006/math" xmlns:v="urn:schemas-microsoft-com:vml" xmlns:wp14="http://schemas.microsoft.com/office/word/2010/wordprocessingDrawing" xmlns:wp="http://schemas.openxmlformats.org/drawingml/2006/wordprocessingDrawing" xmlns:w10="urn:schemas-microsoft-com:office:word" xmlns:w="http://schemas.openxmlformats.org/wordprocessingml/2006/main" xmlns:w14="http://schemas.microsoft.com/office/word/2010/wordml" xmlns:w15="http://schemas.microsoft.com/office/word/2012/wordml" xmlns:w16cex="http://schemas.microsoft.com/office/word/2018/wordml/cex" xmlns:w16cid="http://schemas.microsoft.com/office/word/2016/wordml/cid" xmlns:w16="http://schemas.microsoft.com/office/word/2018/wordml" xmlns:w16du="http://schemas.microsoft.com/office/word/2023/wordml/word16du" xmlns:w16sdtdh="http://schemas.microsoft.com/office/word/2020/wordml/sdtdatahash" xmlns:w16sdtfl="http://schemas.microsoft.com/office/word/2024/wordml/sdtformatlock" xmlns:w16se="http://schemas.microsoft.com/office/word/2015/wordml/symex" xmlns:wpg="http://schemas.microsoft.com/office/word/2010/wordprocessingGroup" xmlns:wpi="http://schemas.microsoft.com/office/word/2010/wordprocessingInk" xmlns:wne="http://schemas.microsoft.com/office/word/2006/wordml" xmlns:wps="http://schemas.microsoft.com/office/word/2010/wordprocessingShape" mc:Ignorable="w14 w15 w16se w16cid w16 w16cex w16sdtdh w16sdtfl cr w16du wp14">
+  <w16cex:commentExtensible w16cex:durableId="6B919312" w16cex:dateUtc="2025-10-06T19:44:00Z"/>
+  <w16cex:commentExtensible w16cex:durableId="3915AA6E" w16cex:dateUtc="2025-10-08T16:27:00Z"/>
   <w16cex:commentExtensible w16cex:durableId="33BDF08E" w16cex:dateUtc="2025-07-17T22:10:00Z"/>
+  <w16cex:commentExtensible w16cex:durableId="240A3890" w16cex:dateUtc="2025-10-06T19:52:00Z"/>
 </w16cex:commentsExtensible>
 </file>
 
 <file path=word/commentsIds.xml><?xml version="1.0" encoding="utf-8"?>
 <w16cid:commentsIds xmlns:wpc="http://schemas.microsoft.com/office/word/2010/wordprocessingCanvas" xmlns:cx="http://schemas.microsoft.com/office/drawing/2014/chartex" xmlns:cx1="http://schemas.microsoft.com/office/drawing/2015/9/8/chartex" xmlns:cx2="http://schemas.microsoft.com/office/drawing/2015/10/21/chartex" xmlns:cx3="http://schemas.microsoft.com/office/drawing/2016/5/9/chartex" xmlns:cx4="http://schemas.microsoft.com/office/drawing/2016/5/10/chartex" xmlns:cx5="http://schemas.microsoft.com/office/drawing/2016/5/11/chartex" xmlns:cx6="http://schemas.microsoft.com/office/drawing/2016/5/12/chartex" xmlns:cx7="http://schemas.microsoft.com/office/drawing/2016/5/13/chartex" xmlns:cx8="http://schemas.microsoft.com/office/drawing/2016/5/14/chartex" xmlns:mc="http://schemas.openxmlformats.org/markup-compatibility/2006" xmlns:aink="http://schemas.microsoft.com/office/drawing/2016/ink" xmlns:am3d="http://schemas.microsoft.com/office/drawing/2017/model3d" xmlns:o="urn:schemas-microsoft-com:office:office" xmlns:oel="http://schemas.microsoft.com/office/2019/extlst" xmlns:r="http://schemas.openxmlformats.org/officeDocument/2006/relationships" xmlns:m="http://schemas.openxmlformats.org/officeDocument/2006/math" xmlns:v="urn:schemas-microsoft-com:vml" xmlns:wp14="http://schemas.microsoft.com/office/word/2010/wordprocessingDrawing" xmlns:wp="http://schemas.openxmlformats.org/drawingml/2006/wordprocessingDrawing" xmlns:w10="urn:schemas-microsoft-com:office:word" xmlns:w="http://schemas.openxmlformats.org/wordprocessingml/2006/main" xmlns:w14="http://schemas.microsoft.com/office/word/2010/wordml" xmlns:w15="http://schemas.microsoft.com/office/word/2012/wordml" xmlns:w16cex="http://schemas.microsoft.com/office/word/2018/wordml/cex" xmlns:w16cid="http://schemas.microsoft.com/office/word/2016/wordml/cid" xmlns:w16="http://schemas.microsoft.com/office/word/2018/wordml" xmlns:w16du="http://schemas.microsoft.com/office/word/2023/wordml/word16du" xmlns:w16sdtdh="http://schemas.microsoft.com/office/word/2020/wordml/sdtdatahash" xmlns:w16sdtfl="http://schemas.microsoft.com/office/word/2024/wordml/sdtformatlock" xmlns:w16se="http://schemas.microsoft.com/office/word/2015/wordml/symex" xmlns:wpg="http://schemas.microsoft.com/office/word/2010/wordprocessingGroup" xmlns:wpi="http://schemas.microsoft.com/office/word/2010/wordprocessingInk" xmlns:wne="http://schemas.microsoft.com/office/word/2006/wordml" xmlns:wps="http://schemas.microsoft.com/office/word/2010/wordprocessingShape" mc:Ignorable="w14 w15 w16se w16cid w16 w16cex w16sdtdh w16sdtfl w16du wp14">
+  <w16cid:commentId w16cid:paraId="3494BB34" w16cid:durableId="6B919312"/>
+  <w16cid:commentId w16cid:paraId="72CEFC00" w16cid:durableId="3915AA6E"/>
   <w16cid:commentId w16cid:paraId="5D59A14B" w16cid:durableId="33BDF08E"/>
+  <w16cid:commentId w16cid:paraId="0493D03C" w16cid:durableId="240A3890"/>
 </w16cid:commentsIds>
 </file>
 
@@ -1137,6 +1231,9 @@
 
 <file path=word/people.xml><?xml version="1.0" encoding="utf-8"?>
 <w15:people xmlns:wpc="http://schemas.microsoft.com/office/word/2010/wordprocessingCanvas" xmlns:cx="http://schemas.microsoft.com/office/drawing/2014/chartex" xmlns:cx1="http://schemas.microsoft.com/office/drawing/2015/9/8/chartex" xmlns:cx2="http://schemas.microsoft.com/office/drawing/2015/10/21/chartex" xmlns:cx3="http://schemas.microsoft.com/office/drawing/2016/5/9/chartex" xmlns:cx4="http://schemas.microsoft.com/office/drawing/2016/5/10/chartex" xmlns:cx5="http://schemas.microsoft.com/office/drawing/2016/5/11/chartex" xmlns:cx6="http://schemas.microsoft.com/office/drawing/2016/5/12/chartex" xmlns:cx7="http://schemas.microsoft.com/office/drawing/2016/5/13/chartex" xmlns:cx8="http://schemas.microsoft.com/office/drawing/2016/5/14/chartex" xmlns:mc="http://schemas.openxmlformats.org/markup-compatibility/2006" xmlns:aink="http://schemas.microsoft.com/office/drawing/2016/ink" xmlns:am3d="http://schemas.microsoft.com/office/drawing/2017/model3d" xmlns:o="urn:schemas-microsoft-com:office:office" xmlns:oel="http://schemas.microsoft.com/office/2019/extlst" xmlns:r="http://schemas.openxmlformats.org/officeDocument/2006/relationships" xmlns:m="http://schemas.openxmlformats.org/officeDocument/2006/math" xmlns:v="urn:schemas-microsoft-com:vml" xmlns:wp14="http://schemas.microsoft.com/office/word/2010/wordprocessingDrawing" xmlns:wp="http://schemas.openxmlformats.org/drawingml/2006/wordprocessingDrawing" xmlns:w10="urn:schemas-microsoft-com:office:word" xmlns:w="http://schemas.openxmlformats.org/wordprocessingml/2006/main" xmlns:w14="http://schemas.microsoft.com/office/word/2010/wordml" xmlns:w15="http://schemas.microsoft.com/office/word/2012/wordml" xmlns:w16cex="http://schemas.microsoft.com/office/word/2018/wordml/cex" xmlns:w16cid="http://schemas.microsoft.com/office/word/2016/wordml/cid" xmlns:w16="http://schemas.microsoft.com/office/word/2018/wordml" xmlns:w16du="http://schemas.microsoft.com/office/word/2023/wordml/word16du" xmlns:w16sdtdh="http://schemas.microsoft.com/office/word/2020/wordml/sdtdatahash" xmlns:w16sdtfl="http://schemas.microsoft.com/office/word/2024/wordml/sdtformatlock" xmlns:w16se="http://schemas.microsoft.com/office/word/2015/wordml/symex" xmlns:wpg="http://schemas.microsoft.com/office/word/2010/wordprocessingGroup" xmlns:wpi="http://schemas.microsoft.com/office/word/2010/wordprocessingInk" xmlns:wne="http://schemas.microsoft.com/office/word/2006/wordml" xmlns:wps="http://schemas.microsoft.com/office/word/2010/wordprocessingShape" mc:Ignorable="w14 w15 w16se w16cid w16 w16cex w16sdtdh w16sdtfl w16du wp14">
+  <w15:person w15:author="Cline, Timothy">
+    <w15:presenceInfo w15:providerId="AD" w15:userId="S::s84g549@msu.montana.edu::b53db266-c02e-4ef3-8acb-16ecbf807cff"/>
+  </w15:person>
   <w15:person w15:author="Daniel Schindler">
     <w15:presenceInfo w15:providerId="AD" w15:userId="S::deschind@uw.edu::638f7977-a89c-40df-b85e-dc804ddb30d9"/>
   </w15:person>

</xml_diff>

<commit_message>
updated manuscript full go through
</commit_message>
<xml_diff>
--- a/Docs/Figures_RunTimingManuscript.docx
+++ b/Docs/Figures_RunTimingManuscript.docx
@@ -9,9 +9,9 @@
           <w:noProof/>
         </w:rPr>
         <w:drawing>
-          <wp:inline distT="0" distB="0" distL="0" distR="0" wp14:anchorId="329926DD" wp14:editId="5BFBBA03">
-            <wp:extent cx="5943600" cy="4505325"/>
-            <wp:effectExtent l="0" t="0" r="0" b="9525"/>
+          <wp:inline distT="0" distB="0" distL="0" distR="0" wp14:anchorId="329926DD" wp14:editId="5697E9D3">
+            <wp:extent cx="6477000" cy="4852035"/>
+            <wp:effectExtent l="0" t="0" r="0" b="0"/>
             <wp:docPr id="1577477404" name="Picture 1" descr="A map of a river system&#10;&#10;AI-generated content may be incorrect."/>
             <wp:cNvGraphicFramePr>
               <a:graphicFrameLocks xmlns:a="http://schemas.openxmlformats.org/drawingml/2006/main" noChangeAspect="1"/>
@@ -23,20 +23,29 @@
                     <pic:cNvPr id="1577477404" name="Picture 1" descr="A map of a river system&#10;&#10;AI-generated content may be incorrect."/>
                     <pic:cNvPicPr/>
                   </pic:nvPicPr>
-                  <pic:blipFill>
+                  <pic:blipFill rotWithShape="1">
                     <a:blip r:embed="rId7"/>
+                    <a:srcRect l="1025" t="4212" r="2049"/>
                     <a:stretch>
                       <a:fillRect/>
                     </a:stretch>
                   </pic:blipFill>
-                  <pic:spPr>
+                  <pic:spPr bwMode="auto">
                     <a:xfrm>
                       <a:off x="0" y="0"/>
-                      <a:ext cx="5943600" cy="4505325"/>
+                      <a:ext cx="6487696" cy="4860048"/>
                     </a:xfrm>
                     <a:prstGeom prst="rect">
                       <a:avLst/>
                     </a:prstGeom>
+                    <a:ln>
+                      <a:noFill/>
+                    </a:ln>
+                    <a:extLst>
+                      <a:ext uri="{53640926-AAD7-44D8-BBD7-CCE9431645EC}">
+                        <a14:shadowObscured xmlns:a14="http://schemas.microsoft.com/office/drawing/2010/main"/>
+                      </a:ext>
+                    </a:extLst>
                   </pic:spPr>
                 </pic:pic>
               </a:graphicData>
@@ -177,12 +186,11 @@
         <w:rPr>
           <w:noProof/>
         </w:rPr>
-        <w:lastRenderedPageBreak/>
         <w:drawing>
-          <wp:inline distT="0" distB="0" distL="0" distR="0" wp14:anchorId="3697CDD8" wp14:editId="22A6AFC7">
-            <wp:extent cx="5943600" cy="4593590"/>
-            <wp:effectExtent l="0" t="0" r="0" b="0"/>
-            <wp:docPr id="433617156" name="Picture 1"/>
+          <wp:inline distT="0" distB="0" distL="0" distR="0" wp14:anchorId="65C76116" wp14:editId="61A09AA5">
+            <wp:extent cx="5943600" cy="4592955"/>
+            <wp:effectExtent l="0" t="0" r="0" b="4445"/>
+            <wp:docPr id="1753742988" name="Picture 3"/>
             <wp:cNvGraphicFramePr>
               <a:graphicFrameLocks xmlns:a="http://schemas.openxmlformats.org/drawingml/2006/main" noChangeAspect="1"/>
             </wp:cNvGraphicFramePr>
@@ -190,7 +198,7 @@
               <a:graphicData uri="http://schemas.openxmlformats.org/drawingml/2006/picture">
                 <pic:pic xmlns:pic="http://schemas.openxmlformats.org/drawingml/2006/picture">
                   <pic:nvPicPr>
-                    <pic:cNvPr id="433617156" name=""/>
+                    <pic:cNvPr id="1753742988" name="Picture 1753742988"/>
                     <pic:cNvPicPr/>
                   </pic:nvPicPr>
                   <pic:blipFill>
@@ -202,7 +210,7 @@
                   <pic:spPr>
                     <a:xfrm>
                       <a:off x="0" y="0"/>
-                      <a:ext cx="5943600" cy="4593590"/>
+                      <a:ext cx="5943600" cy="4592955"/>
                     </a:xfrm>
                     <a:prstGeom prst="rect">
                       <a:avLst/>
@@ -469,7 +477,7 @@
           <w:noProof/>
         </w:rPr>
         <w:drawing>
-          <wp:inline distT="0" distB="0" distL="0" distR="0" wp14:anchorId="34888FD1" wp14:editId="3B3F3FAD">
+          <wp:inline distT="0" distB="0" distL="0" distR="0" wp14:anchorId="34888FD1" wp14:editId="641624C1">
             <wp:extent cx="6288103" cy="2955139"/>
             <wp:effectExtent l="0" t="0" r="0" b="0"/>
             <wp:docPr id="739570781" name="Picture 2"/>
@@ -585,27 +593,6 @@
     <w:p/>
     <w:p/>
     <w:p/>
-    <w:p/>
-    <w:p>
-      <w:r>
-        <w:lastRenderedPageBreak/>
-        <w:t xml:space="preserve">Figure 4: </w:t>
-      </w:r>
-      <w:commentRangeStart w:id="2"/>
-      <w:r>
-        <w:t>Cumulative</w:t>
-      </w:r>
-      <w:commentRangeEnd w:id="2"/>
-      <w:r>
-        <w:rPr>
-          <w:rStyle w:val="CommentReference"/>
-        </w:rPr>
-        <w:commentReference w:id="2"/>
-      </w:r>
-      <w:r>
-        <w:t xml:space="preserve"> Distribution Plots </w:t>
-      </w:r>
-    </w:p>
     <w:p>
       <w:pPr>
         <w:rPr>
@@ -618,11 +605,12 @@
           <w:sz w:val="16"/>
           <w:szCs w:val="16"/>
         </w:rPr>
+        <w:lastRenderedPageBreak/>
         <w:drawing>
-          <wp:inline distT="0" distB="0" distL="0" distR="0" wp14:anchorId="7B64ADF7" wp14:editId="0ADAE1D4">
-            <wp:extent cx="5502729" cy="6878412"/>
-            <wp:effectExtent l="0" t="0" r="0" b="5080"/>
-            <wp:docPr id="1928488302" name="Picture 1" descr="A graph of different colored lines&#10;&#10;AI-generated content may be incorrect."/>
+          <wp:inline distT="0" distB="0" distL="0" distR="0" wp14:anchorId="58EE2E63" wp14:editId="239346F7">
+            <wp:extent cx="5943600" cy="7429500"/>
+            <wp:effectExtent l="0" t="0" r="0" b="0"/>
+            <wp:docPr id="1832532860" name="Picture 4" descr="A graph of different colored lines&#10;&#10;AI-generated content may be incorrect."/>
             <wp:cNvGraphicFramePr>
               <a:graphicFrameLocks xmlns:a="http://schemas.openxmlformats.org/drawingml/2006/main" noChangeAspect="1"/>
             </wp:cNvGraphicFramePr>
@@ -630,7 +618,7 @@
               <a:graphicData uri="http://schemas.openxmlformats.org/drawingml/2006/picture">
                 <pic:pic xmlns:pic="http://schemas.openxmlformats.org/drawingml/2006/picture">
                   <pic:nvPicPr>
-                    <pic:cNvPr id="1928488302" name="Picture 1" descr="A graph of different colored lines&#10;&#10;AI-generated content may be incorrect."/>
+                    <pic:cNvPr id="1832532860" name="Picture 4" descr="A graph of different colored lines&#10;&#10;AI-generated content may be incorrect."/>
                     <pic:cNvPicPr/>
                   </pic:nvPicPr>
                   <pic:blipFill>
@@ -648,7 +636,7 @@
                   <pic:spPr>
                     <a:xfrm>
                       <a:off x="0" y="0"/>
-                      <a:ext cx="5556894" cy="6946119"/>
+                      <a:ext cx="5943600" cy="7429500"/>
                     </a:xfrm>
                     <a:prstGeom prst="rect">
                       <a:avLst/>
@@ -692,12 +680,19 @@
         <w:rPr>
           <w:noProof/>
         </w:rPr>
-        <w:lastRenderedPageBreak/>
         <w:drawing>
-          <wp:inline distT="0" distB="0" distL="0" distR="0" wp14:anchorId="31CF7FF1" wp14:editId="0A2E1166">
-            <wp:extent cx="6395076" cy="3934391"/>
-            <wp:effectExtent l="0" t="0" r="6350" b="9525"/>
-            <wp:docPr id="814574038" name="Picture 3"/>
+          <wp:anchor distT="0" distB="0" distL="114300" distR="114300" simplePos="0" relativeHeight="251662336" behindDoc="0" locked="0" layoutInCell="1" allowOverlap="1" wp14:anchorId="7869A59A" wp14:editId="4FF921D2">
+            <wp:simplePos x="0" y="0"/>
+            <wp:positionH relativeFrom="column">
+              <wp:posOffset>-106031</wp:posOffset>
+            </wp:positionH>
+            <wp:positionV relativeFrom="paragraph">
+              <wp:posOffset>353060</wp:posOffset>
+            </wp:positionV>
+            <wp:extent cx="6337571" cy="4225047"/>
+            <wp:effectExtent l="0" t="0" r="0" b="4445"/>
+            <wp:wrapSquare wrapText="bothSides"/>
+            <wp:docPr id="2117860035" name="Picture 5" descr="A graph of a number of days&#10;&#10;AI-generated content may be incorrect."/>
             <wp:cNvGraphicFramePr>
               <a:graphicFrameLocks xmlns:a="http://schemas.openxmlformats.org/drawingml/2006/main" noChangeAspect="1"/>
             </wp:cNvGraphicFramePr>
@@ -705,10 +700,10 @@
               <a:graphicData uri="http://schemas.openxmlformats.org/drawingml/2006/picture">
                 <pic:pic xmlns:pic="http://schemas.openxmlformats.org/drawingml/2006/picture">
                   <pic:nvPicPr>
-                    <pic:cNvPr id="814574038" name="Picture 814574038"/>
+                    <pic:cNvPr id="2117860035" name="Picture 5" descr="A graph of a number of days&#10;&#10;AI-generated content may be incorrect."/>
                     <pic:cNvPicPr/>
                   </pic:nvPicPr>
-                  <pic:blipFill rotWithShape="1">
+                  <pic:blipFill>
                     <a:blip r:embed="rId15" cstate="print">
                       <a:extLst>
                         <a:ext uri="{28A0092B-C50C-407E-A947-70E740481C1C}">
@@ -716,32 +711,29 @@
                         </a:ext>
                       </a:extLst>
                     </a:blip>
-                    <a:srcRect l="5154" t="6444" b="6029"/>
                     <a:stretch>
                       <a:fillRect/>
                     </a:stretch>
                   </pic:blipFill>
-                  <pic:spPr bwMode="auto">
+                  <pic:spPr>
                     <a:xfrm>
                       <a:off x="0" y="0"/>
-                      <a:ext cx="6450108" cy="3968248"/>
+                      <a:ext cx="6337571" cy="4225047"/>
                     </a:xfrm>
                     <a:prstGeom prst="rect">
                       <a:avLst/>
                     </a:prstGeom>
-                    <a:ln>
-                      <a:noFill/>
-                    </a:ln>
-                    <a:extLst>
-                      <a:ext uri="{53640926-AAD7-44D8-BBD7-CCE9431645EC}">
-                        <a14:shadowObscured xmlns:a14="http://schemas.microsoft.com/office/drawing/2010/main"/>
-                      </a:ext>
-                    </a:extLst>
                   </pic:spPr>
                 </pic:pic>
               </a:graphicData>
             </a:graphic>
-          </wp:inline>
+            <wp14:sizeRelH relativeFrom="page">
+              <wp14:pctWidth>0</wp14:pctWidth>
+            </wp14:sizeRelH>
+            <wp14:sizeRelV relativeFrom="page">
+              <wp14:pctHeight>0</wp14:pctHeight>
+            </wp14:sizeRelV>
+          </wp:anchor>
         </w:drawing>
       </w:r>
     </w:p>
@@ -845,10 +837,18 @@
         </w:rPr>
         <w:lastRenderedPageBreak/>
         <w:drawing>
-          <wp:inline distT="0" distB="0" distL="0" distR="0" wp14:anchorId="5ACB3875" wp14:editId="0C482931">
-            <wp:extent cx="6002448" cy="4157566"/>
-            <wp:effectExtent l="0" t="0" r="5080" b="0"/>
-            <wp:docPr id="562155378" name="Picture 1" descr="A graph with different colored lines&#10;&#10;AI-generated content may be incorrect."/>
+          <wp:anchor distT="0" distB="0" distL="114300" distR="114300" simplePos="0" relativeHeight="251663360" behindDoc="0" locked="0" layoutInCell="1" allowOverlap="1" wp14:anchorId="568C0574" wp14:editId="44DF9237">
+            <wp:simplePos x="0" y="0"/>
+            <wp:positionH relativeFrom="column">
+              <wp:posOffset>-427598</wp:posOffset>
+            </wp:positionH>
+            <wp:positionV relativeFrom="paragraph">
+              <wp:posOffset>272158</wp:posOffset>
+            </wp:positionV>
+            <wp:extent cx="6284053" cy="4488801"/>
+            <wp:effectExtent l="0" t="0" r="2540" b="0"/>
+            <wp:wrapSquare wrapText="bothSides"/>
+            <wp:docPr id="232965320" name="Picture 7" descr="A graph of a number of colored lines&#10;&#10;AI-generated content may be incorrect."/>
             <wp:cNvGraphicFramePr>
               <a:graphicFrameLocks xmlns:a="http://schemas.openxmlformats.org/drawingml/2006/main" noChangeAspect="1"/>
             </wp:cNvGraphicFramePr>
@@ -856,10 +856,10 @@
               <a:graphicData uri="http://schemas.openxmlformats.org/drawingml/2006/picture">
                 <pic:pic xmlns:pic="http://schemas.openxmlformats.org/drawingml/2006/picture">
                   <pic:nvPicPr>
-                    <pic:cNvPr id="562155378" name="Picture 1" descr="A graph with different colored lines&#10;&#10;AI-generated content may be incorrect."/>
+                    <pic:cNvPr id="232965320" name="Picture 7" descr="A graph of a number of colored lines&#10;&#10;AI-generated content may be incorrect."/>
                     <pic:cNvPicPr/>
                   </pic:nvPicPr>
-                  <pic:blipFill rotWithShape="1">
+                  <pic:blipFill>
                     <a:blip r:embed="rId16" cstate="print">
                       <a:extLst>
                         <a:ext uri="{28A0092B-C50C-407E-A947-70E740481C1C}">
@@ -867,32 +867,29 @@
                         </a:ext>
                       </a:extLst>
                     </a:blip>
-                    <a:srcRect l="5435" t="8025" r="7649" b="7696"/>
                     <a:stretch>
                       <a:fillRect/>
                     </a:stretch>
                   </pic:blipFill>
-                  <pic:spPr bwMode="auto">
+                  <pic:spPr>
                     <a:xfrm>
                       <a:off x="0" y="0"/>
-                      <a:ext cx="6094474" cy="4221307"/>
+                      <a:ext cx="6284053" cy="4488801"/>
                     </a:xfrm>
                     <a:prstGeom prst="rect">
                       <a:avLst/>
                     </a:prstGeom>
-                    <a:ln>
-                      <a:noFill/>
-                    </a:ln>
-                    <a:extLst>
-                      <a:ext uri="{53640926-AAD7-44D8-BBD7-CCE9431645EC}">
-                        <a14:shadowObscured xmlns:a14="http://schemas.microsoft.com/office/drawing/2010/main"/>
-                      </a:ext>
-                    </a:extLst>
                   </pic:spPr>
                 </pic:pic>
               </a:graphicData>
             </a:graphic>
-          </wp:inline>
+            <wp14:sizeRelH relativeFrom="page">
+              <wp14:pctWidth>0</wp14:pctWidth>
+            </wp14:sizeRelH>
+            <wp14:sizeRelV relativeFrom="page">
+              <wp14:pctHeight>0</wp14:pctHeight>
+            </wp14:sizeRelV>
+          </wp:anchor>
         </w:drawing>
       </w:r>
     </w:p>
@@ -904,7 +901,7 @@
           <w:szCs w:val="22"/>
         </w:rPr>
       </w:pPr>
-      <w:commentRangeStart w:id="3"/>
+      <w:commentRangeStart w:id="2"/>
       <w:r>
         <w:rPr>
           <w:rFonts w:ascii="Garamond" w:hAnsi="Garamond"/>
@@ -913,12 +910,12 @@
         </w:rPr>
         <w:t xml:space="preserve">Figure 6: </w:t>
       </w:r>
-      <w:commentRangeEnd w:id="3"/>
+      <w:commentRangeEnd w:id="2"/>
       <w:r>
         <w:rPr>
           <w:rStyle w:val="CommentReference"/>
         </w:rPr>
-        <w:commentReference w:id="3"/>
+        <w:commentReference w:id="2"/>
       </w:r>
       <w:r>
         <w:rPr>
@@ -1018,23 +1015,7 @@
       </w:r>
     </w:p>
   </w:comment>
-  <w:comment w:id="2" w:author="Daniel Schindler" w:date="2025-07-17T14:10:00Z" w:initials="DS">
-    <w:p>
-      <w:pPr>
-        <w:pStyle w:val="CommentText"/>
-      </w:pPr>
-      <w:r>
-        <w:rPr>
-          <w:rStyle w:val="CommentReference"/>
-        </w:rPr>
-        <w:annotationRef/>
-      </w:r>
-      <w:r>
-        <w:t>Discussion point is that the effectiveness of the front end closure depends both on run timing but also run compression. Eg 2017 was late but extended. 2019 was early but compressed.</w:t>
-      </w:r>
-    </w:p>
-  </w:comment>
-  <w:comment w:id="3" w:author="Cline, Timothy" w:date="2025-10-06T13:52:00Z" w:initials="TC">
+  <w:comment w:id="2" w:author="Cline, Timothy" w:date="2025-10-06T13:52:00Z" w:initials="TC">
     <w:p>
       <w:r>
         <w:rPr>
@@ -1059,7 +1040,6 @@
 <w15:commentsEx xmlns:wpc="http://schemas.microsoft.com/office/word/2010/wordprocessingCanvas" xmlns:cx="http://schemas.microsoft.com/office/drawing/2014/chartex" xmlns:cx1="http://schemas.microsoft.com/office/drawing/2015/9/8/chartex" xmlns:cx2="http://schemas.microsoft.com/office/drawing/2015/10/21/chartex" xmlns:cx3="http://schemas.microsoft.com/office/drawing/2016/5/9/chartex" xmlns:cx4="http://schemas.microsoft.com/office/drawing/2016/5/10/chartex" xmlns:cx5="http://schemas.microsoft.com/office/drawing/2016/5/11/chartex" xmlns:cx6="http://schemas.microsoft.com/office/drawing/2016/5/12/chartex" xmlns:cx7="http://schemas.microsoft.com/office/drawing/2016/5/13/chartex" xmlns:cx8="http://schemas.microsoft.com/office/drawing/2016/5/14/chartex" xmlns:mc="http://schemas.openxmlformats.org/markup-compatibility/2006" xmlns:aink="http://schemas.microsoft.com/office/drawing/2016/ink" xmlns:am3d="http://schemas.microsoft.com/office/drawing/2017/model3d" xmlns:o="urn:schemas-microsoft-com:office:office" xmlns:oel="http://schemas.microsoft.com/office/2019/extlst" xmlns:r="http://schemas.openxmlformats.org/officeDocument/2006/relationships" xmlns:m="http://schemas.openxmlformats.org/officeDocument/2006/math" xmlns:v="urn:schemas-microsoft-com:vml" xmlns:wp14="http://schemas.microsoft.com/office/word/2010/wordprocessingDrawing" xmlns:wp="http://schemas.openxmlformats.org/drawingml/2006/wordprocessingDrawing" xmlns:w10="urn:schemas-microsoft-com:office:word" xmlns:w="http://schemas.openxmlformats.org/wordprocessingml/2006/main" xmlns:w14="http://schemas.microsoft.com/office/word/2010/wordml" xmlns:w15="http://schemas.microsoft.com/office/word/2012/wordml" xmlns:w16cex="http://schemas.microsoft.com/office/word/2018/wordml/cex" xmlns:w16cid="http://schemas.microsoft.com/office/word/2016/wordml/cid" xmlns:w16="http://schemas.microsoft.com/office/word/2018/wordml" xmlns:w16du="http://schemas.microsoft.com/office/word/2023/wordml/word16du" xmlns:w16sdtdh="http://schemas.microsoft.com/office/word/2020/wordml/sdtdatahash" xmlns:w16sdtfl="http://schemas.microsoft.com/office/word/2024/wordml/sdtformatlock" xmlns:w16se="http://schemas.microsoft.com/office/word/2015/wordml/symex" xmlns:wpg="http://schemas.microsoft.com/office/word/2010/wordprocessingGroup" xmlns:wpi="http://schemas.microsoft.com/office/word/2010/wordprocessingInk" xmlns:wne="http://schemas.microsoft.com/office/word/2006/wordml" xmlns:wps="http://schemas.microsoft.com/office/word/2010/wordprocessingShape" mc:Ignorable="w14 w15 w16se w16cid w16 w16cex w16sdtdh w16sdtfl w16du wp14">
   <w15:commentEx w15:paraId="3494BB34" w15:done="0"/>
   <w15:commentEx w15:paraId="72CEFC00" w15:done="0"/>
-  <w15:commentEx w15:paraId="5D59A14B" w15:done="0"/>
   <w15:commentEx w15:paraId="0493D03C" w15:done="0"/>
 </w15:commentsEx>
 </file>
@@ -1068,7 +1048,6 @@
 <w16cex:commentsExtensible xmlns:wpc="http://schemas.microsoft.com/office/word/2010/wordprocessingCanvas" xmlns:cx="http://schemas.microsoft.com/office/drawing/2014/chartex" xmlns:cx1="http://schemas.microsoft.com/office/drawing/2015/9/8/chartex" xmlns:cx2="http://schemas.microsoft.com/office/drawing/2015/10/21/chartex" xmlns:cx3="http://schemas.microsoft.com/office/drawing/2016/5/9/chartex" xmlns:cx4="http://schemas.microsoft.com/office/drawing/2016/5/10/chartex" xmlns:cx5="http://schemas.microsoft.com/office/drawing/2016/5/11/chartex" xmlns:cx6="http://schemas.microsoft.com/office/drawing/2016/5/12/chartex" xmlns:cx7="http://schemas.microsoft.com/office/drawing/2016/5/13/chartex" xmlns:cx8="http://schemas.microsoft.com/office/drawing/2016/5/14/chartex" xmlns:cr="http://schemas.microsoft.com/office/comments/2020/reactions" xmlns:mc="http://schemas.openxmlformats.org/markup-compatibility/2006" xmlns:aink="http://schemas.microsoft.com/office/drawing/2016/ink" xmlns:am3d="http://schemas.microsoft.com/office/drawing/2017/model3d" xmlns:o="urn:schemas-microsoft-com:office:office" xmlns:oel="http://schemas.microsoft.com/office/2019/extlst" xmlns:r="http://schemas.openxmlformats.org/officeDocument/2006/relationships" xmlns:m="http://schemas.openxmlformats.org/officeDocument/2006/math" xmlns:v="urn:schemas-microsoft-com:vml" xmlns:wp14="http://schemas.microsoft.com/office/word/2010/wordprocessingDrawing" xmlns:wp="http://schemas.openxmlformats.org/drawingml/2006/wordprocessingDrawing" xmlns:w10="urn:schemas-microsoft-com:office:word" xmlns:w="http://schemas.openxmlformats.org/wordprocessingml/2006/main" xmlns:w14="http://schemas.microsoft.com/office/word/2010/wordml" xmlns:w15="http://schemas.microsoft.com/office/word/2012/wordml" xmlns:w16cex="http://schemas.microsoft.com/office/word/2018/wordml/cex" xmlns:w16cid="http://schemas.microsoft.com/office/word/2016/wordml/cid" xmlns:w16="http://schemas.microsoft.com/office/word/2018/wordml" xmlns:w16du="http://schemas.microsoft.com/office/word/2023/wordml/word16du" xmlns:w16sdtdh="http://schemas.microsoft.com/office/word/2020/wordml/sdtdatahash" xmlns:w16sdtfl="http://schemas.microsoft.com/office/word/2024/wordml/sdtformatlock" xmlns:w16se="http://schemas.microsoft.com/office/word/2015/wordml/symex" xmlns:wpg="http://schemas.microsoft.com/office/word/2010/wordprocessingGroup" xmlns:wpi="http://schemas.microsoft.com/office/word/2010/wordprocessingInk" xmlns:wne="http://schemas.microsoft.com/office/word/2006/wordml" xmlns:wps="http://schemas.microsoft.com/office/word/2010/wordprocessingShape" mc:Ignorable="w14 w15 w16se w16cid w16 w16cex w16sdtdh w16sdtfl cr w16du wp14">
   <w16cex:commentExtensible w16cex:durableId="6B919312" w16cex:dateUtc="2025-10-06T19:44:00Z"/>
   <w16cex:commentExtensible w16cex:durableId="3915AA6E" w16cex:dateUtc="2025-10-08T16:27:00Z"/>
-  <w16cex:commentExtensible w16cex:durableId="33BDF08E" w16cex:dateUtc="2025-07-17T22:10:00Z"/>
   <w16cex:commentExtensible w16cex:durableId="240A3890" w16cex:dateUtc="2025-10-06T19:52:00Z"/>
 </w16cex:commentsExtensible>
 </file>
@@ -1077,7 +1056,6 @@
 <w16cid:commentsIds xmlns:wpc="http://schemas.microsoft.com/office/word/2010/wordprocessingCanvas" xmlns:cx="http://schemas.microsoft.com/office/drawing/2014/chartex" xmlns:cx1="http://schemas.microsoft.com/office/drawing/2015/9/8/chartex" xmlns:cx2="http://schemas.microsoft.com/office/drawing/2015/10/21/chartex" xmlns:cx3="http://schemas.microsoft.com/office/drawing/2016/5/9/chartex" xmlns:cx4="http://schemas.microsoft.com/office/drawing/2016/5/10/chartex" xmlns:cx5="http://schemas.microsoft.com/office/drawing/2016/5/11/chartex" xmlns:cx6="http://schemas.microsoft.com/office/drawing/2016/5/12/chartex" xmlns:cx7="http://schemas.microsoft.com/office/drawing/2016/5/13/chartex" xmlns:cx8="http://schemas.microsoft.com/office/drawing/2016/5/14/chartex" xmlns:mc="http://schemas.openxmlformats.org/markup-compatibility/2006" xmlns:aink="http://schemas.microsoft.com/office/drawing/2016/ink" xmlns:am3d="http://schemas.microsoft.com/office/drawing/2017/model3d" xmlns:o="urn:schemas-microsoft-com:office:office" xmlns:oel="http://schemas.microsoft.com/office/2019/extlst" xmlns:r="http://schemas.openxmlformats.org/officeDocument/2006/relationships" xmlns:m="http://schemas.openxmlformats.org/officeDocument/2006/math" xmlns:v="urn:schemas-microsoft-com:vml" xmlns:wp14="http://schemas.microsoft.com/office/word/2010/wordprocessingDrawing" xmlns:wp="http://schemas.openxmlformats.org/drawingml/2006/wordprocessingDrawing" xmlns:w10="urn:schemas-microsoft-com:office:word" xmlns:w="http://schemas.openxmlformats.org/wordprocessingml/2006/main" xmlns:w14="http://schemas.microsoft.com/office/word/2010/wordml" xmlns:w15="http://schemas.microsoft.com/office/word/2012/wordml" xmlns:w16cex="http://schemas.microsoft.com/office/word/2018/wordml/cex" xmlns:w16cid="http://schemas.microsoft.com/office/word/2016/wordml/cid" xmlns:w16="http://schemas.microsoft.com/office/word/2018/wordml" xmlns:w16du="http://schemas.microsoft.com/office/word/2023/wordml/word16du" xmlns:w16sdtdh="http://schemas.microsoft.com/office/word/2020/wordml/sdtdatahash" xmlns:w16sdtfl="http://schemas.microsoft.com/office/word/2024/wordml/sdtformatlock" xmlns:w16se="http://schemas.microsoft.com/office/word/2015/wordml/symex" xmlns:wpg="http://schemas.microsoft.com/office/word/2010/wordprocessingGroup" xmlns:wpi="http://schemas.microsoft.com/office/word/2010/wordprocessingInk" xmlns:wne="http://schemas.microsoft.com/office/word/2006/wordml" xmlns:wps="http://schemas.microsoft.com/office/word/2010/wordprocessingShape" mc:Ignorable="w14 w15 w16se w16cid w16 w16cex w16sdtdh w16sdtfl w16du wp14">
   <w16cid:commentId w16cid:paraId="3494BB34" w16cid:durableId="6B919312"/>
   <w16cid:commentId w16cid:paraId="72CEFC00" w16cid:durableId="3915AA6E"/>
-  <w16cid:commentId w16cid:paraId="5D59A14B" w16cid:durableId="33BDF08E"/>
   <w16cid:commentId w16cid:paraId="0493D03C" w16cid:durableId="240A3890"/>
 </w16cid:commentsIds>
 </file>
@@ -1233,9 +1211,6 @@
 <w15:people xmlns:wpc="http://schemas.microsoft.com/office/word/2010/wordprocessingCanvas" xmlns:cx="http://schemas.microsoft.com/office/drawing/2014/chartex" xmlns:cx1="http://schemas.microsoft.com/office/drawing/2015/9/8/chartex" xmlns:cx2="http://schemas.microsoft.com/office/drawing/2015/10/21/chartex" xmlns:cx3="http://schemas.microsoft.com/office/drawing/2016/5/9/chartex" xmlns:cx4="http://schemas.microsoft.com/office/drawing/2016/5/10/chartex" xmlns:cx5="http://schemas.microsoft.com/office/drawing/2016/5/11/chartex" xmlns:cx6="http://schemas.microsoft.com/office/drawing/2016/5/12/chartex" xmlns:cx7="http://schemas.microsoft.com/office/drawing/2016/5/13/chartex" xmlns:cx8="http://schemas.microsoft.com/office/drawing/2016/5/14/chartex" xmlns:mc="http://schemas.openxmlformats.org/markup-compatibility/2006" xmlns:aink="http://schemas.microsoft.com/office/drawing/2016/ink" xmlns:am3d="http://schemas.microsoft.com/office/drawing/2017/model3d" xmlns:o="urn:schemas-microsoft-com:office:office" xmlns:oel="http://schemas.microsoft.com/office/2019/extlst" xmlns:r="http://schemas.openxmlformats.org/officeDocument/2006/relationships" xmlns:m="http://schemas.openxmlformats.org/officeDocument/2006/math" xmlns:v="urn:schemas-microsoft-com:vml" xmlns:wp14="http://schemas.microsoft.com/office/word/2010/wordprocessingDrawing" xmlns:wp="http://schemas.openxmlformats.org/drawingml/2006/wordprocessingDrawing" xmlns:w10="urn:schemas-microsoft-com:office:word" xmlns:w="http://schemas.openxmlformats.org/wordprocessingml/2006/main" xmlns:w14="http://schemas.microsoft.com/office/word/2010/wordml" xmlns:w15="http://schemas.microsoft.com/office/word/2012/wordml" xmlns:w16cex="http://schemas.microsoft.com/office/word/2018/wordml/cex" xmlns:w16cid="http://schemas.microsoft.com/office/word/2016/wordml/cid" xmlns:w16="http://schemas.microsoft.com/office/word/2018/wordml" xmlns:w16du="http://schemas.microsoft.com/office/word/2023/wordml/word16du" xmlns:w16sdtdh="http://schemas.microsoft.com/office/word/2020/wordml/sdtdatahash" xmlns:w16sdtfl="http://schemas.microsoft.com/office/word/2024/wordml/sdtformatlock" xmlns:w16se="http://schemas.microsoft.com/office/word/2015/wordml/symex" xmlns:wpg="http://schemas.microsoft.com/office/word/2010/wordprocessingGroup" xmlns:wpi="http://schemas.microsoft.com/office/word/2010/wordprocessingInk" xmlns:wne="http://schemas.microsoft.com/office/word/2006/wordml" xmlns:wps="http://schemas.microsoft.com/office/word/2010/wordprocessingShape" mc:Ignorable="w14 w15 w16se w16cid w16 w16cex w16sdtdh w16sdtfl w16du wp14">
   <w15:person w15:author="Cline, Timothy">
     <w15:presenceInfo w15:providerId="AD" w15:userId="S::s84g549@msu.montana.edu::b53db266-c02e-4ef3-8acb-16ecbf807cff"/>
-  </w15:person>
-  <w15:person w15:author="Daniel Schindler">
-    <w15:presenceInfo w15:providerId="AD" w15:userId="S::deschind@uw.edu::638f7977-a89c-40df-b85e-dc804ddb30d9"/>
   </w15:person>
 </w15:people>
 </file>

</xml_diff>

<commit_message>
code for a figure of isotope dist by management unit
</commit_message>
<xml_diff>
--- a/Docs/Figures_RunTimingManuscript.docx
+++ b/Docs/Figures_RunTimingManuscript.docx
@@ -9,9 +9,9 @@
           <w:noProof/>
         </w:rPr>
         <w:drawing>
-          <wp:inline distT="0" distB="0" distL="0" distR="0" wp14:anchorId="329926DD" wp14:editId="5697E9D3">
-            <wp:extent cx="6477000" cy="4852035"/>
-            <wp:effectExtent l="0" t="0" r="0" b="0"/>
+          <wp:inline distT="0" distB="0" distL="0" distR="0" wp14:anchorId="329926DD" wp14:editId="0FE9865E">
+            <wp:extent cx="5740804" cy="4300538"/>
+            <wp:effectExtent l="0" t="0" r="0" b="5080"/>
             <wp:docPr id="1577477404" name="Picture 1" descr="A map of a river system&#10;&#10;AI-generated content may be incorrect."/>
             <wp:cNvGraphicFramePr>
               <a:graphicFrameLocks xmlns:a="http://schemas.openxmlformats.org/drawingml/2006/main" noChangeAspect="1"/>
@@ -33,7 +33,7 @@
                   <pic:spPr bwMode="auto">
                     <a:xfrm>
                       <a:off x="0" y="0"/>
-                      <a:ext cx="6487696" cy="4860048"/>
+                      <a:ext cx="5782456" cy="4331740"/>
                     </a:xfrm>
                     <a:prstGeom prst="rect">
                       <a:avLst/>
@@ -156,15 +156,47 @@
           <w:sz w:val="22"/>
           <w:szCs w:val="22"/>
         </w:rPr>
-        <w:t xml:space="preserve">Darker colors indicate lower relative isotope ratios whereas lighter colors indicate more enriched values. Isotope ratios across the basin range from </w:t>
-      </w:r>
-      <w:r>
-        <w:rPr>
-          <w:rFonts w:ascii="Garamond" w:hAnsi="Garamond"/>
-          <w:sz w:val="22"/>
-          <w:szCs w:val="22"/>
-        </w:rPr>
-        <w:t>.7042 to .7107, with a general trend towards more enriched values at the top of the watershed.</w:t>
+        <w:t xml:space="preserve">Darker colors indicate lower relative isotope ratios whereas lighter colors indicate </w:t>
+      </w:r>
+      <w:r>
+        <w:rPr>
+          <w:rFonts w:ascii="Garamond" w:hAnsi="Garamond"/>
+          <w:sz w:val="22"/>
+          <w:szCs w:val="22"/>
+        </w:rPr>
+        <w:t xml:space="preserve">higher </w:t>
+      </w:r>
+      <w:r>
+        <w:rPr>
+          <w:rFonts w:ascii="Garamond" w:hAnsi="Garamond"/>
+          <w:sz w:val="22"/>
+          <w:szCs w:val="22"/>
+        </w:rPr>
+        <w:t xml:space="preserve">values. Isotope ratios across the basin range from </w:t>
+      </w:r>
+      <w:r>
+        <w:rPr>
+          <w:rFonts w:ascii="Garamond" w:hAnsi="Garamond"/>
+          <w:sz w:val="22"/>
+          <w:szCs w:val="22"/>
+        </w:rPr>
+        <w:t xml:space="preserve">.7042 to .7107, with a general trend towards </w:t>
+      </w:r>
+      <w:r>
+        <w:rPr>
+          <w:rFonts w:ascii="Garamond" w:hAnsi="Garamond"/>
+          <w:sz w:val="22"/>
+          <w:szCs w:val="22"/>
+        </w:rPr>
+        <w:t xml:space="preserve">higher </w:t>
+      </w:r>
+      <w:r>
+        <w:rPr>
+          <w:rFonts w:ascii="Garamond" w:hAnsi="Garamond"/>
+          <w:sz w:val="22"/>
+          <w:szCs w:val="22"/>
+        </w:rPr>
+        <w:t>values at the top of the watershed.</w:t>
       </w:r>
       <w:commentRangeEnd w:id="0"/>
       <w:r>
@@ -186,6 +218,7 @@
         <w:rPr>
           <w:noProof/>
         </w:rPr>
+        <w:lastRenderedPageBreak/>
         <w:drawing>
           <wp:inline distT="0" distB="0" distL="0" distR="0" wp14:anchorId="65C76116" wp14:editId="61A09AA5">
             <wp:extent cx="5943600" cy="4592955"/>
@@ -229,7 +262,6 @@
           <w:rFonts w:ascii="Garamond" w:hAnsi="Garamond"/>
         </w:rPr>
       </w:pPr>
-      <w:commentRangeStart w:id="1"/>
       <w:r>
         <w:rPr>
           <w:rFonts w:ascii="Garamond" w:hAnsi="Garamond"/>
@@ -242,23 +274,29 @@
         <w:rPr>
           <w:rFonts w:ascii="Garamond" w:hAnsi="Garamond"/>
         </w:rPr>
-        <w:t xml:space="preserve"> Tributaries included in each management unit, derived by selecting the upstream reaches of several identified rivers of management interest </w:t>
-      </w:r>
-      <w:r>
-        <w:rPr>
-          <w:rFonts w:ascii="Garamond" w:hAnsi="Garamond"/>
-        </w:rPr>
-        <w:t xml:space="preserve">and manually selected units of similar size. </w:t>
-      </w:r>
-      <w:commentRangeEnd w:id="1"/>
-      <w:r>
-        <w:rPr>
-          <w:rStyle w:val="CommentReference"/>
-        </w:rPr>
-        <w:commentReference w:id="1"/>
+        <w:t xml:space="preserve"> </w:t>
+      </w:r>
+      <w:r>
+        <w:rPr>
+          <w:rFonts w:ascii="Garamond" w:hAnsi="Garamond"/>
+        </w:rPr>
+        <w:t>20 Management units, or “stocks” selected by collecting the upstream reaches of notable tributaries in the basin. Regions not included in these tributaries (</w:t>
+      </w:r>
+      <w:proofErr w:type="spellStart"/>
+      <w:r>
+        <w:rPr>
+          <w:rFonts w:ascii="Garamond" w:hAnsi="Garamond"/>
+        </w:rPr>
+        <w:t>e.x</w:t>
+      </w:r>
+      <w:proofErr w:type="spellEnd"/>
+      <w:r>
+        <w:rPr>
+          <w:rFonts w:ascii="Garamond" w:hAnsi="Garamond"/>
+        </w:rPr>
+        <w:t xml:space="preserve">. Lower Kuskokwim) were manually selected to ensure full coverage of the basin. </w:t>
       </w:r>
     </w:p>
-    <w:p/>
     <w:p/>
     <w:p/>
     <w:p/>
@@ -290,6 +328,7 @@
         <w:rPr>
           <w:noProof/>
         </w:rPr>
+        <w:lastRenderedPageBreak/>
         <mc:AlternateContent>
           <mc:Choice Requires="wps">
             <w:drawing>
@@ -477,7 +516,7 @@
           <w:noProof/>
         </w:rPr>
         <w:drawing>
-          <wp:inline distT="0" distB="0" distL="0" distR="0" wp14:anchorId="34888FD1" wp14:editId="641624C1">
+          <wp:inline distT="0" distB="0" distL="0" distR="0" wp14:anchorId="34888FD1" wp14:editId="3F183155">
             <wp:extent cx="6288103" cy="2955139"/>
             <wp:effectExtent l="0" t="0" r="0" b="0"/>
             <wp:docPr id="739570781" name="Picture 2"/>
@@ -901,7 +940,7 @@
           <w:szCs w:val="22"/>
         </w:rPr>
       </w:pPr>
-      <w:commentRangeStart w:id="2"/>
+      <w:commentRangeStart w:id="1"/>
       <w:r>
         <w:rPr>
           <w:rFonts w:ascii="Garamond" w:hAnsi="Garamond"/>
@@ -910,12 +949,12 @@
         </w:rPr>
         <w:t xml:space="preserve">Figure 6: </w:t>
       </w:r>
-      <w:commentRangeEnd w:id="2"/>
+      <w:commentRangeEnd w:id="1"/>
       <w:r>
         <w:rPr>
           <w:rStyle w:val="CommentReference"/>
         </w:rPr>
-        <w:commentReference w:id="2"/>
+        <w:commentReference w:id="1"/>
       </w:r>
       <w:r>
         <w:rPr>
@@ -998,24 +1037,7 @@
       </w:r>
     </w:p>
   </w:comment>
-  <w:comment w:id="1" w:author="Cline, Timothy" w:date="2025-10-08T10:27:00Z" w:initials="TC">
-    <w:p>
-      <w:r>
-        <w:rPr>
-          <w:rStyle w:val="CommentReference"/>
-        </w:rPr>
-        <w:annotationRef/>
-      </w:r>
-      <w:r>
-        <w:rPr>
-          <w:sz w:val="20"/>
-          <w:szCs w:val="20"/>
-        </w:rPr>
-        <w:t xml:space="preserve">A careful reviewer will ask how well you can assign fish to these individual managemnet units given overlap in water chemistry signals. We should probably have some sort of supporting figure showing isotopic distinction between them. </w:t>
-      </w:r>
-    </w:p>
-  </w:comment>
-  <w:comment w:id="2" w:author="Cline, Timothy" w:date="2025-10-06T13:52:00Z" w:initials="TC">
+  <w:comment w:id="1" w:author="Cline, Timothy" w:date="2025-10-06T13:52:00Z" w:initials="TC">
     <w:p>
       <w:r>
         <w:rPr>
@@ -1038,16 +1060,14 @@
 
 <file path=word/commentsExtended.xml><?xml version="1.0" encoding="utf-8"?>
 <w15:commentsEx xmlns:wpc="http://schemas.microsoft.com/office/word/2010/wordprocessingCanvas" xmlns:cx="http://schemas.microsoft.com/office/drawing/2014/chartex" xmlns:cx1="http://schemas.microsoft.com/office/drawing/2015/9/8/chartex" xmlns:cx2="http://schemas.microsoft.com/office/drawing/2015/10/21/chartex" xmlns:cx3="http://schemas.microsoft.com/office/drawing/2016/5/9/chartex" xmlns:cx4="http://schemas.microsoft.com/office/drawing/2016/5/10/chartex" xmlns:cx5="http://schemas.microsoft.com/office/drawing/2016/5/11/chartex" xmlns:cx6="http://schemas.microsoft.com/office/drawing/2016/5/12/chartex" xmlns:cx7="http://schemas.microsoft.com/office/drawing/2016/5/13/chartex" xmlns:cx8="http://schemas.microsoft.com/office/drawing/2016/5/14/chartex" xmlns:mc="http://schemas.openxmlformats.org/markup-compatibility/2006" xmlns:aink="http://schemas.microsoft.com/office/drawing/2016/ink" xmlns:am3d="http://schemas.microsoft.com/office/drawing/2017/model3d" xmlns:o="urn:schemas-microsoft-com:office:office" xmlns:oel="http://schemas.microsoft.com/office/2019/extlst" xmlns:r="http://schemas.openxmlformats.org/officeDocument/2006/relationships" xmlns:m="http://schemas.openxmlformats.org/officeDocument/2006/math" xmlns:v="urn:schemas-microsoft-com:vml" xmlns:wp14="http://schemas.microsoft.com/office/word/2010/wordprocessingDrawing" xmlns:wp="http://schemas.openxmlformats.org/drawingml/2006/wordprocessingDrawing" xmlns:w10="urn:schemas-microsoft-com:office:word" xmlns:w="http://schemas.openxmlformats.org/wordprocessingml/2006/main" xmlns:w14="http://schemas.microsoft.com/office/word/2010/wordml" xmlns:w15="http://schemas.microsoft.com/office/word/2012/wordml" xmlns:w16cex="http://schemas.microsoft.com/office/word/2018/wordml/cex" xmlns:w16cid="http://schemas.microsoft.com/office/word/2016/wordml/cid" xmlns:w16="http://schemas.microsoft.com/office/word/2018/wordml" xmlns:w16du="http://schemas.microsoft.com/office/word/2023/wordml/word16du" xmlns:w16sdtdh="http://schemas.microsoft.com/office/word/2020/wordml/sdtdatahash" xmlns:w16sdtfl="http://schemas.microsoft.com/office/word/2024/wordml/sdtformatlock" xmlns:w16se="http://schemas.microsoft.com/office/word/2015/wordml/symex" xmlns:wpg="http://schemas.microsoft.com/office/word/2010/wordprocessingGroup" xmlns:wpi="http://schemas.microsoft.com/office/word/2010/wordprocessingInk" xmlns:wne="http://schemas.microsoft.com/office/word/2006/wordml" xmlns:wps="http://schemas.microsoft.com/office/word/2010/wordprocessingShape" mc:Ignorable="w14 w15 w16se w16cid w16 w16cex w16sdtdh w16sdtfl w16du wp14">
-  <w15:commentEx w15:paraId="3494BB34" w15:done="0"/>
-  <w15:commentEx w15:paraId="72CEFC00" w15:done="0"/>
-  <w15:commentEx w15:paraId="0493D03C" w15:done="0"/>
+  <w15:commentEx w15:paraId="3494BB34" w15:done="1"/>
+  <w15:commentEx w15:paraId="0493D03C" w15:done="1"/>
 </w15:commentsEx>
 </file>
 
 <file path=word/commentsExtensible.xml><?xml version="1.0" encoding="utf-8"?>
 <w16cex:commentsExtensible xmlns:wpc="http://schemas.microsoft.com/office/word/2010/wordprocessingCanvas" xmlns:cx="http://schemas.microsoft.com/office/drawing/2014/chartex" xmlns:cx1="http://schemas.microsoft.com/office/drawing/2015/9/8/chartex" xmlns:cx2="http://schemas.microsoft.com/office/drawing/2015/10/21/chartex" xmlns:cx3="http://schemas.microsoft.com/office/drawing/2016/5/9/chartex" xmlns:cx4="http://schemas.microsoft.com/office/drawing/2016/5/10/chartex" xmlns:cx5="http://schemas.microsoft.com/office/drawing/2016/5/11/chartex" xmlns:cx6="http://schemas.microsoft.com/office/drawing/2016/5/12/chartex" xmlns:cx7="http://schemas.microsoft.com/office/drawing/2016/5/13/chartex" xmlns:cx8="http://schemas.microsoft.com/office/drawing/2016/5/14/chartex" xmlns:cr="http://schemas.microsoft.com/office/comments/2020/reactions" xmlns:mc="http://schemas.openxmlformats.org/markup-compatibility/2006" xmlns:aink="http://schemas.microsoft.com/office/drawing/2016/ink" xmlns:am3d="http://schemas.microsoft.com/office/drawing/2017/model3d" xmlns:o="urn:schemas-microsoft-com:office:office" xmlns:oel="http://schemas.microsoft.com/office/2019/extlst" xmlns:r="http://schemas.openxmlformats.org/officeDocument/2006/relationships" xmlns:m="http://schemas.openxmlformats.org/officeDocument/2006/math" xmlns:v="urn:schemas-microsoft-com:vml" xmlns:wp14="http://schemas.microsoft.com/office/word/2010/wordprocessingDrawing" xmlns:wp="http://schemas.openxmlformats.org/drawingml/2006/wordprocessingDrawing" xmlns:w10="urn:schemas-microsoft-com:office:word" xmlns:w="http://schemas.openxmlformats.org/wordprocessingml/2006/main" xmlns:w14="http://schemas.microsoft.com/office/word/2010/wordml" xmlns:w15="http://schemas.microsoft.com/office/word/2012/wordml" xmlns:w16cex="http://schemas.microsoft.com/office/word/2018/wordml/cex" xmlns:w16cid="http://schemas.microsoft.com/office/word/2016/wordml/cid" xmlns:w16="http://schemas.microsoft.com/office/word/2018/wordml" xmlns:w16du="http://schemas.microsoft.com/office/word/2023/wordml/word16du" xmlns:w16sdtdh="http://schemas.microsoft.com/office/word/2020/wordml/sdtdatahash" xmlns:w16sdtfl="http://schemas.microsoft.com/office/word/2024/wordml/sdtformatlock" xmlns:w16se="http://schemas.microsoft.com/office/word/2015/wordml/symex" xmlns:wpg="http://schemas.microsoft.com/office/word/2010/wordprocessingGroup" xmlns:wpi="http://schemas.microsoft.com/office/word/2010/wordprocessingInk" xmlns:wne="http://schemas.microsoft.com/office/word/2006/wordml" xmlns:wps="http://schemas.microsoft.com/office/word/2010/wordprocessingShape" mc:Ignorable="w14 w15 w16se w16cid w16 w16cex w16sdtdh w16sdtfl cr w16du wp14">
   <w16cex:commentExtensible w16cex:durableId="6B919312" w16cex:dateUtc="2025-10-06T19:44:00Z"/>
-  <w16cex:commentExtensible w16cex:durableId="3915AA6E" w16cex:dateUtc="2025-10-08T16:27:00Z"/>
   <w16cex:commentExtensible w16cex:durableId="240A3890" w16cex:dateUtc="2025-10-06T19:52:00Z"/>
 </w16cex:commentsExtensible>
 </file>
@@ -1055,7 +1075,6 @@
 <file path=word/commentsIds.xml><?xml version="1.0" encoding="utf-8"?>
 <w16cid:commentsIds xmlns:wpc="http://schemas.microsoft.com/office/word/2010/wordprocessingCanvas" xmlns:cx="http://schemas.microsoft.com/office/drawing/2014/chartex" xmlns:cx1="http://schemas.microsoft.com/office/drawing/2015/9/8/chartex" xmlns:cx2="http://schemas.microsoft.com/office/drawing/2015/10/21/chartex" xmlns:cx3="http://schemas.microsoft.com/office/drawing/2016/5/9/chartex" xmlns:cx4="http://schemas.microsoft.com/office/drawing/2016/5/10/chartex" xmlns:cx5="http://schemas.microsoft.com/office/drawing/2016/5/11/chartex" xmlns:cx6="http://schemas.microsoft.com/office/drawing/2016/5/12/chartex" xmlns:cx7="http://schemas.microsoft.com/office/drawing/2016/5/13/chartex" xmlns:cx8="http://schemas.microsoft.com/office/drawing/2016/5/14/chartex" xmlns:mc="http://schemas.openxmlformats.org/markup-compatibility/2006" xmlns:aink="http://schemas.microsoft.com/office/drawing/2016/ink" xmlns:am3d="http://schemas.microsoft.com/office/drawing/2017/model3d" xmlns:o="urn:schemas-microsoft-com:office:office" xmlns:oel="http://schemas.microsoft.com/office/2019/extlst" xmlns:r="http://schemas.openxmlformats.org/officeDocument/2006/relationships" xmlns:m="http://schemas.openxmlformats.org/officeDocument/2006/math" xmlns:v="urn:schemas-microsoft-com:vml" xmlns:wp14="http://schemas.microsoft.com/office/word/2010/wordprocessingDrawing" xmlns:wp="http://schemas.openxmlformats.org/drawingml/2006/wordprocessingDrawing" xmlns:w10="urn:schemas-microsoft-com:office:word" xmlns:w="http://schemas.openxmlformats.org/wordprocessingml/2006/main" xmlns:w14="http://schemas.microsoft.com/office/word/2010/wordml" xmlns:w15="http://schemas.microsoft.com/office/word/2012/wordml" xmlns:w16cex="http://schemas.microsoft.com/office/word/2018/wordml/cex" xmlns:w16cid="http://schemas.microsoft.com/office/word/2016/wordml/cid" xmlns:w16="http://schemas.microsoft.com/office/word/2018/wordml" xmlns:w16du="http://schemas.microsoft.com/office/word/2023/wordml/word16du" xmlns:w16sdtdh="http://schemas.microsoft.com/office/word/2020/wordml/sdtdatahash" xmlns:w16sdtfl="http://schemas.microsoft.com/office/word/2024/wordml/sdtformatlock" xmlns:w16se="http://schemas.microsoft.com/office/word/2015/wordml/symex" xmlns:wpg="http://schemas.microsoft.com/office/word/2010/wordprocessingGroup" xmlns:wpi="http://schemas.microsoft.com/office/word/2010/wordprocessingInk" xmlns:wne="http://schemas.microsoft.com/office/word/2006/wordml" xmlns:wps="http://schemas.microsoft.com/office/word/2010/wordprocessingShape" mc:Ignorable="w14 w15 w16se w16cid w16 w16cex w16sdtdh w16sdtfl w16du wp14">
   <w16cid:commentId w16cid:paraId="3494BB34" w16cid:durableId="6B919312"/>
-  <w16cid:commentId w16cid:paraId="72CEFC00" w16cid:durableId="3915AA6E"/>
   <w16cid:commentId w16cid:paraId="0493D03C" w16cid:durableId="240A3890"/>
 </w16cid:commentsIds>
 </file>

</xml_diff>